<commit_message>
iki-roman: Gegenprüfung der Straffung eingearbeitet (5 Nahtkorrekturen), Zusammenführung reproduzierbar; YOLCU v5 40.621 Wörter, ŞAHİT v6 36.400 Wörter
Co-Authored-By: Claude Opus 5.5 <noreply@anthropic.com>
Claude-Session: https://claude.ai/code/session_01VkFweucEM9zfUt3hW6rSer
</commit_message>
<xml_diff>
--- a/iki-roman/interior/src/SAHIT_TR_v6.docx
+++ b/iki-roman/interior/src/SAHIT_TR_v6.docx
@@ -2436,7 +2436,7 @@
     </w:p>
     <w:p>
       <w:r>
-        <w:t xml:space="preserve">Müsaade isteyip odadan çıktım. İlk okuduğum ceylan hikâyesini orada bıraktım; tek bir sayfayı bile dışarı çıkaramazdım. Ne garip hayatlar vardı. Kalan ömrümde daha nelere tanık olacak, kaç romanı bu ömre sığdıracaktım? Yazdıklarım kime fayda, kime zarar verebilirdi? Hatta bu işi kabul etmiş miydim? Ettiysem neden? Belki de bunu vatanıma borç sayıyordum; herkes kendi yeteneği doğrultusunda borcunu öderdi. Her zaman dediğim gibi, kılıç bileği taşında bilenir; kalem de kâğıda yazdıkça keskinleşirdi. Bu riski almaya değerdi. Ama psikolojimde bir şeyler ters gidiyordu; beynim okumayı, düşünmeyi, konuşmayı reddediyordu. Hakan Hoca'yla bu kadar konuşmuş olmak bile benim için neredeyse mucizeydi. Eve vardığımda kafamın içinde </w:t>
+        <w:t xml:space="preserve">Müsaade isteyip odadan çıktım. İlk okuduğum ceylan hikâyesini orada bıraktım; tek bir sayfayı bile dışarı çıkaramazdım. Ne garip hayatlar vardı. Kalan ömrümde daha nelere tanık olacak, kaç romanı bu ömre sığdıracaktım? Yazdıklarım kime fayda, kime zarar verebilirdi? Hatta bu işi kabul etmiş miydim? Ettiysem neden? Belki de bunu vatanıma borç sayıyordum; herkes kendi yeteneği doğrultusunda borcunu öderdi. Her zaman dediğim gibi, kılıç bileği taşında bilenir; kalem de kâğıda yazdıkça keskinleşirdi. Bu işin riskini almaya değerdi. Ama psikolojimde bir şeyler ters gidiyordu; beynim okumayı, düşünmeyi, konuşmayı reddediyordu. Hakan Hoca'yla bu kadar konuşmuş olmak bile benim için neredeyse mucizeydi. Eve vardığımda kafamın içinde </w:t>
       </w:r>
       <w:r>
         <w:t>birbirine küsmüş, birbiriyle kavga eden kırk tilkinin farklı fikirleri vardı. Gün ola harman ola deyip kendimi olayların akışına bıraktım. Sebep psikolojikse, nasılsa ortaya çıkardı; ben de bedava bir psikiyatristin tedavisinden geçerdim. Artık susmaktan, konuşamamaktan, hatta sürekli “Bana ne oldu?” diye sormaktan bile yorulmuştum. O aktif, girdiği ortamlarda insanları gevezeliğiyle boğan Mustafa Sefa'yı özlemiştim. Ama özlemek, ona geri dönmemi sağlamıyordu; sanki sesim yerindeydi de ona giden yol kapanmıştı.</w:t>
@@ -9380,7 +9380,7 @@
         <w:rPr>
           <w:rFonts w:ascii="Courier New" w:hAnsi="Courier New" w:cs="Courier New"/>
         </w:rPr>
-        <w:t>“Belam Bin Baura’yı hepiniz bilirsiniz, hatta ‘İsm-i Âzam’ denilen dua ile yaşadığı beldede ihya etmediği pek az insan vardır. Onunla aynı inançta olmayanlar dahi ona ve eşine büyük hürmet gösterirler.”</w:t>
+        <w:t>“Belam Bin Baura’yı hepiniz bilirsiniz, hatta ‘İsm-i Âzam’ denilen dua ile yaşadığı beldede ihya etmediği pek az insan vardır. Onunla aynı inançta olmayanlar dahi ona ve eşine büyük hürmet gösterirler. Ne yaptın da onu yolundan saptırdın anlat evladım.”</w:t>
       </w:r>
     </w:p>
     <w:p>
@@ -10724,7 +10724,7 @@
         <w:rPr>
           <w:rFonts w:ascii="Courier New" w:hAnsi="Courier New" w:cs="Courier New"/>
         </w:rPr>
-        <w:t>Mabeh, tepesinde durduğu ağaçtan o kadar hızlı inmişti ki neredeyse düşecekti.</w:t>
+        <w:t>Mabeh, tepesinde durduğu ağaçtan o kadar hızlı inmişti ki neredeyse düşecekti. Sahibi olan adam bu durumdan rahatsız olmuştu.</w:t>
       </w:r>
     </w:p>
     <w:p>

</xml_diff>

<commit_message>
iki-roman: Korrektorat beider Bücher (ŞAHİT 208, YOLCU 24 Korrekturen: Rechtschreibung nach TDK, Endungen, sinnverkehrte Sätze, fehlende Wörter) + Herausgeber-Runde 2; Schutzprüfung OK
Co-Authored-By: Claude Opus 5.5 <noreply@anthropic.com>
Claude-Session: https://claude.ai/code/session_01VkFweucEM9zfUt3hW6rSer
</commit_message>
<xml_diff>
--- a/iki-roman/interior/src/SAHIT_TR_v6.docx
+++ b/iki-roman/interior/src/SAHIT_TR_v6.docx
@@ -540,7 +540,7 @@
         <w:rPr>
           <w:rFonts w:ascii="Courier New" w:hAnsi="Courier New" w:cs="Courier New"/>
         </w:rPr>
-        <w:t>“Sana bir soru sordum ceylan, yola revan olmaya ve Şahitle tanışmaya hazır mısın?”</w:t>
+        <w:t>“Sana bir soru sordum ceylan, yola revan olmaya ve şahitle tanışmaya hazır mısın?”</w:t>
       </w:r>
     </w:p>
     <w:p>
@@ -929,7 +929,7 @@
         <w:rPr>
           <w:rFonts w:ascii="Courier New" w:hAnsi="Courier New" w:cs="Courier New"/>
         </w:rPr>
-        <w:t>“Ey! Ceylan, ismi cennet kapısında yazılı Ahmed’e olan aşkımızı söyle, bülbüller bize, biz ona aşığız, ne mutlu sana ki cennetten sonra, ismi ilk defa senin derine yazılacak o rahmet peygamberine bizim muhabbetlerimizi söyle. Ona de ki; Ahmed gül kokmaz, güller Ahmed kokar, ne mutlu sana ki bir de şahitle tanışacaksın, ona da bizden selam söyle, çünkü Es Selam olan Allah CC cenneti de cehennemi de alemleri de kusursuz yaratmıştır. Kusurlarından dönenler cennete, kusurundan dönmeyenler cehenneme ve alemleri de fanilerin kendi nefislerine şahitlik için Halk etmiştir. Ömür zamandır, ömür sermayedir ve her nefis zamanı dolunca ölümü tadacaktır.”</w:t>
+        <w:t>“Ey! Ceylan, ismi cennet kapısında yazılı Ahmed’e olan aşkımızı söyle, bülbüller bize, biz ona âşığız, ne mutlu sana ki cennetten sonra, ismi ilk defa senin derine yazılacak o rahmet peygamberine bizim muhabbetlerimizi söyle. Ona de ki; Ahmed gül kokmaz, güller Ahmed kokar, ne mutlu sana ki bir de şahitle tanışacaksın, ona da bizden selam söyle, çünkü Es Selam olan Allah CC cenneti de cehennemi de alemleri de kusursuz yaratmıştır. Kusurlarından dönenler cennete, kusurundan dönmeyenler cehenneme ve alemleri de fanilerin kendi nefislerine şahitlik için halk etmiştir. Ömür zamandır, ömür sermayedir ve her nefis zamanı dolunca ölümü tadacaktır.”</w:t>
       </w:r>
     </w:p>
     <w:p>
@@ -955,7 +955,7 @@
         <w:rPr>
           <w:rFonts w:ascii="Courier New" w:hAnsi="Courier New" w:cs="Courier New"/>
         </w:rPr>
-        <w:t>“Hey! Barnabas tam kalbinden vurmuşsun, bu gece on kardeşimiz ve Nâsıra’lı İsa’ya yetecek miktarda rızkımız, rızkımızı verene şükürler olsun ki senin okunun ucundan geldi.”</w:t>
+        <w:t>“Hey! Barnabas tam kalbinden vurmuşsun, bu gece on kardeşimiz ve Nâsıralı İsa’ya yetecek miktarda rızkımız, rızkımızı verene şükürler olsun ki senin okunun ucundan geldi.”</w:t>
       </w:r>
     </w:p>
     <w:p>
@@ -981,20 +981,20 @@
         <w:rPr>
           <w:rFonts w:ascii="Courier New" w:hAnsi="Courier New" w:cs="Courier New"/>
         </w:rPr>
-        <w:t>“Dikkatli kes derisini kardeşim, onun derisine, kardeşimiz Meryem oğlu İsa’nın ağzından çıkan vahiyleri anında, değişmeden yazacağım ve inşallah bizden sonra gelecek nesillere aktaracağım, o bize kendinden sonra gelip, dini tamamlayacak kardeşi Ahmed’ten sözler söyler bilirsin.”</w:t>
-      </w:r>
-    </w:p>
-    <w:p>
-      <w:pPr>
-        <w:rPr>
-          <w:rFonts w:ascii="Courier New" w:hAnsi="Courier New" w:cs="Courier New"/>
-        </w:rPr>
-      </w:pPr>
-      <w:r>
-        <w:rPr>
-          <w:rFonts w:ascii="Courier New" w:hAnsi="Courier New" w:cs="Courier New"/>
-        </w:rPr>
-        <w:t>Ceylanın gözlerinden iki damla yaş düşerken sürme çekerek pınarlarından dolup taştı, ölmüştü zahirde dünyaya son bakışı ile ve uyanacaktı Hakk’a sürme çekilen gözlerle. İşte nice edebiyatçıya ilham olan ceylan gözlerinin sırrı o gün mühürlendi, tüm aşıklar maşuklarının bakışlarını ceylanların sürmeli gözlerine benzettiler, ancak ceylanın gözünün şeklinden değil, sırrın bakıştan gelen sürmenin nakışlandığını hiç bilemediler.</w:t>
+        <w:t>“Dikkatli kes derisini kardeşim, onun derisine, kardeşimiz Meryem oğlu İsa’nın ağzından çıkan vahiyleri anında, değişmeden yazacağım ve inşallah bizden sonra gelecek nesillere aktaracağım, o bize kendinden sonra gelip, dini tamamlayacak kardeşi Ahmed’den sözler söyler bilirsin.”</w:t>
+      </w:r>
+    </w:p>
+    <w:p>
+      <w:pPr>
+        <w:rPr>
+          <w:rFonts w:ascii="Courier New" w:hAnsi="Courier New" w:cs="Courier New"/>
+        </w:rPr>
+      </w:pPr>
+      <w:r>
+        <w:rPr>
+          <w:rFonts w:ascii="Courier New" w:hAnsi="Courier New" w:cs="Courier New"/>
+        </w:rPr>
+        <w:t>Ceylanın gözlerinden iki damla yaş düşerken sürme çekerek pınarlarından dolup taştı, ölmüştü zahirde dünyaya son bakışı ile ve uyanacaktı Hakk’a sürme çekilen gözlerle. İşte nice edebiyatçıya ilham olan ceylan gözlerinin sırrı o gün mühürlendi, tüm âşıklar maşuklarının bakışlarını ceylanların sürmeli gözlerine benzettiler, ancak ceylanın gözünün şeklinden değil, sırrın bakıştan gelen sürmenin nakışlandığını hiç bilemediler.</w:t>
       </w:r>
     </w:p>
     <w:p>
@@ -1178,7 +1178,7 @@
     </w:p>
     <w:p>
       <w:r>
-        <w:t>Bana tarif edilen bina, amfinin bulunduğu aynı bina, sekretaryanın bulunduğu ofise girdim. Zehra Hanım, sağ olsun yardımcı oldu ama belli ki acelesi vardı.</w:t>
+        <w:t>Bana tarif edilen binada, amfinin bulunduğu aynı binada, sekretaryanın bulunduğu ofise girdim. Zehra Hanım, sağ olsun yardımcı oldu ama belli ki acelesi vardı.</w:t>
       </w:r>
     </w:p>
     <w:p>
@@ -1198,7 +1198,7 @@
     </w:p>
     <w:p>
       <w:r>
-        <w:t>“Hocam, nasıl yani kendini polis zanneden bir karakter, doktor zanneden kişiliğine müdahale mi eder” dedi karanlığın içindeki kafalardan biri, yani öğrencilerden.</w:t>
+        <w:t>“Hocam, nasıl yani kendini polis zanneden bir karakter, doktor zanneden kişiliğine müdahale mi eder?” dedi karanlığın içindeki kafalardan biri, yani öğrencilerden.</w:t>
       </w:r>
     </w:p>
     <w:p>
@@ -1214,7 +1214,7 @@
     </w:p>
     <w:p>
       <w:r>
-        <w:t>Acaba çaktırmadan kapıyı açıp, sessizce en arkada bir koltuğu el yordamı ile bulup yerleşip otursa mıydım. Hemen kapının aralığını geçebileceğim miktarda arttırdım. Yukarıdan aşağıya inen basamaklar bir sinema salonu gibiydi ve karanlıktı. Amfi ne kadar kalabalıktı bilmiyorum, çünkü sahneye yakın yerlere oturanların kımıldanan kafalarını seçebiliyordum. Sessizce açılmasını umduğum kapı, ispiyoncu bir öğrenci gibi çığlık atarak gıcırdadı, profesörün kafası dahil, sahnenin ön kısmında aydınlıkta oturan tüm kafalar bana döndü. İşte o an anladım ki oldukça kalabalıktı amfi.</w:t>
+        <w:t>Acaba çaktırmadan kapıyı açıp, sessizce en arkada bir koltuğu el yordamı ile bulup yerleşip otursa mıydım? Hemen kapının aralığını geçebileceğim miktarda artırdım. Yukarıdan aşağıya inen basamaklar bir sinema salonu gibiydi ve karanlıktı. Amfi ne kadar kalabalıktı bilmiyorum, çünkü sahneye yakın yerlere oturanların kımıldanan kafalarını seçebiliyordum. Sessizce açılmasını umduğum kapı, ispiyoncu bir öğrenci gibi çığlık atarak gıcırdadı, profesörün kafası dahil, sahnenin ön kısmında aydınlıkta oturan tüm kafalar bana döndü. İşte o an anladım ki oldukça kalabalıktı amfi.</w:t>
       </w:r>
     </w:p>
     <w:p>
@@ -1280,7 +1280,7 @@
     </w:p>
     <w:p>
       <w:r>
-        <w:t xml:space="preserve">Sadece ineceğim merdivenlere odaklanmıştım, karanlıktı ve iyi ki karanlıktı, yoksa yüzümün ateş basan halinden anlıyordum ki </w:t>
+        <w:t xml:space="preserve">Sadece ineceğim merdivenlere odaklanmıştım, karanlıktı ve iyi ki karanlıktı, yoksa yüzümün ateş basan hâlinden anlıyordum ki </w:t>
       </w:r>
       <w:r>
         <w:t>kıpkırmızıydım. İyi ki tıraş olmuştum, iyi ki dişlerimi fırçalamıştım, iyi ki duş almıştım ve iyi ki keten pantolonum üzerine spor da olsa ceket giyinmiştim.</w:t>
@@ -1308,10 +1308,10 @@
     </w:p>
     <w:p>
       <w:r>
-        <w:t>Sonra öğrenciler ders bitip, amfiyi terk ederlerken ne kadar sarsıcı dakikalar yaşadığımı anlamıştım. Benim gibi iki kelimeyi bir araya getirmeyi çok iyi beceren bir adam için son üç aydır konuşmak adeta zulüm gibi geliyordu. Geveze Mustafa Sefa’ya alışmış tüm dost, arkadaş, aile evradımdan kim varsa, son üç aydır suskunluğumu sorgulamışlardı. Ne oldu bilmiyorum aynı anda hepsi bu sorgulamayı kesti, bunu ben bile kendime yaptım onlara bu çok görmediğim şeyi; artık bu kadar konuşken bir adamken neden suskunlaştığımı.</w:t>
-      </w:r>
-      <w:r>
-        <w:t xml:space="preserve"> Bir dostum bana tükenmişlik sendromu demişti ve bu bana çok mantıklı gelmişti. Bunca koşturma, türlü iş, memleket meseleleri derken bir anda fişimi kendi ellerimle çekmiş ve kabuğuma çekilmiştim kabullenerek. Hasılı sahneye çıktığım o gün neler konuştuğum hakkında en küçük bir fikrim yok, konuşmak için mecalim, isteğim de yok. Muhtemelen bu profesör için bir hayal kırıklığı olmuştu, bunca şeyleri yazabilen, kariyerinde sahne insanı olmuş bir ademin berbat sahne performansı onu da hayrete düşürmüştü.</w:t>
+        <w:t>Sonra öğrenciler ders bitip, amfiyi terk ederlerken ne kadar sarsıcı dakikalar yaşadığımı anlamıştım. Benim gibi iki kelimeyi bir araya getirmeyi çok iyi beceren bir adam için son üç aydır konuşmak adeta zulüm gibi geliyordu. Geveze Mustafa Sefa’ya alışmış tüm dost, arkadaş, aile efradımdan kim varsa, son üç aydır suskunluğumu sorgulamışlardı. Ne oldu bilmiyorum aynı anda hepsi bu sorgulamayı kesti, bunu ben bile kendime yaptım onlara bu çok görmediğim şeyi; artık bu kadar konuşken bir adamken neden suskunlaştığımı.</w:t>
+      </w:r>
+      <w:r>
+        <w:t xml:space="preserve"> Bir dostum bana tükenmişlik sendromu demişti ve bu bana çok mantıklı gelmişti. Bunca koşturma, türlü iş, memleket meseleleri derken bir anda fişimi kendi ellerimle çekmiş ve kabuğuma çekilmiştim kabullenerek. Hasılı sahneye çıktığım o gün neler konuştuğum hakkında en küçük bir fikrim yok, konuşmak için mecalim, isteğim de yok. Muhtemelen bu profesör için bir hayal kırıklığı olmuştu, bunca şeyleri yazabilen, kariyerinde sahne insanı olmuş bir âdemin berbat sahne performansı onu da hayrete düşürmüştü.</w:t>
       </w:r>
     </w:p>
     <w:p>
@@ -1341,7 +1341,7 @@
     </w:p>
     <w:p>
       <w:r>
-        <w:t>“Hocam sadece Sefa, tabi siz de uygun görürseniz.”</w:t>
+        <w:t>“Hocam sadece Sefa, tabii siz de uygun görürseniz.”</w:t>
       </w:r>
     </w:p>
     <w:p>
@@ -1351,12 +1351,12 @@
     </w:p>
     <w:p>
       <w:r>
-        <w:t>“Memnun oldum Hocam.”</w:t>
-      </w:r>
-    </w:p>
-    <w:p>
-      <w:r>
-        <w:t>“Size bir teklifim var Sefa Hoc… Ya ağız alışkanlığı işte, pardon Sefa! Buradan Erenköy Ruh ve Sinir Hastalıkları Hastanesine kadar yürüyelim, toplam 45 dakika sürecek, görüşmemizi daha doğrusu teklifimizi değerlendirme fırsatını elde etmiş olursunuz bu şekilde. Yok eğer beğenmezseniz, Kaptan Arif sokağa kadar bana yolda yarenlik etmiş olursunuz, oradan da vedalaşır, helalleşiriz, siz yolunuza ben yoluma.”</w:t>
+        <w:t>“Memnun oldum hocam.”</w:t>
+      </w:r>
+    </w:p>
+    <w:p>
+      <w:r>
+        <w:t>“Size bir teklifim var Sefa Hoc… Ya ağız alışkanlığı işte, pardon Sefa! Buradan Erenköy Ruh ve Sinir Hastalıkları Hastanesine kadar yürüyelim, toplam 45 dakika sürecek, görüşmemizi daha doğrusu teklifimizi değerlendirme fırsatını elde etmiş olursunuz bu şekilde. Yok eğer beğenmezseniz, Kaptan Arif Sokağı’na kadar bana yolda yarenlik etmiş olursunuz, oradan da vedalaşır, helalleşiriz, siz yolunuza ben yoluma.”</w:t>
       </w:r>
     </w:p>
     <w:p>
@@ -1371,7 +1371,7 @@
     </w:p>
     <w:p>
       <w:r>
-        <w:t>“Hocam, bu aralar neden bilmiyorum üstümde belli belirsiz bir tükenmişlik var, kendimi iyi hissetmiyorum, normalde aktifimdir, her telefona hatta her sosyal medya yorumlarına cevap veririm ama sebebini bilmediğim bir şekilde sustum, sizin gibi uzmanlığı insan psikolojisi olan bir psikiyatri profesörüne bu söyleyeceğim söylenmez ama galiba bende tükenmişlik sendromu var.”</w:t>
+        <w:t>“Hocam, bu aralar neden bilmiyorum üstümde belli belirsiz bir tükenmişlik var, kendimi iyi hissetmiyorum, normalde aktifimdir, her telefona hatta her sosyal medya yorumuna cevap veririm ama sebebini bilmediğim bir şekilde sustum, sizin gibi uzmanlığı insan psikolojisi olan bir psikiyatri profesörüne bu söyleyeceğim söylenmez ama galiba bende tükenmişlik sendromu var.”</w:t>
       </w:r>
     </w:p>
     <w:p>
@@ -1396,7 +1396,7 @@
     </w:p>
     <w:p>
       <w:r>
-        <w:t>“Bu vakanın kişilik hakları açısından da önem arz ediyor elbette ancak daha da önemlisi bu devletimizin bekası açısından bir sır olarak kalmak zorunda.”</w:t>
+        <w:t>“Bu vaka kişilik hakları açısından da önem arz ediyor elbette ancak daha da önemlisi bu devletimizin bekası açısından bir sır olarak kalmak zorunda.”</w:t>
       </w:r>
     </w:p>
     <w:p>
@@ -1416,7 +1416,7 @@
     </w:p>
     <w:p>
       <w:r>
-        <w:t>“Hocam, anlatın, anlamaya çalışayım, kafam o kadar karışmış durumdaki şu anda, anlatamam.”</w:t>
+        <w:t>“Hocam, anlatın, anlamaya çalışayım, kafam o kadar karışmış durumda ki şu anda, anlatamam.”</w:t>
       </w:r>
     </w:p>
     <w:p>
@@ -1520,7 +1520,7 @@
     </w:p>
     <w:p>
       <w:r>
-        <w:t>“Ne yalan söyleyeyim, son zamanlardaki o münzevi, içe kapanık hâlimi unuttum bile hocam. Sizi pür dikkat dinliyorum.”</w:t>
+        <w:t>“Ne yalan söyleyeyim, son zamanlardaki o münzevi, içe kapanık hâlimi unuttum bile hocam. Sizi pürdikkat dinliyorum.”</w:t>
       </w:r>
     </w:p>
     <w:p>
@@ -1595,7 +1595,7 @@
     </w:p>
     <w:p>
       <w:r>
-        <w:t xml:space="preserve">“Neyse, İl Sağlık Müdürlüğü'ne binbir dil döktüm. Sonunda Sağlık Bakanlığı'ndan izin alıp sessiz bir daktilo getirdiler. Daktiloyu </w:t>
+        <w:t xml:space="preserve">“Neyse, İl Sağlık Müdürlüğü'ne bin bir dil döktüm. Sonunda Sağlık Bakanlığı'ndan izin alıp sessiz bir daktilo getirdiler. Daktiloyu </w:t>
       </w:r>
       <w:r>
         <w:t>vakamıza verdim ama masaya sabitledim, masayı da yere… Bir hafta boyunca yataktan kalkmadı; yalnızca sağ avucunun üzerine başını koyup daktiloyu izledi. Bir akşam mesaim bitmişti. Geçerken odasına bakayım dedim. Bir de ne göreyim: Adam, ona bıraktığım üç kâğıttan birini almış, harıl harıl yazıyordu. Büyük bir telaşla odasının kilidini açıp, tabiri caizse tepesine dikildim. İçeri girdiğimi fark edince daktilonun üzerine kapandı ve iki kelime daha söyledi:</w:t>
@@ -1608,7 +1608,7 @@
     </w:p>
     <w:p>
       <w:r>
-        <w:t>Ben odadan çıkıp kapıyı kilitleyene kadar daktilonun üzerine kapanmış halde kaldı. Kapıyı kapatınca yeniden yazmaya başladı. Yine de pek umudum yoktu; tuşlara rastgele basıp anlamsız kelimeleri art arda sıraladığını düşünmüştüm. Ertesi gün, konuk hoca olarak katıldığım İstanbul Üniversitesi’ndeki programım biter bitmez, şimdi gideceğimiz hastaneye adeta koşarak geldim.”</w:t>
+        <w:t>Ben odadan çıkıp kapıyı kilitleyene kadar daktilonun üzerine kapanmış hâlde kaldı. Kapıyı kapatınca yeniden yazmaya başladı. Yine de pek umudum yoktu; tuşlara rastgele basıp anlamsız kelimeleri art arda sıraladığını düşünmüştüm. Ertesi gün, konuk hoca olarak katıldığım İstanbul Üniversitesi’ndeki programım biter bitmez, şimdi gideceğimiz hastaneye adeta koşarak geldim.”</w:t>
       </w:r>
     </w:p>
     <w:p>
@@ -1735,7 +1735,7 @@
     </w:p>
     <w:p>
       <w:r>
-        <w:t>“Konuşma yetisi olmayan ama yazma konusunda çok yetenekli vakanızla ilgili bana ne söyleyeceğinize gelmiştik sanırım, hocam.”</w:t>
+        <w:t>“Konuşma yetisi olmayan ama yazma konusunda çok yetenekli hastanızla ilgili bana ne söyleyeceğinize gelmiştik sanırım, hocam.”</w:t>
       </w:r>
     </w:p>
     <w:p>
@@ -1806,7 +1806,7 @@
     </w:p>
     <w:p>
       <w:r>
-        <w:t>“Haklısınız, doğru söylüyorsunuz. Şöyle yapalım: İlk hikâyeyi sizinle paylaşayım. Yolcu ve Şahidin hikâyesinin ilk sayfasını okuyun; kabul ederseniz kalanını da veririm.”</w:t>
+        <w:t>“Haklısınız, doğru söylüyorsunuz. Şöyle yapalım: İlk hikâyeyi sizinle paylaşayım. Yolcu ve Şahit'in hikâyesinin ilk sayfasını okuyun; kabul ederseniz kalanını da veririm.”</w:t>
       </w:r>
     </w:p>
     <w:p>
@@ -2091,7 +2091,7 @@
     </w:p>
     <w:p>
       <w:r>
-        <w:t>Kapıdan çıkınca Vildan Hanım elinde iki dosyayla yanımıza geldi. Birini Hakan Hoca'ya uzattı, ötekini göğsüne bastırdı.</w:t>
+        <w:t>Kapıdan çıkmadan Vildan Hanım elinde iki dosyayla yanımıza geldi. Birini Hakan Hoca'ya uzattı, ötekini göğsüne bastırdı.</w:t>
       </w:r>
     </w:p>
     <w:p>
@@ -2181,7 +2181,7 @@
         <w:t xml:space="preserve">Biz de ardı sıra çıktık. </w:t>
       </w:r>
       <w:r>
-        <w:t>Koridorda yürürken Hakan Hoca'nın sol ayağı eşiğe hafifçe takıldı. Düşmedi, eli duvara gitmedi; yalnızca bir an adımını kısalttı ve konuşmasına kaldığı yerden devam etti. O gün bunu uzun yürüyüşün yorgunluğuna yordum. Hatta ona, “Hocam, insanın ayağı bile mesai bitince istifa edebiliyor,” dedim.</w:t>
+        <w:t>Koridorda yürürken Hakan Hoca'nın sağ ayağı eşiğe hafifçe takıldı. Düşmedi, eli duvara gitmedi; yalnızca bir an adımını kısalttı ve konuşmasına kaldığı yerden devam etti. O gün bunu uzun yürüyüşün yorgunluğuna yordum. Hatta ona, “Hocam, insanın ayağı bile mesai bitince istifa edebiliyor,” dedim.</w:t>
       </w:r>
     </w:p>
     <w:p>
@@ -2386,7 +2386,7 @@
     </w:p>
     <w:p>
       <w:r>
-        <w:t>“Hani konuşmakta zorlandığını ve çalışmak istemediğini söylemiştin ya… Önce bedensel ya da nörolojik bir neden var mı, onu değerlendirelim. Sonra yaşadıklarının tükenmişlik mi, başka bir durum mu olduğunu konuşuruz.”</w:t>
+        <w:t>“Hani konuşmakta zorlandığını, kabuğuna çekildiğini ve çalışmak istemediğini söylemiştin ya… Önce bedensel ya da nörolojik bir neden var mı, onu değerlendirelim. Sonra yaşadıklarının tükenmişlik mi, başka bir durum mu olduğunu konuşuruz.”</w:t>
       </w:r>
     </w:p>
     <w:p>
@@ -2447,7 +2447,7 @@
         <w:t>Akşam yemeğinden sonra annem sigara odasına geçip sigarasını içti. Ben elektronik sigara kullandığım için evin her yerinde içebiliyordum. Yemekten yaklaşık bir saat sonra maden suyuna alıç sirkesi karıştırıp içerdim. O akşam da öyle yaptım. Maden suyumu bitirince ayağa kalktım. Otururken yazdığım kısa mesajı okuyup bir dostuma gönderecektim. Fakat ayağa kalkar kalkmaz parmağım gönder tuşuna basmadı. Bedenim kasılmaya başladı. Bilincim açıktı ama bedenime hâkim olamıyordum; bir ağaç kütüğü gibi yere devrildim. Gözlerimi bile oynatamıyordum; kendimi felç olmuş gibi hissettim. Nefesim kesiliyor gibiydi. Her şey kararmadan önce aklımdan geçen son cümle şuydu: “Hani ben şehit olacaktım, Allah'ım?” Sonra bilincim kapandı. Ekran hâlâ açıktı. Mesajım yarım kalmış, imleç yanıp sönüyordu; sanki benden önce o nefes alıyor, cümleyi tek başına tamamlamaya çalışıyordu. İçimden yardım diye bağırdığımı hatırlıyorum; sesim çıktı mı, bilmiyorum. Ne kadar süre yerde kaldığımı bilmiyorum. Bir süre sonra gözlerimi yerde açtım. Halının deseni gözümün önünde yabancı bir harita gibi duruyordu; birkaç saniye sonra ev olduğunu çıkardım. Bedenim benden önce uyanmış gibiydi: kaslarım kasılıp çözülüyor, ben yalnızca seyrediyordum. Her yanım tutulmuş, ağrımaya başlamıştı.</w:t>
       </w:r>
       <w:r>
-        <w:t xml:space="preserve"> Midem bulanıp kusacak gibi olunca lavaboya gitmek için emeklemeye başladım. Bizim koridor ince ve uzundur; yaklaşık on beş metre. Tek endişem, koridorun sonunda oturup sigara içen, tabletinden dizi izleyen annemin beni bu hâlde görmesiydi. Banyo koridorun sonunda, sol taraftaydı. Tahmin ettiğim gibi kustum; başım dönmeye devam etse de öğürmem gerekmedi. Şükürler olsun, annem ne gördü ne duydu. Son iki yıldır az işitmeye başlamıştı. Sonunda salona ulaştım ve üçlü koltuğa uzandım. Daha doğrusu, kendimi koltuğa bıraktım. Bir bacağım yerde, yüzüm koyduğum tarafa dönük, bir kolum aşağı sarkmış halde; sarhoş biri gibi yarı baygın uyuyakalmışım. Gece mi sabah mı olduğunu bilmediğim bir ara, üstüm açık ve biçimsiz yatışıma söylenen annemin sesini duydum:</w:t>
+        <w:t xml:space="preserve"> Midem bulanıp kusacak gibi olunca lavaboya gitmek için emeklemeye başladım. Bizim koridor ince ve uzundur; yaklaşık on beş metre. Tek endişem, koridorun sonunda oturup sigara içen, tabletinden dizi izleyen annemin beni bu hâlde görmesiydi. Banyo koridorun sonunda, sol taraftaydı. Tahmin ettiğim gibi kustum; başım dönmeye devam etse de öğürmem gerekmedi. Şükürler olsun, annem ne gördü ne duydu. Son iki yıldır az işitmeye başlamıştı. Sonunda salona ulaştım ve üçlü koltuğa uzandım. Daha doğrusu, kendimi koltuğa bıraktım. Bir bacağım yerde, yüzüm koyduğum tarafa dönük, bir kolum aşağı sarkmış hâlde; sarhoş biri gibi yarı baygın uyuyakalmışım. Gece mi sabah mı olduğunu bilmediğim bir ara, üstüm açık ve biçimsiz yatışıma söylenen annemin sesini duydum:</w:t>
       </w:r>
     </w:p>
     <w:p>
@@ -2596,7 +2596,7 @@
     </w:p>
     <w:p>
       <w:r>
-        <w:t>Normalde kavgacı olan annem, son zamanlardaki öfkeli çıkışlarımı ve suskunluğumu, tavırlarındaki değişimi en iyi fark eden kişiydi. Evden çıktım. Hiç kimseyle konuşmak istemiyordum. Bir an istasyona inmekten vazgeçmeyi düşündüm ama beni sakinleştiren, Türk kahvesini başka hiçbir yerde bulamadığım Çeşmi Nar Kafe'ye yöneldim. İstasyona bitişik, salaş bir yerdi; yeni açılan, modern tasarımlı kafelerin tam tersiydi. Çocukluk arkadaşım, kafenin sahibi Mahmut Kolişler, beni sokağın öbür ucunda görür görmez garsona seslenirdi:</w:t>
+        <w:t>Normalde kavgacı olan annem, son zamanlardaki öfkeli çıkışlarımı ve suskunluğumu, tavırlarımdaki değişimi en iyi fark eden kişiydi. Evden çıktım. Hiç kimseyle konuşmak istemiyordum. Bir an istasyona inmekten vazgeçmeyi düşündüm ama beni sakinleştiren, Türk kahvesini başka hiçbir yerde bulamadığım Çeşmi Nar Kafe'ye yöneldim. İstasyona bitişik, salaş bir yerdi; yeni açılan, modern tasarımlı kafelerin tam tersiydi. Çocukluk arkadaşım, kafenin sahibi Mahmut Kolişler, beni sokağın öbür ucunda görür görmez garsona seslenirdi:</w:t>
       </w:r>
     </w:p>
     <w:p>
@@ -2671,7 +2671,7 @@
         <w:rPr>
           <w:color w:val="FF0000"/>
         </w:rPr>
-        <w:t>Bir avcı gibi, sessizce takip edecektim ceylanı, beni nereye götürecekti hikayesi? Ben bir avcı değildim ama av olma ihtimalim de yok değildi. Böyle durumlarda en çok babamı özlerim ben, ona her şeyi sorabildiğim ve onun benim bilmediğim ne çok bildiği günleri…</w:t>
+        <w:t>Bir avcı gibi, sessizce takip edecektim ceylanı, beni nereye götürecekti hikâyesi? Ben bir avcı değildim ama av olma ihtimalim de yok değildi. Böyle durumlarda en çok babamı özlerim ben, ona her şeyi sorabildiğim ve onun benim bilmediğim ne çok bildiği günleri…</w:t>
       </w:r>
     </w:p>
     <w:p>
@@ -2939,7 +2939,7 @@
     </w:p>
     <w:p>
       <w:r>
-        <w:t>“Yok, ben girmeyeyim Beyim, Size çay getirem mi ben bi solukta, içiniz ısınır?”</w:t>
+        <w:t>“Yok, ben girmeyeyim beyim, size çay getirem mi ben bi solukta, içiniz ısınır?”</w:t>
       </w:r>
     </w:p>
     <w:p>
@@ -3048,7 +3048,7 @@
         <w:rPr>
           <w:color w:val="FF0000"/>
         </w:rPr>
-        <w:t>yani okumuş, mürekkep yalamış ademler.”</w:t>
+        <w:t>yani okumuş, mürekkep yalamış âdemler.”</w:t>
       </w:r>
       <w:r/>
     </w:p>
@@ -3459,7 +3459,7 @@
         <w:rPr>
           <w:rFonts w:ascii="Courier New" w:hAnsi="Courier New" w:cs="Courier New"/>
         </w:rPr>
-        <w:t>“Buraya gelirken şahitle tanışacağım söylenmişti, kimse bu şahit önemli biri olmalı.”</w:t>
+        <w:t>“Buraya gelirken şahitle tanışacağım söylenmişti, her kimse bu şahit, önemli biri olmalı.”</w:t>
       </w:r>
     </w:p>
     <w:p>
@@ -3550,7 +3550,7 @@
         <w:rPr>
           <w:rFonts w:ascii="Courier New" w:hAnsi="Courier New" w:cs="Courier New"/>
         </w:rPr>
-        <w:t>“Sen buraya gelmeden önce öldün, etin Meryem Oğlu Hz İsa’ya kudret oldu, derine Nuru Muhammed’in (SAV) ismi yazıldı.”</w:t>
+        <w:t>“Sen buraya gelmeden önce öldün, etin Meryem oğlu Hz. İsa’ya kudret oldu, derine Nuru Muhammed’in (SAV) ismi yazıldı.”</w:t>
       </w:r>
     </w:p>
     <w:p>
@@ -3602,7 +3602,7 @@
         <w:rPr>
           <w:rFonts w:ascii="Courier New" w:hAnsi="Courier New" w:cs="Courier New"/>
         </w:rPr>
-        <w:t>“Sen Hz İsa’nın bedenine kudret, Allah’ın en sevdiğinin ismine şahit olunca derinle, şahit sana susadı, seni istedi, seni kendine yoldaş etmek, sürmeli gözlerinden öpmek, yolunu yoluna sermek istedi, çünkü her şey gittiği yolun rengine boyanır.”</w:t>
+        <w:t>“Sen Hz. İsa’nın bedenine kudret, Allah’ın en sevdiğinin ismine şahit olunca derinle, şahit sana susadı, seni istedi, seni kendine yoldaş etmek, sürmeli gözlerinden öpmek, yolunu yoluna sermek istedi, çünkü her şey gittiği yolun rengine boyanır.”</w:t>
       </w:r>
     </w:p>
     <w:p>
@@ -3706,7 +3706,7 @@
         <w:rPr>
           <w:rFonts w:ascii="Courier New" w:hAnsi="Courier New" w:cs="Courier New"/>
         </w:rPr>
-        <w:t>“Şansla değil nasiple geldin, Allah Hz Muhammed’i ne kadar çok seviyor ki bu cana karşılık sana tüm bunları bahşetti, onun yolundan gidenlerin varacakları yerleri görsen, buralar sana taze çimenler gibi değil, sararmış otlar gibi gelirdi.”</w:t>
+        <w:t>“Şansla değil nasiple geldin, Allah Hz. Muhammed’i ne kadar çok seviyor ki bu cana karşılık sana tüm bunları bahşetti, onun yolundan gidenlerin varacakları yerleri görsen, buralar sana taze çimenler gibi değil, sararmış otlar gibi gelirdi.”</w:t>
       </w:r>
     </w:p>
     <w:p>
@@ -3732,7 +3732,7 @@
         <w:rPr>
           <w:rFonts w:ascii="Courier New" w:hAnsi="Courier New" w:cs="Courier New"/>
         </w:rPr>
-        <w:t>“Şükürler olsun o zaman ceylan kardeş, yeni yerin burası, hadi yolun da gazan da mübarek olsun,” dedikten sonra buharlaşan bir su gibi uçtu gitti. Ama son sözlerini henüz buharlaşırken yankılandı;</w:t>
+        <w:t>“Şükürler olsun o zaman ceylan kardeş, yeni yerin burası, hadi yolun da gazan da mübarek olsun,” dedikten sonra buharlaşan bir su gibi uçtu gitti. Ama son sözleri henüz buharlaşırken yankılandı;</w:t>
       </w:r>
     </w:p>
     <w:p>
@@ -3801,7 +3801,7 @@
         <w:rPr>
           <w:rFonts w:ascii="Courier New" w:hAnsi="Courier New" w:cs="Courier New"/>
         </w:rPr>
-        <w:t>Ceylan çevresine baktı, amaçsızca birkaç adım attı. Bir suyun başına geldi, eğildi ve kokladı, o ne güzel kokuydu. İçti, susamamış olsa da içti, içtiği su olmasa da içti. Uzaklardan bir yankılanma işitti, onu içtiğinden alıkoyan bir kahkaha sesiydi bu. Sesin geldiği yere doğru yürüdü, gökler mesafelerince, asırlar süresince yürüdü, ne kadar zaman ve mekân değiştirdiğini bilmeden. İki beden gördü, isli ateşlerden libaslar kuşanmış iki şey daha doğrusu… Görünmek endişesi ile yaklaşmaktan ürkse de o sözü anımsadı; “Korkma, seni görünmezlik zırhına büründüren yola revan edendir…”</w:t>
+        <w:t>Ceylan çevresine baktı, amaçsızca birkaç adım attı. Bir suyun başına geldi, eğildi ve kokladı, o ne güzel kokuydu. İçti, susamamış olsa da içti, içtiği su olmasa da içti. Uzaklardan bir yankılanma işitti, onu içtiğinden alıkoyan bir kahkaha sesiydi bu. Sesin geldiği yere doğru yürüdü, gökler mesafelerince, asırlar süresince yürüdü, ne kadar zaman ve mekân değiştirdiğini bilmeden. İki beden gördü, dumansız ateşlerden libaslar kuşanmış iki şey daha doğrusu… Görünmek endişesi ile yaklaşmaktan ürkse de o sözü anımsadı; “Korkma, seni görünmezlik zırhına büründüren yola revan edendir…”</w:t>
       </w:r>
     </w:p>
     <w:p>
@@ -3879,7 +3879,7 @@
         <w:rPr>
           <w:rFonts w:ascii="Courier New" w:hAnsi="Courier New" w:cs="Courier New"/>
         </w:rPr>
-        <w:t>Daha küçük olanı ellerini ovuşturdu, ovuştururken avuçlarından yükselen alevler bin güneş patlamasına eşitti, kahkahaları binlerce gök gürültüsü kadar şeddeliydi.</w:t>
+        <w:t>Daha küçük olanı ellerini ovuşturdu, ovuştururken avuçlarından yükselen alevler bin güneş patlamasına eşitti, kahkahaları binlerce gök gürültüsü kadar şiddetliydi.</w:t>
       </w:r>
     </w:p>
     <w:p>
@@ -3931,7 +3931,7 @@
         <w:rPr>
           <w:rFonts w:ascii="Courier New" w:hAnsi="Courier New" w:cs="Courier New"/>
         </w:rPr>
-        <w:t>“O zamanlar cennetteydim, ilmim üstüne ilim, bildiklerim üstüne bilen yoktu. Yeryüzünde atam Can’ın soyundan gelen bozguncu iblisleri yok etmiş, itibarımın zirvesindeydim. Kürsüme çıkmış, cennetteki meleklere bildiklerimi anlatıyordum. İki cennet günü, çıt sesi çıkmadı hiçbirisinden, yani altı bin iki yüz kırk koca insan yılı. Nice sonra birer, ikişer, onar ve nihayetinde binlerce meleğin saflar halinde çözüldüklerini fark ettim, neler olduğunu merak edip, meleklerin akın ettikleri yöne doğru yürümeye başladım. ‘Ne oldu, nereye gidiyorsunuz’ dedim. Sonunda biri cevap verdi;</w:t>
+        <w:t>“O zamanlar cennetteydim, ilmim üstüne ilim, bildiklerim üstüne bilen yoktu. Yeryüzünde atam Can’ın soyundan gelen bozguncu iblisleri yok etmiş, itibarımın zirvesindeydim. Kürsüme çıkmış, cennetteki meleklere bildiklerimi anlatıyordum. İki cennet günü, çıt sesi çıkmadı hiçbirisinden, yani altı bin iki yüz kırk koca insan yılı. Nice sonra birer, ikişer, onar ve nihayetinde binlerce meleğin saflar hâlinde çözüldüklerini fark ettim, neler olduğunu merak edip, meleklerin akın ettikleri yöne doğru yürümeye başladım. ‘Ne oldu, nereye gidiyorsunuz?’ dedim. Sonunda biri cevap verdi;</w:t>
       </w:r>
     </w:p>
     <w:p>
@@ -3963,7 +3963,7 @@
         <w:rPr>
           <w:rFonts w:ascii="Courier New" w:hAnsi="Courier New" w:cs="Courier New"/>
         </w:rPr>
-        <w:t>arasındaki mesafe semaları geçen, heybetli, azametli, dört büyük melekten bile çok… Allah’ın halifesi olacaktı nihayetinde. Safları yararak olağanca hızımla ilerledim, sonunda kalabalığın öbek olduğu yerde seslendim;</w:t>
+        <w:t>arasındaki mesafe semaları geçen, heybetli, azametli, dört büyük melekten bile çok… Allah’ın halifesi olacaktı nihayetinde. Safları yararak olanca hızımla ilerledim, sonunda kalabalığın öbek olduğu yerde seslendim;</w:t>
       </w:r>
     </w:p>
     <w:p>
@@ -3989,7 +3989,7 @@
         <w:rPr>
           <w:rFonts w:ascii="Courier New" w:hAnsi="Courier New" w:cs="Courier New"/>
         </w:rPr>
-        <w:t>‘Allah’ın halifesi olacak ama henüz ruhu üflenmedi’ dedi. Parmağımı dokundurdum, tıngırdadı. ‘Oysa ateşi yakmalıydı elimi’ dedim, İsrafil alaycı bir ifade ile ‘Elini yakmaz korkma, Allah onu topraktan yarattı’ dedi. Burun deliklerinden bedenine girdim, tıngırdamasındaki hikmet, içi bomboş, su katılmamış kuru toprak olmasıymış meğer. Dışarı çıktım bedeninden, göremediğim ne varmış bunda diye iyiden iyiye süzdüm ve nihayetinde dayanamayıp; ‘Bu mu Allah’ın halifesi olacak, bu tıngırdayan kuru toprak parçası mı?’ Sanırım biraz yüksek sesle söyledim bunu. Birkaç melek gür sesimden korkup, sağda solda uçuştular, tam tekrar bir araya geldiklerinde, Allah’tan malum nidayı duydum, ‘Adem’e doğru secde edin.’</w:t>
+        <w:t>‘Allah’ın halifesi olacak ama henüz ruhu üflenmedi’ dedi. Parmağımı dokundurdum, tıngırdadı. ‘Oysa ateşi yakmalıydı elimi’ dedim, İsrafil alaycı bir ifade ile ‘Elini yakmaz korkma, Allah onu topraktan yarattı’ dedi. Burun deliklerinden bedenine girdim, tıngırdamasındaki hikmet, içi bomboş, su katılmamış kuru toprak olmasıymış meğer. Dışarı çıktım bedeninden, göremediğim ne varmış bunda diye iyiden iyiye süzdüm ve nihayetinde dayanamayıp; ‘Bu mu Allah’ın halifesi olacak, bu tıngırdayan kuru toprak parçası mı?’ Sanırım biraz yüksek sesle söyledim bunu. Birkaç melek gür sesimden korkup, sağda solda uçuştular, tam tekrar bir araya geldiklerinde, Allah’tan malum nidayı duydum, ‘Âdem’e doğru secde edin.’</w:t>
       </w:r>
     </w:p>
     <w:p>
@@ -4015,7 +4015,7 @@
         <w:rPr>
           <w:rFonts w:ascii="Courier New" w:hAnsi="Courier New" w:cs="Courier New"/>
         </w:rPr>
-        <w:t xml:space="preserve">Sonrasını biliyorsun zaten, kapısında ismi yazılı olan Âdem’in soyundan gelecekmiş. Müsaade istemem, onu ve soyundan gelecekleri Hak yoldan şaşırtmak için, bak işte kendi gözlerinle gördün, o ele avuca sığmaz Âdem ve eşi Havva </w:t>
+        <w:t xml:space="preserve">Sonrasını biliyorsun zaten, kapısında ismi yazılı olan Âdem’in soyundan gelecekmiş. Müsaade istedim, onu ve soyundan gelecekleri Hak yoldan şaşırtmak için, bak işte kendi gözlerinle gördün, o ele avuca sığmaz Âdem ve eşi Havva </w:t>
       </w:r>
       <w:r>
         <w:rPr>
@@ -4034,7 +4034,7 @@
         <w:rPr>
           <w:rFonts w:ascii="Courier New" w:hAnsi="Courier New" w:cs="Courier New"/>
         </w:rPr>
-        <w:t>Bunu nasıl yaptın diyeceksin, kovulduktan sonra cennetin kapısında beklerken Havva ve Adem’i gördüğümde gülüşlerimi duymasınlar diye nasıl çaba sarf ettim bilemezsin. Beklediğim gibi sonunda şecere ağacına kadar geldiler amaaaa…”</w:t>
+        <w:t>Bunu nasıl yaptın diyeceksin, kovulduktan sonra cennetin kapısında beklerken Havva ve Âdem’i gördüğümde gülüşlerimi duymasınlar diye nasıl çaba sarf ettim bilemezsin. Beklediğim gibi sonunda şecere ağacına kadar geldiler amaaaa…”</w:t>
       </w:r>
     </w:p>
     <w:p>
@@ -4060,7 +4060,7 @@
         <w:rPr>
           <w:rFonts w:ascii="Courier New" w:hAnsi="Courier New" w:cs="Courier New"/>
         </w:rPr>
-        <w:t>“…Ama Allah o yasağı çiğnemelerine rağmen, cennetten kovarken bile onlara hiç duymadığım üç ismiyle tecelli etti. Söyle bana bu nasıl bir hükümdür? Şecere Adem’in soyunun meyvesi değil miydi? Söyle iblis haksız mıyım?”</w:t>
+        <w:t>“…Ama Allah o yasağı çiğnemelerine rağmen, cennetten kovarken bile onlara hiç duymadığım üç ismiyle tecelli etti. Söyle bana bu nasıl bir hükümdür? Şecere Âdem’in soyunun meyvesi değil miydi? Söyle iblis haksız mıyım?”</w:t>
       </w:r>
     </w:p>
     <w:p>
@@ -4151,20 +4151,20 @@
         <w:rPr>
           <w:rFonts w:ascii="Courier New" w:hAnsi="Courier New" w:cs="Courier New"/>
         </w:rPr>
-        <w:t>‘Yeryüzünde gelmiş, gelecek olan tüm halkları toplasan Davut gibi ağlayamaz, Davut ile gelmiş gelecek tüm insanların ağlamasını toplasan, Adem’in ağlaması gibi içli olamaz.’</w:t>
-      </w:r>
-    </w:p>
-    <w:p>
-      <w:pPr>
-        <w:rPr>
-          <w:rFonts w:ascii="Courier New" w:hAnsi="Courier New" w:cs="Courier New"/>
-        </w:rPr>
-      </w:pPr>
-      <w:r>
-        <w:rPr>
-          <w:rFonts w:ascii="Courier New" w:hAnsi="Courier New" w:cs="Courier New"/>
-        </w:rPr>
-        <w:t>Nurdan cennet libası üzerinden soyulduktan sonra bütün organları gün gibi ortaya çıktı, utandı Âdem, koşmaya başladı, o kadar hızlı koştu ki, sonunda dünyaya düşüverdi, hem de Havva’dan çok uzaklara. Onu et, kemik, organ, kan ile giydirdiler. Sadece tıngırdayan o çamura su, hava ve ateş de ilave edilince, hava ateşini körükledi, su ateşi serinletmedi, Toprak olan bedeni ne ateşi ne suyu ne havayı benimseyemedi. Üflenen ruh bedenini, bedeni ise kendi içinde dört zıttın çivilenmesini sevmedi. Nasıl ağlamasın?”</w:t>
+        <w:t>‘Yeryüzünde gelmiş, gelecek olan tüm halkları toplasan Davut gibi ağlayamaz, Davut ile gelmiş gelecek tüm insanların ağlamasını toplasan, Âdem’in ağlaması gibi içli olamaz.’</w:t>
+      </w:r>
+    </w:p>
+    <w:p>
+      <w:pPr>
+        <w:rPr>
+          <w:rFonts w:ascii="Courier New" w:hAnsi="Courier New" w:cs="Courier New"/>
+        </w:rPr>
+      </w:pPr>
+      <w:r>
+        <w:rPr>
+          <w:rFonts w:ascii="Courier New" w:hAnsi="Courier New" w:cs="Courier New"/>
+        </w:rPr>
+        <w:t>Nurdan cennet libası üzerinden soyulduktan sonra bütün organları gün gibi ortaya çıktı, utandı Âdem, koşmaya başladı, o kadar hızlı koştu ki, sonunda dünyaya düşüverdi, hem de Havva’dan çok uzaklara. Onu et, kemik, organ, kan ile giydirdiler. Sadece tıngırdayan o çamura su, hava ve ateş de ilave edilince, hava ateşini körükledi, su ateşi serinletmedi, toprak olan bedeni ne ateşi ne suyu ne havayı benimseyemedi. Üflenen ruh bedenini, bedeni ise kendi içinde dört zıttın çivilenmesini sevmedi. Nasıl ağlamasın?”</w:t>
       </w:r>
     </w:p>
     <w:p>
@@ -4203,20 +4203,20 @@
         <w:rPr>
           <w:rFonts w:ascii="Courier New" w:hAnsi="Courier New" w:cs="Courier New"/>
         </w:rPr>
-        <w:t>Şeytan, tahtının altından bir mızrak çıkarttı ve gürleyen sesiyle, hiddetini arttırarak sözlerine devam etti.</w:t>
-      </w:r>
-    </w:p>
-    <w:p>
-      <w:pPr>
-        <w:rPr>
-          <w:rFonts w:ascii="Courier New" w:hAnsi="Courier New" w:cs="Courier New"/>
-        </w:rPr>
-      </w:pPr>
-      <w:r>
-        <w:rPr>
-          <w:rFonts w:ascii="Courier New" w:hAnsi="Courier New" w:cs="Courier New"/>
-        </w:rPr>
-        <w:t>“Bu nedir İblis, oğullarım tahtımı, tacımı eline geçirmek için, bilmediğim yazılar mı yazmaya başladı, bilmediğim silahlar mı üretmeye başladı? Adını bile bilmediğim silahlarla mı beni öldüreceksiniz? Bilmez misin benim iznimi Allah kıyamete kadar verdi? Benim bilmediğim lisan, ilmim üstüne ilim yoktur.”</w:t>
+        <w:t>Şeytan, tahtının altından bir mızrak çıkarttı ve gürleyen sesiyle, hiddetini artırarak sözlerine devam etti.</w:t>
+      </w:r>
+    </w:p>
+    <w:p>
+      <w:pPr>
+        <w:rPr>
+          <w:rFonts w:ascii="Courier New" w:hAnsi="Courier New" w:cs="Courier New"/>
+        </w:rPr>
+      </w:pPr>
+      <w:r>
+        <w:rPr>
+          <w:rFonts w:ascii="Courier New" w:hAnsi="Courier New" w:cs="Courier New"/>
+        </w:rPr>
+        <w:t>“Bu nedir iblis, oğullarım tahtımı, tacımı eline geçirmek için, bilmediğim yazılar mı yazmaya başladı, bilmediğim silahlar mı üretmeye başladı? Adını bile bilmediğim silahlarla mı beni öldüreceksiniz? Bilmez misin benim iznimi Allah kıyamete kadar verdi? Benim bilmediğim lisan, ilmim üstüne ilim yoktur.”</w:t>
       </w:r>
     </w:p>
     <w:p>
@@ -4320,7 +4320,7 @@
         <w:rPr>
           <w:rFonts w:ascii="Courier New" w:hAnsi="Courier New" w:cs="Courier New"/>
         </w:rPr>
-        <w:t>“Adem’in soyundan gelenler.”</w:t>
+        <w:t>“Âdem’in soyundan gelenler.”</w:t>
       </w:r>
     </w:p>
     <w:p>
@@ -4398,7 +4398,7 @@
         <w:rPr>
           <w:rFonts w:ascii="Courier New" w:hAnsi="Courier New" w:cs="Courier New"/>
         </w:rPr>
-        <w:t>“Âdem ve dişisi Havva’yı cennetten kovduran şecere ağacı öyle bir tohum ki içinde kıyamete kadar gelecek Âdem soyunun isimlerin hepsi yazılı. Cennet kapısında ismi yazılı olan yeryüzüne geldikten sonra rahmet dünyaya iyiden iyiye tecelli edecek diyorlar. Hatta Âdem ağlarken, ‘Cennet kapısında ismi yazılı olanın yüzü suyu hürmetine affet beni’ diye yakarırken duymuş diğer iblisler.</w:t>
+        <w:t>“Âdem ve dişisi Havva’yı cennetten kovduran şecere ağacı öyle bir tohum ki içinde kıyamete kadar gelecek Âdem soyunun isimlerinin hepsi yazılı. Cennet kapısında ismi yazılı olan yeryüzüne geldikten sonra rahmet dünyaya iyiden iyiye tecelli edecek diyorlar. Hatta Âdem ağlarken, ‘Cennet kapısında ismi yazılı olanın yüzü suyu hürmetine affet beni’ diye yakarırken duymuş diğer iblisler.</w:t>
       </w:r>
     </w:p>
     <w:p>
@@ -4424,7 +4424,7 @@
         <w:rPr>
           <w:rFonts w:ascii="Courier New" w:hAnsi="Courier New" w:cs="Courier New"/>
         </w:rPr>
-        <w:t>“Sakın onun ismini söyleme, yoksa seni şuracıkta ikiye bölerim ve sen hala bildiklerimi söylüyorsun.”</w:t>
+        <w:t>“Sakın onun ismini söyleme, yoksa seni şuracıkta ikiye bölerim ve sen hâlâ bildiklerimi söylüyorsun.”</w:t>
       </w:r>
     </w:p>
     <w:p>
@@ -4463,7 +4463,7 @@
         <w:rPr>
           <w:rFonts w:ascii="Courier New" w:hAnsi="Courier New" w:cs="Courier New"/>
         </w:rPr>
-        <w:t>“Cennetin kapısında ismi yazanın ardında saf tutanlar, dediğim gibi bu iki ucu keskin bir mızrak, kim ki ortasından tutup, iki tarafın arasına bu mızrağı atar, işte o kazanır savaşı, kim ki bıçaklı uçları tutup karşısındakine diğer ucu saplamaya çalışır hem karşısındakini hem kendini ruhen keser, böler ve parçalar. Bu rahmet olarak yer yüzüne gönderilecek olanın ardında saf tutacakların birbirlerine çekeceği bir mızrak. Bu beyazın içindeki beyaz, siyahın içindeki siyah, suyun içindeki su, ateşin içindeki ateş olduğu için kimse fark etmeyecek sinsi bir parçalayıcı, bölücü bir mızrak, üstünde ne yazdığına gelince…”</w:t>
+        <w:t>“Cennetin kapısında ismi yazanın ardında saf tutanlar, dediğim gibi bu iki ucu keskin bir mızrak, kim ki ortasından tutup, iki tarafın arasına bu mızrağı atar, işte o kazanır savaşı, kim ki bıçaklı uçları tutup karşısındakine diğer ucu saplamaya çalışır hem karşısındakini hem kendini ruhen keser, böler ve parçalar. Bu rahmet olarak yeryüzüne gönderilecek olanın ardında saf tutacakların birbirlerine çekeceği bir mızrak. Bu beyazın içindeki beyaz, siyahın içindeki siyah, suyun içindeki su, ateşin içindeki ateş olduğu için kimse fark etmeyecek sinsi bir parçalayıcı, bölücü bir mızrak, üstünde ne yazdığına gelince…”</w:t>
       </w:r>
     </w:p>
     <w:p>
@@ -4703,7 +4703,7 @@
         <w:rPr>
           <w:rFonts w:ascii="Courier New" w:hAnsi="Courier New" w:cs="Courier New"/>
         </w:rPr>
-        <w:t>“Dur, seni bu tahtta oturttuğum o günü anımsıyor musun?”</w:t>
+        <w:t>“Dur, seni bu tahta oturttuğum o günü anımsıyor musun?”</w:t>
       </w:r>
     </w:p>
     <w:p>
@@ -4836,7 +4836,7 @@
     </w:p>
     <w:p>
       <w:r>
-        <w:t>“Sen benimle dalga mı geçiyorsun lan? Bir deli mektuplar yazmış gibi gösterip, devlet adamlığı oynayıp, kitabını bana düzenlettiriyorsun şerefsiz? Benim zaten halim harap, tükenmişliğin üst sınırlarındayım, sana bunu defaten söyledim, sen de beni bu anımda yakalayıp, fırsatı gole mi çeviriyorsun? Hastalık haklarıymış da yok efendim devletin gizli bilgileriymiş de… Gizliyse niye ben de biliyorum ya da öğrenmeme hatta gizemi bozmayacak şekilde yazarsam bir mahsuru olmadığını söylüyorsun? Yazmıyorum lan, piyasada bir sürü vatansever yazar müsveddesi var. Ben bırakıyorum…”</w:t>
+        <w:t>“Sen benimle dalga mı geçiyorsun lan? Bir deli mektuplar yazmış gibi gösterip, devlet adamlığı oynayıp, kitabını bana düzenlettiriyorsun şerefsiz? Benim zaten hâlim harap, tükenmişliğin üst sınırlarındayım, sana bunu defaten söyledim, sen de beni bu anımda yakalayıp, fırsatı gole mi çeviriyorsun? Hastalık haklarıymış da yok efendim devletin gizli bilgileriymiş de… Gizliyse niye ben de biliyorum ya da öğrenmeme hatta gizemi bozmayacak şekilde yazarsam bir mahsuru olmadığını söylüyorsun? Yazmıyorum lan, piyasada bir sürü vatansever yazar müsveddesi var. Ben bırakıyorum…”</w:t>
       </w:r>
     </w:p>
     <w:p>
@@ -4916,7 +4916,7 @@
     </w:p>
     <w:p>
       <w:r>
-        <w:t>“Niye kaçayım, sonuçta bu kimse beni istemiş, anlattıkları da hiç yavana atılır şeyler değil, elbette yazarım ama birbirimize daha dürüst olmamız gerekiyor, hepsi bu.”</w:t>
+        <w:t>“Niye kaçayım, sonuçta bu kimse beni istemiş, anlattıkları da hiç yabana atılır şeyler değil, elbette yazarım ama birbirimize daha dürüst olmamız gerekiyor, hepsi bu.”</w:t>
       </w:r>
     </w:p>
     <w:p>
@@ -4936,12 +4936,12 @@
     </w:p>
     <w:p>
       <w:r>
-        <w:t>“Hocam iyi misiniz” dedi.</w:t>
-      </w:r>
-    </w:p>
-    <w:p>
-      <w:r>
-        <w:t>“Ya kardeşim, başlatmayın hocanızdan, ne hocası...” demiştim zavallı kadına. Bahçeye indim, temiz hava almak bana iyi gelecek, sinirlerimi yatıştıracaktı. Etrafıma bakındım, her yerde birileri oturuyordu, Hakan Hoca'ya söyleyecek çok fazla şeyler vardı ama başından beri dediğim gibi inanılmaz bir konuşma isteksizliği vardı bende. Bir kahve içmek sakinleştirir miydi? Denemek için hazır bahçeye çıkmışken kendime bir kahve söyledim.</w:t>
+        <w:t>“Hocam iyi misiniz?” dedi.</w:t>
+      </w:r>
+    </w:p>
+    <w:p>
+      <w:r>
+        <w:t>“Ya kardeşim, başlatmayın hocanızdan, ne hocası…” demiştim zavallı kadına. Bahçeye indim, temiz hava almak bana iyi gelecek, sinirlerimi yatıştıracaktı. Etrafıma bakındım, her yerde birileri oturuyordu, Hakan Hoca'ya söyleyecek çok fazla şeyler vardı ama başından beri dediğim gibi inanılmaz bir konuşma isteksizliği vardı bende. Bir kahve içmek sakinleştirir miydi? Denemek için hazır bahçeye çıkmışken kendime bir kahve söyledim.</w:t>
       </w:r>
     </w:p>
     <w:p>
@@ -4951,7 +4951,7 @@
     </w:p>
     <w:p>
       <w:r>
-        <w:t>Büfe tezgâhında bekleyen abimize dönüp, bir sade bir de orta kahve söyledim, ellerini önlüğüyle kurulayan adam, alelacele kahveleri yapmaya başladı, “Hemen Hocam.”</w:t>
+        <w:t>Büfe tezgâhında bekleyen abimize dönüp, bir sade bir de orta kahve söyledim, ellerini önlüğüyle kurulayan adam, alelacele kahveleri yapmaya başladı, “Hemen hocam.”</w:t>
       </w:r>
     </w:p>
     <w:p>
@@ -4981,7 +4981,7 @@
     </w:p>
     <w:p>
       <w:r>
-        <w:t>İki hoş beşten sonra… Ki o hoşbeş eminim beni tartmak içindi, karşılıklı sorularla birbirimizi daha iyi tanımak istiyorduk.</w:t>
+        <w:t>İki hoş beşten sonra… Ki o hoş beş eminim beni tartmak içindi, karşılıklı sorularla birbirimizi daha iyi tanımak istiyorduk.</w:t>
       </w:r>
     </w:p>
     <w:p>
@@ -4996,7 +4996,7 @@
     </w:p>
     <w:p>
       <w:r>
-        <w:t xml:space="preserve">Haklıydı, şehrin göbeğinde böyle ağaçlık ve sessiz bir yer mükemmeldi. Yakınlarda Kriton Curi parkı vardı ama halka açık </w:t>
+        <w:t xml:space="preserve">Haklıydı, şehrin göbeğinde böyle ağaçlık ve sessiz bir yer mükemmeldi. Yakınlarda Kriton Curi Parkı vardı ama halka açık </w:t>
       </w:r>
       <w:r>
         <w:t>olduğu için çok gürültülüydü.</w:t>
@@ -5024,7 +5024,7 @@
     </w:p>
     <w:p>
       <w:r>
-        <w:t>“Maşallah, neler yazıyorsunuz” gibi bir sürü şeyler konuştuk yığınla…</w:t>
+        <w:t>“Maşallah, neler yazıyorsunuz?” gibi bir sürü şeyler konuştuk yığınla…</w:t>
       </w:r>
     </w:p>
     <w:p>
@@ -5039,7 +5039,7 @@
     </w:p>
     <w:p>
       <w:r>
-        <w:t>“…Önce çalıştırıp yorar, hafta sonları dinlenebileceğine ikna edersin, ardından yıllık izin derken yıllar da izinler de çalışmalar da yığınlar halinde çöker insanın üzerine, biz buna emekli olmak diyoruz işte, oysaki emekli olmak mesleğinden emekli eder insanı, hayattan değil. Çalışmak gayreti, aydan aya gelen emekli maaşı ile biter, oysaki gayret hayatta kalmak çabası değildir sadece… Gayret; hayreti de diri tutmak için gösterilmelidir şu hayatta, gayemiz ile gayretimiz birbirine karışınca, hayret de gayret de biter, bu da bir cinayeti meşru gösterir.”</w:t>
+        <w:t>“…Önce çalıştırıp yorar, hafta sonları dinlenebileceğine ikna edersin, ardından yıllık izin derken yıllar da izinler de çalışmalar da yığınlar hâlinde çöker insanın üzerine, biz buna emekli olmak diyoruz işte, oysaki emekli olmak mesleğinden emekli eder insanı, hayattan değil. Çalışmak gayreti, aydan aya gelen emekli maaşı ile biter, oysaki gayret hayatta kalmak çabası değildir sadece… Gayret; hayreti de diri tutmak için gösterilmelidir şu hayatta, gayemiz ile gayretimiz birbirine karışınca, hayret de gayret de biter, bu da bir cinayeti meşru gösterir.”</w:t>
       </w:r>
     </w:p>
     <w:p>
@@ -5093,7 +5093,7 @@
     </w:p>
     <w:p>
       <w:r>
-        <w:t>“Demek kitapları seviyorsunuz, biz yazarların duymayı en çok istediği şeydir bu, iyi hikayeler, iyi okurları hak ederler diye söylerim hep.”</w:t>
+        <w:t>“Demek kitapları seviyorsunuz, biz yazarların duymayı en çok istediği şeydir bu, iyi hikâyeler, iyi okurları hak ederler diye söylerim hep.”</w:t>
       </w:r>
     </w:p>
     <w:p>
@@ -5148,12 +5148,12 @@
     </w:p>
     <w:p>
       <w:r>
-        <w:t>Aklım acayip karışmıştı… Hala karışık! Yazdım ama ses kaydında söyleneni aktarıyorum, aktarırken kendimi bir daktilo gibi hissediyorum. Çünkü yazan ben değilim, söyleyen Muhibbi Amca değil. Söyleten de yazdıran da Allah deyip, işin içinden çıkıyorum. İşte bu yüzden bilinmek istenen bizi aklımızla sınırlamamış, bir de aşk vermiş. Niye mi aşk? Şöyle devam etmişti Muhibbi Amca sözlerine;</w:t>
-      </w:r>
-    </w:p>
-    <w:p>
-      <w:r>
-        <w:t>“Hayrette gayret gösteriyoruz, bu gayretin yakıtı ne peki? Ferhat’ın dağları delen o motivasyonu, mecaz bir aşk da olsa, Şirin için dağları deldirmedi mi? Aşkın mecazı yani beşere bile dağları deldiriyorsa, Allah aşkı olana ne yaptırmaz bir düşünsene. Aşksız ilim, ilim sahibini ancak kibre götürür, bak Şeytan’a! Müthiş bir ilim ile kuşandırılmadan önce, diğer can tayfası ile yeryüzündeydi. Sonra bir anda Allah tarafından göğe açılan bir yol ile arşa çıktı, cennette kürsü emanet edildi, yeryüzündeki azgın kan dökücü Can Tayfasına hükmetme ve onları yok etme iradesi ona verildi. Görevini tamamlayıp, Azazil olarak cennete girdi ve meleklere hocalık etti, ilminin üstüne ilim, sözünün üstüne söz yoktu, ta ki Allah’ın halifesi olarak yarattığı Hz Adem’i görene kadar. Hayretini ilimle, gayretini aşkla besler insan.”</w:t>
+        <w:t>Aklım acayip karışmıştı… Hâlâ karışık! Yazdım ama ses kaydında söyleneni aktarıyorum, aktarırken kendimi bir daktilo gibi hissediyorum. Çünkü yazan ben değilim, söyleyen Muhibbi Amca değil. Söyleten de yazdıran da Allah deyip, işin içinden çıkıyorum. İşte bu yüzden bilinmek istenen bizi aklımızla sınırlamamış, bir de aşk vermiş. Niye mi aşk? Şöyle devam etmişti Muhibbi Amca sözlerine;</w:t>
+      </w:r>
+    </w:p>
+    <w:p>
+      <w:r>
+        <w:t>“Hayrette gayret gösteriyoruz, bu gayretin yakıtı ne peki? Ferhat’ın dağları delen o motivasyonu, mecaz bir aşk da olsa, Şirin için dağları deldirmedi mi? Aşkın mecazı yani beşere bile dağları deldiriyorsa, Allah aşkı olana ne yaptırmaz bir düşünsene. Aşksız ilim, ilim sahibini ancak kibre götürür, bak Şeytan’a! Müthiş bir ilim ile kuşandırılmadan önce, diğer can tayfası ile yeryüzündeydi. Sonra bir anda Allah tarafından göğe açılan bir yol ile arşa çıktı, cennette kürsü emanet edildi, yeryüzündeki azgın kan dökücü can tayfasına hükmetme ve onları yok etme iradesi ona verildi. Görevini tamamlayıp, Azazil olarak cennete girdi ve meleklere hocalık etti, ilminin üstüne ilim, sözünün üstüne söz yoktu, ta ki Allah’ın halifesi olarak yarattığı Hz. Âdem’i görene kadar. Hayretini ilimle, gayretini aşkla besler insan.”</w:t>
       </w:r>
     </w:p>
     <w:p>
@@ -5186,7 +5186,7 @@
     </w:p>
     <w:p>
       <w:r>
-        <w:t>Az önce Hakan Hoca'ya bu kadar öfkeliyken, şimdi içimde ona karşı bir borçluluk hissi doğmaya başlamıştı. O tüm bunlara vesile olmasaydı ben ne Muhibbi Amca'yla tanışacaktım ne de bir delinin yazdığı söylenen hikâyelerine.</w:t>
+        <w:t>Az önce Hakan Hoca'ya bu kadar öfkeliyken, şimdi içimde ona karşı bir borçluluk hissi doğmaya başlamıştı. O tüm bunlara vesile olmasaydı ben ne Muhibbi Amca'yla tanışacaktım ne de bir delinin yazdığı söylenen hikâyelerine ulaşacaktım.</w:t>
       </w:r>
     </w:p>
     <w:p>
@@ -5201,7 +5201,7 @@
     </w:p>
     <w:p>
       <w:r>
-        <w:t>“Bir kısım Hristiyan vaftiz ayini düzenlerler, özellikle yeni doğan bebekleri için, bir kısmı da yetişkinken yaparlar bunu, çünkü inançlarına göre dünyaya yani bu aleme geliş bir günahtır. Ancak bizim dinimize göre, insan günahsız saf bir ruhla dünyaya gelir, idraki ile birlikte amel defterine sevap ve günahları yazılır. Tabi en doğrusunu Allah bilir ama akıl baliğ olan insanın ilk işlediği kasti günahların başında bir kelime gelir, o kelimeyi sarf eden insan, imandan çıkmanın ilk minik adımı bu şekilde atmaya başlar.”</w:t>
+        <w:t>“Bir kısım Hristiyan vaftiz ayini düzenlerler, özellikle yeni doğan bebekleri için, bir kısmı da yetişkinken yaparlar bunu, çünkü inançlarına göre insan, Âdem’den miras kalan bir günahla dünyaya gelir. Ancak bizim dinimize göre, insan günahsız saf bir ruhla dünyaya gelir, idraki ile birlikte amel defterine sevap ve günahları yazılır. Tabii en doğrusunu Allah bilir ama âkil bâliğ olan insanın ilk işlediği kasti günahların başında bir kelime gelir, o kelimeyi sarf eden insan, imandan çıkmanın ilk minik adımını bu şekilde atmaya başlar.”</w:t>
       </w:r>
     </w:p>
     <w:p>
@@ -5218,8 +5218,7 @@
         <w:rPr>
           <w:i/>
         </w:rPr>
-        <w:lastRenderedPageBreak/>
-        <w:t>gelmesi mümkün değil, e kimse ona bu imkânı da tanımış olamaz, aklını korumak için geldiğini söylerken ciddi miydi acaba”</w:t>
+        <w:t>gelmesi mümkün değil, e kimse ona bu imkânı da tanımış olamaz, aklını korumak için geldiğini söylerken ciddi miydi acaba?”</w:t>
       </w:r>
       <w:r>
         <w:t xml:space="preserve"> İşte neredeyse tam olarak aklımdan bunlar geçiyordu Muhibbi Amca'nın sözlerini duyarken. Tok sesi, naif bir tonla kadife kaplanıyor, nezaketine nezaket ekliyordu.</w:t>
@@ -5266,7 +5265,7 @@
         <w:t>if</w:t>
       </w:r>
       <w:r>
-        <w:t xml:space="preserve"> denilse anlayacağım, bir kuş yüzmeyi, bir balık da uçmayı keşfedebilir mi? Yaratılış, kendi merkezinde ve fıtratında güzeldir, bir insan insana hakaret ederken köpek diyor, köpek necisi hayvandır diye değil, köpeklik köpekte güzeldir çünkü. Şimdi ben soracağım sen cevaplayacaksın anlaştık mı?”</w:t>
+        <w:t xml:space="preserve"> denilse anlayacağım, bir kuş yüzmeyi, bir balık da uçmayı keşfedebilir mi? Yaratılış, kendi merkezinde ve fıtratında güzeldir, bir insan insana hakaret ederken köpek diyor, köpek necis hayvandır diye değil, köpeklik köpekte güzeldir çünkü. Şimdi ben soracağım sen cevaplayacaksın anlaştık mı?”</w:t>
       </w:r>
     </w:p>
     <w:p>
@@ -5292,7 +5291,7 @@
         <w:t xml:space="preserve">“Edebiyat mezunu musun veya yazmak için edebiyat mezunu olmak gerekli mi? Elbette değil, yazmayı seven insan yazmalı. Yazmayı bilen insan en çok yazmayı sevmeli, çünkü aşksız icra edilen meslek, </w:t>
       </w:r>
       <w:r>
-        <w:t>toprağa saplı kalmış, kurumuş ağaç gövdesi gibidir. Konuşsan anlarım ama sanat tayfası dahi sanatın neden icra etmesi gerektiğini bilmez.”</w:t>
+        <w:t>toprağa saplı kalmış, kurumuş ağaç gövdesi gibidir. Konuşsan anlarım ama sanat tayfası dahi sanatın neden icra edilmesi gerektiğini bilmez.”</w:t>
       </w:r>
     </w:p>
     <w:p>
@@ -5322,7 +5321,7 @@
         <w:spacing w:after="0"/>
       </w:pPr>
       <w:r>
-        <w:t>“Pek tabi, ben isterim ki sizi hep dinleyeyim…”</w:t>
+        <w:t>“Pek tabii, ben isterim ki sizi hep dinleyeyim…”</w:t>
       </w:r>
     </w:p>
     <w:p>
@@ -5370,7 +5369,7 @@
         <w:spacing w:after="0"/>
       </w:pPr>
       <w:r>
-        <w:t>“Sana yazar bir ademle, oduncuyu anlatayım sonra ben geçip dinleneyim.”</w:t>
+        <w:t>“Sana yazar bir âdemle, oduncuyu anlatayım sonra ben geçip dinleneyim.”</w:t>
       </w:r>
     </w:p>
     <w:p>
@@ -5451,14 +5450,13 @@
         <w:rPr>
           <w:color w:val="FF0000"/>
         </w:rPr>
-        <w:t xml:space="preserve"> Bu sadece kitaplardan okunarak başlamaz, hayatlarına da yansıması gereken meşakkatli, zorlu bir yolculuktur. İlim, öğrendikçe insanın iştahını açar, açtıkça açar. Öyle bir hal alır ki öğrenen zamanla aslında öğrendiğini değil hatırladığını hatırlamadan hatırlar. Hatırlamak, unutan için keyif vericidir, düşünsene unutmuşsun adını sanını, aslını astarını ve hatırlamaya başlamışsın, bu sana keyif vermez mi? İlmi öğrenmek, öğrendikçe hatırlamaya başlamak kime keyif veriyorsa, diğer insanlar o kişiye alim derler. En belirgin emaresi ise alimler henüz soru sorulmadan cevapları veren kişilerdir, sebebi nedir? Çünkü Allah için ilme tabi olan kimse Allah’ın yolundan şaşmayan, emir ve yasaklarına uyan kimselerdir. Çünkü alimlerin sultanı, tek, en büyük, sonsuz alemleri yaratan Allah’tır. Allah kulların soracakları soruları önceden bilen, cevaplarını bize Kur’an ve onun yolundan gidenlere de kitaplar yazdıran, El Bedi olan Allah’tır. İyi belle anlatacağım </w:t>
+        <w:t xml:space="preserve"> Bu sadece kitaplardan okunarak başlamaz, hayatlarına da yansıması gereken meşakkatli, zorlu bir yolculuktur. İlim, öğrendikçe insanın iştahını açar, açtıkça açar. Öyle bir hal alır ki öğrenen zamanla aslında öğrendiğini değil hatırladığını hatırlamadan hatırlar. Hatırlamak, unutan için keyif vericidir, düşünsene unutmuşsun adını sanını, aslını astarını ve hatırlamaya başlamışsın, bu sana keyif vermez mi? İlmi öğrenmek, öğrendikçe hatırlamaya başlamak kime keyif veriyorsa, diğer insanlar o kişiye alim derler. En belirgin emaresi ise alimler henüz soru sorulmadan cevapları veren kişilerdir, sebebi nedir? Çünkü Allah için ilme tabi olan kimse Allah’ın yolundan şaşmayan, emir ve yasaklarına uyan kimselerdir. Çünkü alimlerin sultanı, tek, en büyük, sonsuz alemleri yaratan Allah’tır. Allah kulların soracakları soruları önceden bilen, cevaplarını bize Kur’an ve onun yolundan gidenlere de kitaplar yazdıran, El Bedi olan Allah’tır. İyi belle anlatacağım hikâyeyi</w:t>
       </w:r>
       <w:proofErr w:type="gramStart"/>
       <w:r>
         <w:rPr>
           <w:color w:val="FF0000"/>
         </w:rPr>
-        <w:t>hikayeyi</w:t>
       </w:r>
       <w:proofErr w:type="gramEnd"/>
       <w:r>
@@ -5500,7 +5498,7 @@
         <w:rPr>
           <w:i/>
         </w:rPr>
-        <w:t>Kasım Ay’ının sonlarına doğru sıcaklık iyiden iyiye düşmüş, soğuk kendini hepten belli etmişti, hatta sabahları kalkmak, kuyudan su çekmek, ısıtmadan abdest almak güçleşmişti. Her yıl, uzak diyarlardan, sırtlarında çift baltası, enseleri, kolları, boyunları kalın, geneli genç oduncu kardeşlerim gelirdi buralara ama bu sene ne olduysa, sanki hepsine birden kıran girmiş, bir Allah’ın oduncusu değil evin önünden, yakınlarımda bulunan köye bile uğramamıştı hiçbiri, öyle olsa, sakalık yapan ve bana haftada bir içme suyu getiren Agâh Efendi sıkı sıkıya köye oduncu gelirse bana da gönder tembihimi tutardı. Gelmemişti demek kimsecikler, bir oduncuya kıyasla ellerim narindi, hat işlemek için de öyle olmak zorundaydılar, maazallah en küçük yaralanma, işleyeceğim ve Pazar yerinde satacağım hatlarımı yapamama sebep olurdu, bu eller benim ekmek teknemdi. Bir süre sonra, gökten yere düşen kar tanesi, yüreğime düşen bir ateş oldu adeta, gözlerimi açarak “Aman Allah’ım kar da geliyor, ben ne yapacağım” diye feryat ederken, sesime karışan bir ses işittim; “Oduncu, oduncu” Hey kurban olduğum Çalap gönderdi sana işte sıkıştığın anda Hızır’ını diyerek fırladım evden. Bir de ne göreyim, sırtındaki baltalardan başka hiçbir yeri ya da hiçbir şeyi oduncuya benzemeyen bir ihtiyar. Beni görünce dikeldi, bir daha söyledi;</w:t>
+        <w:t>Kasım ayının sonlarına doğru sıcaklık iyiden iyiye düşmüş, soğuk kendini hepten belli etmişti, hatta sabahları kalkmak, kuyudan su çekmek, ısıtmadan abdest almak güçleşmişti. Her yıl, uzak diyarlardan, sırtlarında çift baltası, enseleri, kolları, boyunları kalın, geneli genç oduncu kardeşlerim gelirdi buralara ama bu sene ne olduysa, sanki hepsine birden kıran girmiş, bir Allah’ın oduncusu değil evin önünden, yakınlarımda bulunan köye bile uğramamıştı hiçbiri, öyle olsa, sakalık yapan ve bana haftada bir içme suyu getiren Agâh Efendi sıkı sıkıya köye oduncu gelirse bana da gönder tembihimi tutardı. Gelmemişti demek kimsecikler, bir oduncuya kıyasla ellerim narindi, hat işlemek için de öyle olmak zorundaydılar, maazallah en küçük yaralanma, işleyeceğim ve pazar yerinde satacağım hatlarımı yapamama sebep olurdu, bu eller benim ekmek teknemdi. Bir süre sonra, gökten yere düşen kar tanesi, yüreğime düşen bir ateş oldu adeta, gözlerimi açarak “Aman Allah’ım kar da geliyor, ben ne yapacağım” diye feryat ederken, sesime karışan bir ses işittim; “Oduncu, oduncu” Hey kurban olduğum Çalap gönderdi sana işte sıkıştığın anda Hızır’ını diyerek fırladım evden. Bir de ne göreyim, sırtındaki baltalardan başka hiçbir yeri ya da hiçbir şeyi oduncuya benzemeyen bir ihtiyar. Beni görünce dikeldi, bir daha söyledi;</w:t>
       </w:r>
     </w:p>
     <w:p>
@@ -5524,7 +5522,7 @@
         <w:rPr>
           <w:i/>
         </w:rPr>
-        <w:t>Sağ omuzunun üstünden, sırtında duran çapraz bağladığı baltaları gözüyle işaret ederek,</w:t>
+        <w:t>Sağ omzunun üstünden, sırtında duran çapraz bağladığı baltaları gözüyle işaret ederek,</w:t>
       </w:r>
     </w:p>
     <w:p>
@@ -5740,7 +5738,7 @@
         <w:rPr>
           <w:i/>
         </w:rPr>
-        <w:t>– Sen cömert bir gençsin, ben 60 senendir yaparım bu işi, 60 senelik bir sırrı benden isterken, bunun bir bedeli olmasın mı?</w:t>
+        <w:t>– Sen cömert bir gençsin, ben 60 senedir yaparım bu işi, 60 senelik bir sırrı benden isterken, bunun bir bedeli olmasın mı?</w:t>
       </w:r>
     </w:p>
     <w:p>
@@ -5796,7 +5794,7 @@
         <w:rPr>
           <w:i/>
         </w:rPr>
-        <w:t>– Ya demek görmedin, oğlum B’de mi görmedin?</w:t>
+        <w:t>– Ya demek görmedin, oğlum B de mi görmedin?</w:t>
       </w:r>
     </w:p>
     <w:p>
@@ -5876,13 +5874,13 @@
         <w:rPr>
           <w:i/>
         </w:rPr>
-        <w:t xml:space="preserve">– Rahmetlik anam nefesini terbiye eden ademin ömrü uzun olur, ömür dediğin ne bir nefes eksiktir ne de fazla; az nefes demek çok ömür yaşamak demekti anama göre. Babam erkenden uçmağa göçtü, baban gibi oduncu mu olacaksın bak uçmakta şimdi, sen de abin gibi tezhip yap oğul dedi. Ama ben neredeyse gün aşırı odun kırıyordum hayallerimde, hattat rahlelerinde, na şu koca ellerimde divitler kayboluyordu, terleyen ellerimde solucan gibi kıvranıyordu divitim. Bir gün hocam anamı görsün meydanda, hemşire senin büyük oğlan mahir ama küçük başka bir meslek seçse, kuşa yüzmeyi öğretemeyiz demiş. Anam geldi, kaşları da omuzları da düşmüş durumu izah etmeye çalışıyor. Benim üzülmemem için terler döküyordu, bağrı başlı gözü yaşlı anam. Dedim ana isabet olmuş, bana verilmeyen meziyet nefsime zulüm, sal beni, ben odun kırmak isterim, babamdan gördüğüm gibi. Desturu verince anam, babamdan kalma baltaları çıkarttım, biledim ki sorma gitsin, berber usturası gibi. İki sene, yüzünü, suyunu, huyunu bildiğim odunlarla, </w:t>
+        <w:t xml:space="preserve">– Rahmetlik anam nefesini terbiye eden âdemin ömrü uzun olur, ömür dediğin ne bir nefes eksiktir ne de fazla; az nefes demek çok ömür yaşamak demekti anama göre. Babam erkenden uçmağa göçtü, baban gibi oduncu mu olacaksın bak uçmakta şimdi, sen de abin gibi tezhip yap oğul dedi. Ama ben neredeyse gün aşırı odun kırıyordum hayallerimde, hattat rahlelerinde, na şu koca ellerimde divitler kayboluyordu, terleyen ellerimde solucan gibi kıvranıyordu divitim. Bir gün hocam anamı görsün meydanda, hemşire senin büyük oğlan mahir ama küçük başka bir meslek seçse, kuşa yüzmeyi öğretemeyiz demiş. Anam geldi, kaşları da omuzları da düşmüş durumu izah etmeye çalışıyor. Benim üzülmemem için terler döküyordu, bağrı başlı gözü yaşlı anam. Dedim ana isabet olmuş, bana verilmeyen meziyet nefsime zulüm, sal beni, ben odun kırmak isterim, babamdan gördüğüm gibi. Desturu verince anam, babamdan kalma baltaları çıkarttım, biledim ki sorma gitsin, berber usturası gibi. İki sene, yüzünü, suyunu, huyunu bildiğim odunlarla, </w:t>
       </w:r>
       <w:r>
         <w:rPr>
           <w:i/>
         </w:rPr>
-        <w:t>baltalarımla kavga ettim. Odun kesmek de olsa bir ilmi vardı ve ilim zahmet isterdi. Kıymıklar elimi ısırdı, baltalar odun mu kırdı, beni mi dövdü bilemedim. Madem beni sevmeyecektin, bana neden kendini sevdirdin diye uyuyup kalmışım. Babamın sesi kulaklarımda yattığım döşekten fırladım. Onlarla konuş oğul, baltanla, odunla konuş. Kırana da kırılacak olana da rica et, birazı tembih, birazı rica, birazı sert, birazı yumuşak olsun ama sözlerinin. O gün kalktım, abdestimi aldım, sonra baltamı da elime, başladım konuşmaya, sonra kıracağım odunlarla da konuştum.</w:t>
+        <w:t>baltalarımla kavga ettim. Odun kesmek de olsa bir ilmi vardı ve ilim zahmet isterdi. Kıymıklar elimi ısırdı, baltalar odun mu kırdı, beni mi dövdü bilemedim. Madem beni sevmeyecektin, bana neden kendini sevdirdin diye uyuyup kalmışım. Babamın sesi kulaklarımda, yattığım döşekten fırladım. Onlarla konuş oğul, baltanla, odunla konuş. Kırana da kırılacak olana da rica et, birazı tembih, birazı rica, birazı sert, birazı yumuşak olsun ama sözlerinin. O gün kalktım, abdestimi aldım, sonra baltamı da elime, başladım konuşmaya, sonra kıracağım odunlarla da konuştum.</w:t>
       </w:r>
     </w:p>
     <w:p>
@@ -5914,7 +5912,7 @@
         <w:rPr>
           <w:i/>
         </w:rPr>
-        <w:t>– Aşk ile evlat, aşk ile… Bak neyi görüyorsan, duyuyorsan, kokluyorsan aşk. Aşk ile yürüyen yorulmaz. Hayallerine soktuğun rüyalarına giriyorsa, o senin aşkındır. O yüzden sana bırak dedim ya da bir an evvel hayallerine dahil et yazmayı, çünkü hayal etmediğin meslek rüyana, rüyana girmeyen meslek celladına boyun bükmektir. Balta kesmeye, odun yanmaya, insan aşkı icra etmeye gelmiş bu aleme, ceylan çimene, çimen toprağa, yağmura, güneşe meftun fıtratı gereği ve dahi her zerre… Ben olmasam odun kırmaya aşık, sen üşüyecektin belki de sen olmasaydın yazmaya aşık senden okuyan bir eksik olacaktı. Eksilmeye değil, tamamlamaya geldik, neyi? Aşkı! Ne zamana kadar yarımız, aşkı bulana kadar. Hay’dan gelip Hû’ya gideriz. Bunca çeşit, bunca nebatat, hayvanat, kâinat hangi hangisi eksik, yırtık, delik? Hepsi hizmetini aşkla görür, aşka nankör olma, olursan bir eksiğiz olmazsan tamamız. Solucan da olsan, papatya da balta da olsan odun da her şey tastamam, aşk ile tamam ol, âşık olmadığın iş ile eyleme gönlünü, burası eyleme değil, eleme dünyası ve tek amaç aşk ile tamam olana dahil olmak.</w:t>
+        <w:t>– Aşk ile evlat, aşk ile… Bak neyi görüyorsan, duyuyorsan, kokluyorsan aşk. Aşk ile yürüyen yorulmaz. Hayallerine soktuğun rüyalarına giriyorsa, o senin aşkındır. O yüzden sana bırak dedim ya da bir an evvel hayallerine dahil et yazmayı, çünkü hayal etmediğin meslek rüyana, rüyana girmeyen meslek celladına boyun bükmektir. Balta kesmeye, odun yanmaya, insan aşkı icra etmeye gelmiş bu aleme, ceylan çimene, çimen toprağa, yağmura, güneşe meftun fıtratı gereği ve dahi her zerre… Ben olmasam odun kırmaya âşık, sen üşüyecektin belki de sen olmasaydın yazmaya âşık senden okuyan bir eksik olacaktı. Eksilmeye değil, tamamlamaya geldik, neyi? Aşkı! Ne zamana kadar yarımız, aşkı bulana kadar. Hay’dan gelip Hû’ya gideriz. Bunca çeşit, bunca nebatat, hayvanat, kâinat hangi hangisi eksik, yırtık, delik? Hepsi hizmetini aşkla görür, aşka nankör olma, olursan bir eksiğiz olmazsan tamamız. Solucan da olsan, papatya da balta da olsan odun da her şey tastamam, aşk ile tamam ol, âşık olmadığın iş ile eyleme gönlünü, burası eyleme değil, eleme dünyası ve tek amaç aşk ile tamam olana dahil olmak.</w:t>
       </w:r>
     </w:p>
     <w:p>
@@ -5956,7 +5954,7 @@
     </w:p>
     <w:p>
       <w:r>
-        <w:t>“Yani kalem işçisi Mustafa Sefa, rüyanda elifi gördün mü B gördün mü deseydim anlamazdın diyeceklerimi. Yazıyorsan bu fıtratla yaratıldığın için yazacaksın, okunmak için değil. Nasibin varsa yazarsın, nasipleri varsa okurlar. Kalem ehli olmak zordur ama yazmaya aşık değilsen daha da zordur bilesin, ayrıca sanat niçin yapılır demiştim ya hani, bak daha onun istişaresini yapacağız ama şimdi bu ihtiyara müsaade, haydi iyi istirahatler.”</w:t>
+        <w:t>“Yani kalem işçisi Mustafa Sefa, rüyanda elifi gördün mü B gördün mü deseydim anlamazdın diyeceklerimi. Yazıyorsan bu fıtratla yaratıldığın için yazacaksın, okunmak için değil. Nasibin varsa yazarsın, nasipleri varsa okurlar. Kalem ehli olmak zordur ama yazmaya âşık değilsen daha da zordur bilesin, ayrıca sanat niçin yapılır demiştim ya hani, bak daha onun istişaresini yapacağız ama şimdi bu ihtiyara müsaade, haydi iyi istirahatler.”</w:t>
       </w:r>
     </w:p>
     <w:p>
@@ -5976,7 +5974,7 @@
     </w:p>
     <w:p>
       <w:r>
-        <w:t xml:space="preserve">Allah, Allah; Ne yaşıyorum ben burada şu son iki gündür? Ya da şöyle mi yazmalıyım ne yaşatılıyor bana iki gündür? Muhibbi Amca devlet için çalışan ve o mektupları bana gönderen kişi olabilir miydi yahu? Yok ya ne alaka? Ne alaka diyorum ama söylemleri bir şeylerle örtüşüyor gibi de… Sanki gelen mektupların dilinden, Hakan Hoca'nın söylemlerinden, çevremde daralan ama daraldıkça göğsümde genişlik veren bir hissiyat da var. Bana tahsis edilen oda çok ferahtı ama oraya tıkılmak, tüm merakıma rağmen </w:t>
+        <w:t xml:space="preserve">Allah, Allah; ne yaşıyorum ben burada şu son iki gündür? Ya da şöyle mi yazmalıyım ne yaşatılıyor bana iki gündür? Muhibbi Amca devlet için çalışan ve o mektupları bana gönderen kişi olabilir miydi yahu? Yok ya ne alaka? Ne alaka diyorum ama söylemleri bir şeylerle örtüşüyor gibi de… Sanki gelen mektupların dilinden, Hakan Hoca'nın söylemlerinden, çevremde daralan ama daraldıkça göğsümde genişlik veren bir hissiyat da var. Bana tahsis edilen oda çok ferahtı ama oraya tıkılmak, tüm merakıma rağmen </w:t>
       </w:r>
       <w:r>
         <w:t>mektupların arasında kaybolmak gelmiyordu içimden. Bana bir değil bin yıllık bilgiler verilmişti sanki ve benim kafam hiçbir şey almayacaktı, bugünlük paydos dedim ve eve geçtim. Yemeğimizi, annemle sinema keyfi seansımızı, filmin finalinde anama filmi baştan sonra Türkçeden Türkçeye tercüme etme işini bitirdim. Yorgundum, son birkaç gündür yaşadıklarım, kulaklarımda bir çınlamanın peyda olmasına sebep olmuştu, çok gürültülü bir diskodan çıkıp, aniden sessiz bir odaya geçen bir adamın beyin uğultusuydu bu. Miskinleşip, oturduğum üçlü kanepeye uzanınca, annem ikaz etti;</w:t>
@@ -6016,7 +6014,7 @@
       <w:r/>
       <w:r/>
       <w:r>
-        <w:t>Sabah gözlerimi yatağımda açtığımda, yataktan çıkma isteğim yoktu. Annem gece uyurken yastığıma gül kokusu dökmüştü sanırım, uyandığımda aldığım ilk koku buydu. Konuşmak, hatta düşünmek gibi bir isteğim de yoktu. İçimdeki tüm motivasyon çökmüş, hani değil bir profesör, cumhurbaşkanı gelse umurumda olmayacaktı. Biriken mesajları okumadan silerek telefonumun hafızasında yer açmaya çalışıyordum, sonra bir değeri olmayan fotolar, videolar derken sabah ezanını duydum, yataktan çıktım, namazımı niyaz ettim. Namaz esnasında telefonuma mesaj geldiğini duydum, kimse bu saatlerde yazmazdı, belki Suat Beşkardeş abimdir diyerek, selam verdikten sonra, son zamanlarda sıkça yaptığımın aksine, telefonu elime alıp, gelen mesaja kilit ekranın üstünden baktım. “Allah kabul etsin evlat” yazdığını görünce, kilit ekranı açıp, mesajın tamamına baktım.</w:t>
+        <w:t>Sabah gözlerimi yatağımda açtığımda, yataktan çıkma isteğim yoktu. Annem gece uyurken yastığıma gül kokusu dökmüştü sanırım, uyandığımda aldığım ilk koku buydu. Konuşmak, hatta düşünmek gibi bir isteğim de yoktu. İçimdeki tüm motivasyon çökmüş, hani değil bir profesör, cumhurbaşkanı gelse umurumda olmayacaktı. Biriken mesajları okumadan silerek telefonumun hafızasında yer açmaya çalışıyordum, sonra bir değeri olmayan fotolar, videolar derken sabah ezanını duydum, yataktan çıktım, namazımı eda ettim. Namaz esnasında telefonuma mesaj geldiğini duydum, kimse bu saatlerde yazmazdı, belki Suat Beşkardeş abimdir diyerek, selam verdikten sonra, son zamanlarda sıkça yaptığımın aksine, telefonu elime alıp, gelen mesaja kilit ekranın üstünden baktım. “Allah kabul etsin evlat” yazdığını görünce, kilit ekranı açıp, mesajın tamamına baktım.</w:t>
       </w:r>
     </w:p>
     <w:p>
@@ -6031,15 +6029,15 @@
     </w:p>
     <w:p>
       <w:r>
-        <w:t xml:space="preserve">“Hocam gerek yok x ray cihazına girmenize, böyle buyurun” dedi güvenlikçi. Teşekkür ettim güvenlikçiye, içimden de Hakan Hoca'ya, sevmiyordum ben bu üst tarama, arama işlerini. Sabah namazından hemen sonra, nasılsa çok vaktim var diyerek odama geçmeye karar verdim, hastanede vardiya değişimi vardı, mesaini bitirenlerle, mesaiye yeni başlayanlar bir aradaydı ve neredeyse doktorundan hemşiresine gören herkes selam verdi. Bunlara benim kim olduğumu anlatmıştı bu Hakan Hoca bilmiyorum ama artık benimle ilgili değildi konu, </w:t>
-      </w:r>
-      <w:r>
-        <w:t>tamamen onun egoları ile alakalıydı sanırım, artık zerre umurumda değildi. Koridoru bitirip, nihayetinde odamdan içeri girdiğimde, içerisi mis gibi gül kokuyordu, oda yeteri kadar aydınlık olmadığı için ışıkları açtım, dışarıdan sızan saydam yeşil rengin yerini sıcak sarı tonları aldı. Yastıktan yüzüme gözüme mi bulaşmıştı bu koku? Önce kaba taslak oda genelini taradım gözlerimle, kokunun kaynağını bulmam gerekiyordu. Pencereler kapalıydı, masa üstlerinde gül demeti yoktu, kağıtlar masanın üzerinde dün bıraktığım gibi yığınlar halinde duruyorlardı. Anlaşıldı bu koku benden geliyordu ve açık havada almamıştı burnum kokuyu derken… Masa bana tahsis edilmişti ama çekmecelerine hiç bakmamıştım, doğal bir refleksle çekmeceleri açtım, sol yanda üçlü çekmecelerden ortada olanını açtım, gül kokusu anında ortamı doldurdu, onca kâğıt tomarı içinden seçilmiş, ayrı bir çekmeceye koyulmuş, üç yaprak öylece duruyordu. Biri ya da birileri bu kağıtları gül kokusunda bulayıp, ayrıca çekmeceye koymuştu. Ki bu Hakan Hoca'dan başkası değildi. Bunu neden yaptığını, hangi mantıkla hareket ettiğini çözmeye çalışmak mı, umurumda değildi. Sırf millete, devlete hizmet etmek, hatta Muhibbi Amca ile yaptığımız sohbetler bile benim böyle bir işe girmeme yeterli sebepti. He delinin satır aralarında neyi yazdığı, kimi yazdığı, ne için yazdığı da cabasıydı. Kim yolcuymuş kim şahitmiş, bunlar ne yapmışlar, niye yapmışlar, hepsi ikinci planımda kalmışlardı. Kalmışlardı diyordum, çünkü henüz hiçbir şey bilmiyordum!</w:t>
-      </w:r>
-    </w:p>
-    <w:p>
-      <w:r>
-        <w:t>Kağıtları çıkarttım, gül kokusunu duyan bir adamın yaptığını yapıp, burnuma yaklaştırdım, derin bir nefes çekip kokladım.</w:t>
+        <w:t xml:space="preserve">“Hocam gerek yok x ray cihazına girmenize, böyle buyurun” dedi güvenlikçi. Teşekkür ettim güvenlikçiye, içimden de Hakan Hoca'ya, sevmiyordum ben bu üst tarama, arama işlerini. Sabah namazından hemen sonra, nasılsa çok vaktim var diyerek odama geçmeye karar verdim, hastanede vardiya değişimi vardı, mesaisini bitirenlerle, mesaiye yeni başlayanlar bir aradaydı ve neredeyse doktorundan hemşiresine gören herkes selam verdi. Bunlara benim kim olduğumu anlatmıştı bu Hakan Hoca bilmiyorum ama artık benimle ilgili değildi konu, </w:t>
+      </w:r>
+      <w:r>
+        <w:t>tamamen onun egoları ile alakalıydı sanırım, artık zerre umurumda değildi. Koridoru bitirip, nihayetinde odamdan içeri girdiğimde, içerisi mis gibi gül kokuyordu, oda yeteri kadar aydınlık olmadığı için ışıkları açtım, dışarıdan sızan saydam yeşil rengin yerini sıcak sarı tonları aldı. Yastıktan yüzüme gözüme mi bulaşmıştı bu koku? Önce kaba taslak oda genelini taradım gözlerimle, kokunun kaynağını bulmam gerekiyordu. Pencereler kapalıydı, masa üstlerinde gül demeti yoktu, kâğıtlar masanın üzerinde dün bıraktığım gibi yığınlar halinde duruyorlardı. Anlaşıldı bu koku benden geliyordu ve açık havada almamıştı burnum kokuyu derken… Masa bana tahsis edilmişti ama çekmecelerine hiç bakmamıştım, doğal bir refleksle çekmeceleri açtım, sol yanda üçlü çekmecelerden ortada olanını açtım, gül kokusu anında ortamı doldurdu, onca kâğıt tomarı içinden seçilmiş, ayrı bir çekmeceye koyulmuş, üç yaprak öylece duruyordu. Biri ya da birileri bu kâğıtları gül kokusuna bulayıp, ayrıca çekmeceye koymuştu. Ki bu Hakan Hoca'dan başkası değildi. Bunu neden yaptığını, hangi mantıkla hareket ettiğini çözmeye çalışmak mı, umurumda değildi. Sırf millete, devlete hizmet etmek, hatta Muhibbi Amca ile yaptığımız sohbetler bile benim böyle bir işe girmeme yeterli sebepti. He delinin satır aralarında neyi yazdığı, kimi yazdığı, ne için yazdığı da cabasıydı. Kim yolcuymuş kim şahitmiş, bunlar ne yapmışlar, niye yapmışlar, hepsi ikinci planımda kalmışlardı. Kalmışlardı diyordum, çünkü henüz hiçbir şey bilmiyordum!</w:t>
+      </w:r>
+    </w:p>
+    <w:p>
+      <w:r>
+        <w:t>Kâğıtları çıkarttım, gül kokusunu duyan bir adamın yaptığını yapıp, burnuma yaklaştırdım, derin bir nefes çekip kokladım.</w:t>
       </w:r>
     </w:p>
     <w:p>
@@ -6083,12 +6081,12 @@
         <w:rPr>
           <w:i/>
         </w:rPr>
-        <w:t>Bir süre aklından çıkmamıştım senin, hatta ilk romanında benden bahsetmiştin, bu benim açımdan acayip onur vericiydi. Ancak o romanındaki bir karakter isminden, değişik bir kaderle geçiştirivermiştin beni romanına. Bunun için asla kızmadım sana, çünkü benimle ilgili haberleri uzunca bir süre alamayınca, sonumun ne olduğu, nasıl olduğunu bilemedin ve beni öylece geçiştiriverdin birkaç satırla. Senin şu yazacağımı defalarca duyduğunu ve bundan nefret ettiğini çok iyi bilsem de yazacağım; benim sonumun nasıl olduğunu bilsen, beni birkaç satırla geçiştirmez, hatta hayat hikayemi kaleme alırdın. Biliyorum sen “Hayatımı yazsan roman olur” cümlesinden nefret edersin ama hak vereceksin bana.</w:t>
-      </w:r>
-    </w:p>
-    <w:p>
-      <w:r>
-        <w:t>Kimdi bana bunları yazan o kadar çok meraklanmıştım ki… Hem benim hayatımı yazsan roman olur esprisinden nefret ettiğimi bilecek kadar yakından tanıyacak hem de ben onu birkaç satırla, herhangi bir karakter olarak yazacağım, bu mümkün değildi. Üstelik roman karakterlerin çoğu uydurma, esinlenme… Okuma hızımı arttırarak devam ettim mektubu okumaya.</w:t>
+        <w:t>Bir süre aklından çıkmamıştım senin, hatta ilk romanında benden bahsetmiştin, bu benim açımdan acayip onur vericiydi. Ancak o romanındaki bir karakter isminden, değişik bir kaderle geçiştirivermiştin beni romanına. Bunun için asla kızmadım sana, çünkü benimle ilgili haberleri uzunca bir süre alamayınca, sonumun ne olduğu, nasıl olduğunu bilemedin ve beni öylece geçiştiriverdin birkaç satırla. Senin şu yazacağımı defalarca duyduğunu ve bundan nefret ettiğini çok iyi bilsem de yazacağım; benim sonumun nasıl olduğunu bilsen, beni birkaç satırla geçiştirmez, hatta hayat hikâyemi kaleme alırdın. Biliyorum sen “Hayatımı yazsan roman olur” cümlesinden nefret edersin ama hak vereceksin bana.</w:t>
+      </w:r>
+    </w:p>
+    <w:p>
+      <w:r>
+        <w:t>Kimdi bana bunları yazan o kadar çok meraklanmıştım ki… Hem benim hayatımı yazsan roman olur esprisinden nefret ettiğimi bilecek kadar yakından tanıyacak hem de ben onu birkaç satırla, herhangi bir karakter olarak yazacağım, bu mümkün değildi. Üstelik roman karakterlerinin çoğu uydurma, esinlenme… Okuma hızımı artırarak devam ettim mektubu okumaya.</w:t>
       </w:r>
     </w:p>
     <w:p>
@@ -6096,7 +6094,7 @@
         <w:rPr>
           <w:i/>
         </w:rPr>
-        <w:t>Şimdi yazacaklarımdan sonra beni anımsayacaksın ama mesele beni anımsaman değil, senin yarım kalmışlığın ya da bütün mutlulukları yarım yaşaman... Bunun sebebini ikimizde biliyoruz ve sen bunları bir gün yazmak zorunda kalsan bile, biliyorum ki sebebini yazmayacaksın, ondan dolayı buraya bununla ilgili, yani senin yarım kalmanla ilgili tek bir satır yazmayacağım, yine biliyorum ki senin en gülümseyen sosyal medya paylaşımlarındaki fotoğraflarında bile, bakıp da görebilen her göze yetecek miktarda hüznün hep olacak bakışlarında.</w:t>
+        <w:t>Şimdi yazacaklarımdan sonra beni anımsayacaksın ama mesele beni anımsaman değil, senin yarım kalmışlığın ya da bütün mutlulukları yarım yaşaman... Bunun sebebini ikimiz de biliyoruz ve sen bunları bir gün yazmak zorunda kalsan bile, biliyorum ki sebebini yazmayacaksın, ondan dolayı buraya bununla ilgili, yani senin yarım kalmanla ilgili tek bir satır yazmayacağım, yine biliyorum ki senin en gülümseyen sosyal medya paylaşımlarındaki fotoğraflarında bile, bakıp da görebilen her göze yetecek miktarda hüznün hep olacak bakışlarında.</w:t>
       </w:r>
     </w:p>
     <w:p>
@@ -6110,7 +6108,7 @@
         <w:rPr>
           <w:i/>
         </w:rPr>
-        <w:t>tüm gülümsemeleri. Bunları nereden mi biliyorum eski ama eskimeyen dostum, emin ol ben iki şeyi nerede görürsem göreyim tanırım, nereden bakarsam bakayım görürüm; biri aşk, diğeri hüzün. Senin bir gözün diğerine nispet edermişçesine aşkla, diğeri hüzünle bakıyor. Tamam lafı çok uzattım biliyorum ama hüzün aşktan beslenir, aşk hüzünden. İkisi de birbirini tamamlamak uğruna, birbirlerini yarım bırakırlar dedim ve bu bahsi burada sonsuza kadar kapadım. Konuyu senin kadar yarımlar, bir de o yarımı tamamlayan ben gibiler bilirler. İşte konumuzda tam olarak bu; yarımı tamamlamak…</w:t>
+        <w:t>tüm gülümsemeleri. Bunları nereden mi biliyorum eski ama eskimeyen dostum, emin ol ben iki şeyi nerede görürsem göreyim tanırım, nereden bakarsam bakayım görürüm; biri aşk, diğeri hüzün. Senin bir gözün diğerine nispet edermişçesine aşkla, diğeri hüzünle bakıyor. Tamam lafı çok uzattım biliyorum ama hüzün aşktan beslenir, aşk hüzünden. İkisi de birbirini tamamlamak uğruna, birbirlerini yarım bırakırlar dedim ve bu bahsi burada sonsuza kadar kapadım. Konuyu senin kadar yarımlar, bir de o yarımı tamamlayan ben gibiler bilirler. İşte konumuz da tam olarak bu; yarımı tamamlamak…</w:t>
       </w:r>
     </w:p>
     <w:p>
@@ -6123,7 +6121,7 @@
         <w:rPr>
           <w:i/>
         </w:rPr>
-        <w:t>Bunu seninle içtiğim çorbalar hatırına değil, o çorbaları ısmarlamak için Allah’ın tebessümüne vesile olmak gayretine istinaden yapıyorum. Kimse iyi ya da kötü değildir, iyi olan sadece Allah’tır, kullar ise kötülüğün tarafına direnen ve diremeyenler olarak ayrılabilirler. Kim neyin sahip ki vesilesi olduklarının sahibi olsun?</w:t>
+        <w:t>Bunu seninle içtiğim çorbalar hatırına değil, o çorbaları ısmarlamak için Allah’ın tebessümüne vesile olmak gayretine istinaden yapıyorum. Kimse iyi ya da kötü değildir, iyi olan sadece Allah’tır, kullar ise kötülüğün tarafına direnen ve direnemeyenler olarak ayrılabilirler. Kim neyin sahibi ki vesilesi olduklarının sahibi olsun?</w:t>
       </w:r>
     </w:p>
     <w:p>
@@ -6155,7 +6153,7 @@
     </w:p>
     <w:p>
       <w:r>
-        <w:t>Gerçekten de bir Hodri vardı, bazen Fikirtepe Mahallesi Onikiler caminde kılardım ben vakit veya Cuma namazlarını. Günlerden bir gündü işte, caminin altındaki çay ocağında namaz sonrası çay içip, sofu bir abimiz ile sohbet ederken, bir bankın üstünde kıvrılmış uyurken görmüştüm ben Hodri’yi. Doğrulup, ayağa kalkmış, titreyerek yanımıza gelmiş, hiç sormadan masamıza oturmuştu.</w:t>
+        <w:t>Gerçekten de bir Hodri vardı, bazen Fikirtepe Mahallesi Onikiler camisinde kılardım ben vakit veya cuma namazlarını. Günlerden bir gündü işte, caminin altındaki çay ocağında namaz sonrası çay içip, sofu bir abimiz ile sohbet ederken, bir bankın üstünde kıvrılmış uyurken görmüştüm ben Hodri’yi. Doğrulup, ayağa kalkmış, titreyerek yanımıza gelmiş, hiç sormadan masamıza oturmuştu.</w:t>
       </w:r>
     </w:p>
     <w:p>
@@ -6174,7 +6172,7 @@
         <w:t>Şimdi bizi keser bu adam</w:t>
       </w:r>
       <w:r>
-        <w:t xml:space="preserve"> demiştim içimden ama tüm bu önyargılarıma rağmen, kendinden beklemediğim bir kibarlıkla “Lütfen” demişti. Çayı söyledim, geldi, başka tanımadığım hiç kimse gibi hızla çayı içti, sanki ağzının içi etten değil, tenekedendi, sigara istedi verdim. “Aç mısın” dedim? Eminim ki sorumu duydu ama sanki duymamış gibi üzerine uçuşan sigara küllerini fiskeledi. Açtı ve bunu söylemeye utanıyordu belki de…</w:t>
+        <w:t xml:space="preserve"> demiştim içimden ama tüm bu önyargılarıma rağmen, kendinden beklemediğim bir kibarlıkla “Lütfen” demişti. Çayı söyledim, geldi, başka tanımadığım hiç kimse gibi hızla çayı içti, sanki ağzının içi etten değil, tenekedendi, sigara istedi verdim. “Aç mısın?” dedim. Eminim ki sorumu duydu ama sanki duymamış gibi üzerine uçuşan sigara küllerini fiskeledi. Açtı ve bunu söylemeye utanıyordu belki de…</w:t>
       </w:r>
     </w:p>
     <w:p>
@@ -6194,7 +6192,7 @@
     </w:p>
     <w:p>
       <w:r>
-        <w:t>“Hodri sevmez benim tostları, sen yandaki çıkmaz sokağa git çorba ısmarla ona kardeş” kafamı Hodri ’ye çevirip “hadi kalkalım” diyecektim ki, caminin avlu kapısında yüzünü bana dönmüş, “Hadi çorba lütfen” dediğini duydum. Normalde kalkıp, hiç tanımadığı bir müptezelin peşine düşecek kadar canımı sokakta bulmadım ben ama niyeyse kalkıvermiş, kendimi onun peşinden gider halde bulmuştum.</w:t>
+        <w:t>“Hodri sevmez benim tostları, sen yandaki çıkmaz sokağa git çorba ısmarla ona kardeş” kafamı Hodri’ye çevirip “hadi kalkalım” diyecektim ki, caminin avlu kapısında yüzünü bana dönmüş, “Hadi çorba lütfen” dediğini duydum. Normalde kalkıp, hiç tanımadığım bir müptezelin peşine düşecek kadar canımı sokakta bulmadım ben ama niyeyse kalkıvermiş, kendimi onun peşinden gider halde bulmuştum.</w:t>
       </w:r>
       <w:r/>
     </w:p>
@@ -6230,7 +6228,7 @@
     </w:p>
     <w:p>
       <w:r>
-        <w:t>“Arkandaki masada kardeş, görmüyor musun” dedi. Gayri ihtiyari ardıma döndüğümde göremedim, ayağa kalktım ve oturan birkaç kişiye seslendim,</w:t>
+        <w:t>“Arkandaki masada kardeş, görmüyor musun” dedi. Gayriihtiyari ardıma döndüğümde göremedim, ayağa kalktım ve oturan birkaç kişiye seslendim,</w:t>
       </w:r>
     </w:p>
     <w:p>
@@ -6240,7 +6238,7 @@
     </w:p>
     <w:p>
       <w:r>
-        <w:t>Bütün kafalar bana dönse de o sert bakışlı müptezeli sanırım tanıdım, gerçi güçlükle de olsa tanıdım demek daha doğru olur. Üstü başı temiz, yüzü traşlı, kokusuz Hodri! Kalktım yanına gittim ve bu sefer izin almadan yanına oturan bendim.</w:t>
+        <w:t>Bütün kafalar bana dönse de o sert bakışlı müptezeli sanırım tanıdım, gerçi güçlükle de olsa tanıdım demek daha doğru olur. Üstü başı temiz, yüzü tıraşlı, kokusuz Hodri! Kalktım yanına gittim ve bu sefer izin almadan yanına oturan bendim.</w:t>
       </w:r>
     </w:p>
     <w:p>
@@ -6303,7 +6301,7 @@
         <w:rPr>
           <w:i/>
         </w:rPr>
-        <w:t>“Eğer benimle tanışmak istersen, Mandıra caddesindeki Gül Pastanesine gel</w:t>
+        <w:t>“Eğer benimle tanışmak istersen, Mandıra Caddesi’ndeki Gül Pastanesi’ne gel</w:t>
       </w:r>
       <w:r>
         <w:t>” diye. Bir umuttur kız randevuya gelir diye hamama gitmiş, temizlenmiş, sonra nasıl olmuşsa üstüne temiz kıyafetler ayarlayıp, elinde bir adet sarı gül, önceden yazdığı bir mektup daha cebine koymuş. Ve derken, Hodri hiç umut etmese de ceylan gözlüsü gelmiş. Kısacası kızla bir aşk yaşıyordu en son ondan dinlediğimde. Yerine bambaşka bir adam gelmiş, konuşması, sözleri, bakışları başka bir can bulmuştu bu mecaz aşk ile…</w:t>
@@ -6314,7 +6312,7 @@
         <w:t xml:space="preserve">Aradan birkaç hafta geçmişti tekrar İstanbul’a dönene kadar, bereketli geçen Ege, Akdeniz iş seyahati sonrası soluğu bir cuma günü Onikiler camisinde almıştım. Cemaat dağılmış, kimi işlerine, kimi çay ocağına geçmişti. Gözlerim bir süre Hodri’yi aradı, göremeyince çay ocağındaki hacı abiye sordum. “Arka avluya bak” dedi. Çayımı masada bırakıp, koşar adım gittim arka avluya, onu başka bir bankta yatarken görünce beynimden vurulmuşa dönmüştüm. Üstü başı paçavra, keskin tiner kokusu ve eskisinden daha beter olmuş virane Hodri! Uyandırmak </w:t>
       </w:r>
       <w:r>
-        <w:t>istedim, olmadı, bir ölü gibi uyuyordu, hani nefes aldığını fark etmesem öldü sanırdım. İşte benim için Hodri’nin o yarım hikayesi burada bitmişti. Bir daha o camiye de gitmedim, ondan haber de almadım, sanırım duymak istemiyordum ben bu hikâyenin sonunu. İlk romanımda sokak insanlarından bir lakap olarak geçmişti satırlarımda. İşte bu satırları okurken gül kokulu kâğıttan, titreyen ellerimin bir sebebi de buydu. O kadar çok soru vardı ki aklımda; Hodri adresimi bilmez, Hodri ile yaşadıklarımızı ikimizden başkası bilmez, dahası Hodri benim yarım kalmışlığımı bilmez, hadi sosyal medyadan beni takip edip buna karar verdi diyelim, onun benimle bu temasının adını kimse koyamaz. Bu mektupları yazan yoksa Hodri miydi? Devam ettim haliyle okumaya ‘nasılsa anlarız şimdi’ diyerek.</w:t>
+        <w:t>istedim, olmadı, bir ölü gibi uyuyordu, hani nefes aldığını fark etmesem öldü sanırdım. İşte benim için Hodri’nin o yarım hikâyesi burada bitmişti. Bir daha o camiye de gitmedim, ondan haber de almadım, sanırım duymak istemiyordum ben bu hikâyenin sonunu. İlk romanımda sokak insanlarından bir lakap olarak geçmişti satırlarımda. İşte bu satırları okurken gül kokulu kâğıttan, titreyen ellerimin bir sebebi de buydu. O kadar çok soru vardı ki aklımda; Hodri adresimi bilmez, Hodri ile yaşadıklarımızı ikimizden başkası bilmez, dahası Hodri benim yarım kalmışlığımı bilmez, hadi sosyal medyadan beni takip edip buna karar verdi diyelim, onun benimle bu temasının adını kimse koyamaz. Bu mektupları yazan yoksa Hodri miydi? Devam ettim haliyle okumaya ‘nasılsa anlarız şimdi’ diyerek.</w:t>
       </w:r>
     </w:p>
     <w:p>
@@ -6322,7 +6320,7 @@
         <w:rPr>
           <w:i/>
         </w:rPr>
-        <w:t>Bütün aşklar tamam olsaydı, kimse yarım kalmazdı ama bütün yarımlar zaten aşıklardır da biz o aşkı tamam etmek için dünyada birbirimizi zahir ve suretlerde görür, aşk zanneder, yarım kalırız, oysa aşkta tamamlamak için dünyada yarım bırakılır tüm mecazi aşklar. Ben bir yazını gördüm senin, ‘Sonsuza kadar sürmeyecek her aşk kalp kırıklığıdır’ evet haklısın abi, mecaz aşk kalp kırıklığıdır ancak aslını bulmak için de en iyi antrenman sahasıdır. Ya evvelini hatırla ya sonrasını bil Mustafa Sefa abim, aksi halde yarım yamalak, hatta yarı insan yarı ten ölene kadar bu böyle sürüp gidecek.</w:t>
+        <w:t>Bütün aşklar tamam olsaydı, kimse yarım kalmazdı ama bütün yarımlar zaten âşıklardır da biz o aşkı tamam etmek için dünyada birbirimizi zahir ve suretlerde görür, aşk zanneder, yarım kalırız, oysa aşkta tamamlamak için dünyada yarım bırakılır tüm mecazi aşklar. Ben bir yazını gördüm senin, ‘Sonsuza kadar sürmeyecek her aşk kalp kırıklığıdır’ evet haklısın abi, mecaz aşk kalp kırıklığıdır ancak aslını bulmak için de en iyi antrenman sahasıdır. Ya evvelini hatırla ya sonrasını bil Mustafa Sefa abim, aksi halde yarım yamalak, hatta yarı insan yarı ten ölene kadar bu böyle sürüp gidecek.</w:t>
       </w:r>
     </w:p>
     <w:p>
@@ -6338,7 +6336,7 @@
         <w:rPr>
           <w:i/>
         </w:rPr>
-        <w:t>Kızın babası ilişkimizi duymuş, benim de namımı ve dahası şahsımı bildiği için, her babanın yapacağını yapmış, kızını apar topar abisinin oğluyla evlendirmişti, yani iki amca çocuğunu… Kim bilir şimdi o da hatta zorla evlendirildiği amca oğluyla kendi yarım hikayelerini ister istemez yaşıyorlardır ama konumuz onlar değil, sensin Mustafa Sefa abim.</w:t>
+        <w:t>Kızın babası ilişkimizi duymuş, benim de namımı ve dahası şahsımı bildiği için, her babanın yapacağını yapmış, kızını apar topar abisinin oğluyla evlendirmişti, yani iki amca çocuğunu… Kim bilir şimdi o da hatta zorla evlendirildiği amca oğluyla kendi yarım hikâyelerini ister istemez yaşıyorlardır ama konumuz onlar değil, sensin Mustafa Sefa abim.</w:t>
       </w:r>
     </w:p>
     <w:p>
@@ -6354,7 +6352,7 @@
         <w:rPr>
           <w:i/>
         </w:rPr>
-        <w:t xml:space="preserve">Günler böyle geçerken, uyuşturucunun da hayatımın da dibini bulmuştum. Ciğerlerime neredeyse oksijenden çok tiner kokusu çekiyordum. Uyanınca istifra ediyor, gidip midemi kuru ekmekle doldurduktan sonra tiner çekmeye başlıyordum, ta ki sızana kadar. Ne gecem ne gündüzüm ne kışım ne de yazım kalmıştı. Yaşımı, adımı, hayatımın öncesini silmiştim ve yeni günleri ömrüme eklemeye hiç niyetim yoktu. Kalbimi yerinden söküp, ateşe atmak istediğim günlerden birinde tam da Cuma namazı vaktinde senin sesini duymuş, çok istesem de uyanamamıştım. Gitmeden önce benimle helalleşmiştin ve bir seyahate çıkacağını söylemiştin. Nice sonra hava kararmış, sokaklar boşalmış, insanlar uykuya çekilmişlerdi. Ben de uyuduğum bankta uyandım üşüyerek, doğruldum, bir karartı fark ettim. Önce bir köpek sandım onu, yaklaştıkça gözlerimi el ayalarımla ovuşturdum. Tamamen yanıma geldiğinde anladım ki o bir ceylandı. O anda bunun bir rüya mı, yoksa uyuşturucunun etkisi ile halüsinasyon olduğunu düşündüğümden midir bilmiyorum durumu yadırgamadım, o cami avlusunda nice kanatlı pembe filler gördüğümü de bilirim çünkü. Ama bu defa durum farklıydı. Beni koklayışı, gözlerindeki aşkı gördüm, bu ceylan diğer ceylanlar gibi gözleriyle konuşuyordu ve bana aşktan nameler söylüyordu bakışlarıyla. Cebimden mektupları çıkarttım, yani aşkımın bana yazdığı mektupları. Okudum, okurken ağladım, ağlarken ceylanı öpüp kokladım. Ceylan da bana anlattı çimenle olan hikayesini. Sonra bana derisine nakşedilen ismi yazılan Ahmed’i anlattı, anlattı, anlattı. Sözleri günlere sığmayacak, hatta abartmıyorum asırlara sığmayacak kadar çoktu. Asla sıkılmadım, anlattıkça ağladım, ağladıkça kalbim yıkandı, kalbim </w:t>
+        <w:t xml:space="preserve">Günler böyle geçerken, uyuşturucunun da hayatımın da dibini bulmuştum. Ciğerlerime neredeyse oksijenden çok tiner kokusu çekiyordum. Uyanınca istifra ediyor, gidip midemi kuru ekmekle doldurduktan sonra tiner çekmeye başlıyordum, ta ki sızana kadar. Ne gecem ne gündüzüm ne kışım ne de yazım kalmıştı. Yaşımı, adımı, hayatımın öncesini silmiştim ve yeni günleri ömrüme eklemeye hiç niyetim yoktu. Kalbimi yerinden söküp, ateşe atmak istediğim günlerden birinde tam da cuma namazı vaktinde senin sesini duymuş, çok istesem de uyanamamıştım. Gitmeden önce benimle helalleşmiştin ve bir seyahate çıkacağını söylemiştin. Nice sonra hava kararmış, sokaklar boşalmış, insanlar uykuya çekilmişlerdi. Ben de uyuduğum bankta uyandım üşüyerek, doğruldum, bir karartı fark ettim. Önce bir köpek sandım onu, yaklaştıkça gözlerimi el ayalarımla ovuşturdum. Tamamen yanıma geldiğinde anladım ki o bir ceylandı. O anda bunun bir rüya mı, yoksa uyuşturucunun etkisi ile halüsinasyon olduğunu düşündüğümden midir bilmiyorum durumu yadırgamadım, o cami avlusunda nice kanatlı pembe filler gördüğümü de bilirim çünkü. Ama bu defa durum farklıydı. Beni koklayışı, gözlerindeki aşkı gördüm, bu ceylan diğer ceylanlar gibi gözleriyle konuşuyordu ve bana aşktan nameler söylüyordu bakışlarıyla. Cebimden mektupları çıkarttım, yani aşkımın bana yazdığı mektupları. Okudum, okurken ağladım, ağlarken ceylanı öpüp kokladım. Ceylan da bana anlattı çimenle olan hikâyesini. Sonra bana derisine nakşedilen ismi yazılan Ahmed’i anlattı, anlattı, anlattı. Sözleri günlere sığmayacak, hatta abartmıyorum asırlara sığmayacak kadar çoktu. Asla sıkılmadım, anlattıkça ağladım, ağladıkça kalbim yıkandı, kalbim </w:t>
       </w:r>
       <w:r>
         <w:rPr>
@@ -6368,7 +6366,7 @@
         <w:rPr>
           <w:i/>
         </w:rPr>
-        <w:t>Gökleri delen yüksek ve sivri uçlu minareler değil, okunan ezanlardır, işte bu rüyadan uyanırken sabah ezanları okunuyordu İstanbul sabahında. Uyanıp doğrulduktan sonra, rüyamda gördüğüm ceylanı düşünüyordum ki onu camiden içeri girerken gördüm. Kalktım, rüya ya da değil, düştüm ardına. Camiden içeri girdiğimde içimi huzur kapladı, kokusu gül gibiydi, havası, renkleri bambaşkaydı… Ceylan camiye doluşmuş tek tük cemaatin içerisinde geziniyor ve onu benden başka kimse sanki görmüyordu Mustafa Sefa. Düşünsene, Fikirtepe’ de gezinen bir ceylan ne kadar da ilginç karşılanırdı oysa, rüyam hala bitmedi zahir dedim gittim arasına oturdum cemaatin, adamların yaptıkları hareketleri yaparak namazı kıldım, kılmaya da doyamadım. Herkes çıktı ben kaldım, ağladım, ne kadar süre ağladığımı bilmeden ağladım. Nice sonra kalktığımda ne bir insan ne de ceylan yoktu ortalarda ama içimdeki o sıkıntılı halde kalmamıştı, anlaşılan o ki içi boşalan sadece cami değildi, benim de içim boşalmıştı, tüm zehrim akıtılmıştı.</w:t>
+        <w:t>Gökleri delen yüksek ve sivri uçlu minareler değil, okunan ezanlardır, işte bu rüyadan uyanırken sabah ezanları okunuyordu İstanbul sabahında. Uyanıp doğrulduktan sonra, rüyamda gördüğüm ceylanı düşünüyordum ki onu camiden içeri girerken gördüm. Kalktım, rüya ya da değil, düştüm ardına. Camiden içeri girdiğimde içimi huzur kapladı, kokusu gül gibiydi, havası, renkleri bambaşkaydı… Ceylan camiye doluşmuş tek tük cemaatin içerisinde geziniyor ve onu benden başka kimse sanki görmüyordu Mustafa Sefa. Düşünsene, Fikirtepe’de gezinen bir ceylan ne kadar da ilginç karşılanırdı oysa, rüyam hâlâ bitmedi zahir dedim gittim arasına oturdum cemaatin, adamların yaptıkları hareketleri yaparak namazı kıldım, kılmaya da doyamadım. Herkes çıktı ben kaldım, ağladım, ne kadar süre ağladığımı bilmeden ağladım. Nice sonra kalktığımda ne bir insan ne de ceylan yoktu ortalarda ama içimdeki o sıkıntılı hal de kalmamıştı, anlaşılan o ki içi boşalan sadece cami değildi, benim de içim boşalmıştı, tüm zehrim akıtılmıştı.</w:t>
       </w:r>
     </w:p>
     <w:p>
@@ -6376,13 +6374,13 @@
         <w:rPr>
           <w:i/>
         </w:rPr>
-        <w:t xml:space="preserve">Kapının önüne vardığımda namazı kıldıran imam koluma girdi çorba ısmarlamak için. Çorbalarımızı içerken ona bütün olanları anlattım, bir süre yüzüme baktı ve bana çok mantıklı gelen birkaç aşık dervişin hikayelerini anlattı. Aslında ben ceylandan bilmediklerimi öğrenmedim, zaten bildiklerimi hatırladım. Ondan sonra umreye gittim imamın büyük desteğiyle. Hacı olmak nasip olmadı ama oralara gitmek de güzeldi be Mustafa Sefa. İşte bana verilen yarım aşk böyle tamam olmuştu, Allah </w:t>
+        <w:t xml:space="preserve">Kapının önüne vardığımda namazı kıldıran imam koluma girdi çorba ısmarlamak için. Çorbalarımızı içerken ona bütün olanları anlattım, bir süre yüzüme baktı ve bana çok mantıklı gelen birkaç âşık dervişin hikâyelerini anlattı. Aslında ben ceylandan bilmediklerimi öğrenmedim, zaten bildiklerimi hatırladım. Ondan sonra umreye gittim imamın büyük desteğiyle. Hacı olmak nasip olmadı ama oralara gitmek de güzeldi be Mustafa Sefa. İşte bana verilen yarım aşk böyle tamam olmuştu, Allah </w:t>
       </w:r>
       <w:r>
         <w:rPr>
           <w:i/>
         </w:rPr>
-        <w:t>kula yarısını dünyada gelmeden önce veriyor aşkın. Biz kalan yarısını karşı cinsten olanlarda antrenman edip, tamam etmek için Mevla’mızı bulduruluyoruz. Oysa âşık olduğumuz kadınlarla evlensek dahi o yarımlık hissi hiç bitmeyecek, tamamlanmayacak, susuzluk ancak sana susayanla giderilir, yarımın tamamlanması için Mevla’yı bulmak, gerçek aşkı ona duymak gerekir. Kimi aklını, kimi aşkını hibe eder Allah’a, aklını hibe eden meczuptur yani delidir, aşkını hibe eden velidir vesselam.</w:t>
+        <w:t>kula yarısını dünyaya gelmeden önce veriyor aşkın. Biz kalan yarısını karşı cinsten olanlarda antrenman edip, tamam etmek için Mevla’mızı bulduruluyoruz. Oysa âşık olduğumuz kadınlarla evlensek dahi o yarımlık hissi hiç bitmeyecek, tamamlanmayacak, susuzluk ancak sana susayanla giderilir, yarımın tamamlanması için Mevla’yı bulmak, gerçek aşkı ona duymak gerekir. Kimi aklını, kimi aşkını hibe eder Allah’a, aklını hibe eden meczuptur yani delidir, aşkını hibe eden velidir vesselam.</w:t>
       </w:r>
     </w:p>
     <w:p>
@@ -6390,7 +6388,7 @@
         <w:rPr>
           <w:i/>
         </w:rPr>
-        <w:t>Şimdi okumaktan haz etmeyeceğini tahmin ettiğim gerçeği yazma sırasına geldi Mustafa Sefa, Umre ziyaretimi tamamladıktan sonra, Fikirtepe ’de bir kahvede işe başlamıştım. Sanırım işe başladıktan üç ay sonra beni doktora gitmeye ikna edecek derecede bitmeyen öksürük ile başım dertteydi, dermanım ise derdin kendisiydi. Doktor ciğer filmime baktı, parça almak için ameliyat etti. Test sonuçlarını aldıktan sonra, yaşımı sordu, akrabam, eşim, annem, babam, evladım olup olmadığını öğrendikten sonra; “Kardeşim ciğerinizde portakal büyüklüğünde bir habis var, metastaz bir habis ve oldukça agresif bir seyir gösteriyor” Doktor abi ben anlamam bu laflardan kısaca söyle yaşayacak mıyım, ölecek miyim? Doktor başını önüne eğdi, tüm sevdiklerimle vedalaşmam gerektiğini tekrarlayarak söyledi, süreyi bilememekle beraber, hastaneye yatmam gerektiğini de ekledi. Hastaneye yatıp da ömrümün son aylarını hiçte hastane köşelerinde geçirmeye niyetli değildim. Ancak aylarım falan yokmuş, bilemiyor insan haliyle, son günüm, yani dünyadaki son, sonsuzluktaki günlerimin arifesinde, bizim hacı abi ile çayımı içerken ilk defa yine ceylanı gördüm camiye girerken. Ardına düşmüştüm ki hacı abi seslendi; “abdestin var mı mübarek camiye gidersin? Ezana daha bir saat var, nereye gidersin böyle?”</w:t>
+        <w:t>Şimdi okumaktan haz etmeyeceğini tahmin ettiğim gerçeği yazma sırasına geldi Mustafa Sefa, umre ziyaretimi tamamladıktan sonra, Fikirtepe’de bir kahvede işe başlamıştım. Sanırım işe başladıktan üç ay sonra beni doktora gitmeye ikna edecek derecede bitmeyen öksürük ile başım dertteydi, dermanım ise derdin kendisiydi. Doktor ciğer filmime baktı, parça almak için ameliyat etti. Test sonuçlarını aldıktan sonra, yaşımı sordu, akrabam, eşim, annem, babam, evladım olup olmadığını öğrendikten sonra; “Kardeşim ciğerinizde portakal büyüklüğünde bir habis var, metastaz bir habis ve oldukça agresif bir seyir gösteriyor” Doktor abi ben anlamam bu laflardan kısaca söyle yaşayacak mıyım, ölecek miyim? Doktor başını önüne eğdi, tüm sevdiklerimle vedalaşmam gerektiğini tekrarlayarak söyledi, süreyi bilememekle beraber, hastaneye yatmam gerektiğini de ekledi. Hastaneye yatıp da ömrümün son aylarını hiç de hastane köşelerinde geçirmeye niyetli değildim. Ancak aylarım falan yokmuş, bilemiyor insan haliyle, son günüm, yani dünyadaki son, sonsuzluktaki günlerimin arifesinde, bizim hacı abi ile çayımı içerken ilk defa yine ceylanı gördüm camiye girerken. Ardına düşmüştüm ki hacı abi seslendi; “Abdestin var mı mübarek camiye gidersin? Ezana daha bir saat var, nereye gidersin böyle?”</w:t>
       </w:r>
     </w:p>
     <w:p>
@@ -6414,7 +6412,7 @@
         <w:rPr>
           <w:i/>
         </w:rPr>
-        <w:t xml:space="preserve">Daha nice sözler fısıldadı bana yol boyunca anlatamam, yani anlatmam yasak olduğu için değil, o kelimeler henüz dünyaya indirilmediği için anlatamam. Anlayacağın Mustafa Sefa, Beni banktan alıp camiye taşıyan ne ceylan kılığına girmiş Hz. Azrail’di ne de Âşık olduğum hatundu. Caminin avlusunda dahi olsa, edilen dualar ile ruhumda uyanan yarım hikayemin geri kalanını bana fısıldayan vaazlar, dualar, aminlerdi. Hodri yani Mehmet kardeşini unutma, unutma ki hatırlayanlardan olasın, hatırlarsan şahidi bulacaksın, hatırlamazsan nereden buraya geldiğini, buradan nereye gideceğini bilemeyenlerden olursun maazallah. İnsan </w:t>
+        <w:t xml:space="preserve">Daha nice sözler fısıldadı bana yol boyunca anlatamam, yani anlatmam yasak olduğu için değil, o kelimeler henüz dünyaya indirilmediği için anlatamam. Anlayacağın Mustafa Sefa, Beni banktan alıp camiye taşıyan ne ceylan kılığına girmiş Hz. Azrail’di ne de âşık olduğum hatundu. Caminin avlusunda dahi olsa, edilen dualar ile ruhumda uyanan yarım hikâyemin geri kalanını bana fısıldayan vaazlar, dualar, aminlerdi. Hodri yani Mehmet kardeşini unutma, unutma ki hatırlayanlardan olasın, hatırlarsan şahidi bulacaksın, hatırlamazsan nereden buraya geldiğini, buradan nereye gideceğini bilemeyenlerden olursun maazallah. İnsan </w:t>
       </w:r>
       <w:r>
         <w:rPr>
@@ -6466,15 +6464,15 @@
         <w:t xml:space="preserve">Mektup, hiç bitmesin istesem de bitmişti. Ötesini berisini, işin sırrını çözme çabamı bir kenara bırakıp, sadece ağladım. Benim kadar çirkin ağlayan pek az insan vardır, boru gibi sesimle, yutağıma susma talimatı vermeden ağladım. Saate baktım, 3 saat 15 dakika sonra Muhibbi Amca ile bir araya gelecektik, daha vakit vardı. Düşen kan şekerim, ağlamaktan bitap düşmek içimde karşı konulmaz bir uyku isteğini tetiklemişti. Yazılanların içeriği, başka bir içerik aramama mahal bırakmamış, beni tam on ikiden vurmuştu. Sanki birileri çevremde daralan bir kumpas </w:t>
       </w:r>
       <w:r>
-        <w:t xml:space="preserve">kurmuştu ama niye? Ben kimim ki bana kumpas kursunlar? Olaylar tesadüfi olmayacak kadar peş peşe geliyorlar, hızla gelişiyor, içime afakanlar basıyor, nefesimi kesiyordu. Bir mahkeme kurulmuş gıyabımda ama hâkim de savcı da yargılayan da yargılanan da avukat da hatta mübaşir ve kâtip de bendim, en çok kâtip gibiyim. Ortada tek bir eksik vardı; suç! Sahi ben niye bunların mücadelesi içindeyim, madem herkes ve her şey benim, karar da benim, hüküm de benim, çünkü ben ben ben diyen ‘ben’ bir hiçim. Yazmıyorum kardeş, ben yokum, benim derdim bana yeter, belki de bir tedaviye ihtiyacım varken, yok şahitmiş, yok ceylanmış, şeytanmış… Mektuplar ama sözüm ona mektuplardan ben hariç herkesin sanki haberi var, buna Muhibbi Amca da dahil, çevremde ne kadar insan varsa ya bu kumpası kurmuşlar ya da bu kumpasın planlı bir şekilde devam etmesi için iş birliği yapıyorlar. Gereksiz teveccüh gösterileri, hele bir de hastane içerisindeki tavırlar, ulan başhekimin yeğeni olsam kaç yazar, nasibi veren Allah, kula minnet eylemek nedir? Saygı adı başlığı altında bu yapışkan, yılışık, vıcık vıcık davranışlar… Hocalar, üstatlar, ustalar, beyli, hanımlı ölçeklendirmeler, hepsi havalarda uçuşuyor. Sabrın da bir sınırı var, Hodri midir, Mehmet midir, ulan ısmarladığım çorbalar dişini mi </w:t>
-      </w:r>
-      <w:r>
-        <w:t>kırmış o da bu işin içine dahil edilmişti, müptezel herifin teki. Makam araçlarıyla beni hastanesinden içeri sokan bir başhekim ama abimiz tevazu sahibi ya sözüm ona, başhekimliğini benden saklıyor, tabi saklar, saklayacak ki sonradan mütevaziliğinin altına sırladığı kibri ortaya çıkmasın. Üstelik bana; “Bak ben bir psikiyatrım ama elim de kalem tutar, mürekkep öyle değil böyle inceltilir” diyor haşmetli hünkarımız. Ne o, iki satır tasavvufi jargonlu hikayeler uydurduğu için mi? Bak bak! Bir de mektupları güllere buluyor, sabahları beni o kokuyla uyandıracak anamı da bu kumpasa dahil ederek! Ulan ben kaçın kurasıyım. Beni vatan sevgimle krem peyniri kıvamına getirin, sonra işe gizem içinde gizemler katın, hastayım oğlum ben, ayılıp bayılıyorum, iyi değilim, konuşacak enerjim isteğim yok, yok, yok!</w:t>
-      </w:r>
-    </w:p>
-    <w:p>
-      <w:r>
-        <w:t xml:space="preserve">İşte o anda aklımdan geçen cümleler bunlardı ve bunları olduğu gibi hastanenin orta yerinde avazım çıktığı kadar bağırmak istiyordum. Ne yolcu ne şahit ne deli herifin teki umurumda değildi. En iyi yaptığımı yapacaktım, üstümü başımı yırtıp, hastane koridorunu birbirine katıp, her yerin, her şeyin, herkesin altını üstüne getirecektim. Peki ben ne yapmıştım? Hiçbir şey! Önümde duran yarı beline kadar dolu olan çay bardağını duvara çarpmak üzere ayağa fırlamış, bardağı havaya kaldırmış sonra da elimde bardak donakalmıştım. Bedenimde bir kasılma başlamıştı, evde olan şey yine oluyordu, bunu anladığım anda öfkemin yerini dehşet bir korku sarınca, kendimden geçince sert zemine çakılmayayım diye hemen kalktığım sandalyeme geri oturmuştum. Yine süresini bilmediğim bir zaman aralığında sandalyede yığılı kalmıştım. Bayılmanın içine sanırım uyku da karışmıştı. Saat öğlene geliyor gibiydi, bıyıklarıma ve sakallarıma ellerim değdiğinde anlamıştım ki ağzım ve burnumdan bir şeyler akmıştı. </w:t>
+        <w:t xml:space="preserve">kurmuştu ama niye? Ben kimim ki bana kumpas kursunlar? Olaylar tesadüfi olmayacak kadar peş peşe geliyorlar, hızla gelişiyor, içime afakanlar basıyor, nefesimi kesiyordu. Bir mahkeme kurulmuş gıyabımda ama hâkim de savcı da yargılayan da yargılanan da avukat da hatta mübaşir ve kâtip de bendim, en çok kâtip gibiyim. Ortada tek bir eksik vardı; suç! Sahi ben niye bunların mücadelesi içindeyim, madem herkes ve her şey benim, karar da benim, hüküm de benim, çünkü ben ben ben diyen ‘ben’ bir hiçim. Yazmıyorum kardeş, ben yokum, benim derdim bana yeter, belki de bir tedaviye ihtiyacım varken, yok şahitmiş, yok ceylanmış, şeytanmış… Mektuplar ama sözüm ona mektuplardan ben hariç herkesin sanki haberi var, buna Muhibbi Amca da dahil, çevremde ne kadar insan varsa ya bu kumpası kurmuşlar ya da bu kumpasın planlı bir şekilde devam etmesi için iş birliği yapıyorlar. Gereksiz teveccüh gösterileri, hele bir de hastane içerisindeki tavırlar, ulan başhekimin yeğeni olsam kaç yazar, nasibi veren Allah, kula minnet eylemek nedir? Saygı adı altında bu yapışkan, yılışık, vıcık vıcık davranışlar… Hocalar, üstatlar, ustalar, beyli, hanımlı ölçeklendirmeler, hepsi havalarda uçuşuyor. Sabrın da bir sınırı var, Hodri midir, Mehmet midir, ulan ısmarladığım çorbalar dişini mi </w:t>
+      </w:r>
+      <w:r>
+        <w:t>kırmış o da bu işin içine dahil edilmişti, müptezel herifin teki. Makam araçlarıyla beni hastanesinden içeri sokan bir başhekim ama abimiz tevazu sahibi ya sözüm ona, başhekimliğini benden saklıyor, tabii saklar, saklayacak ki sonradan mütevazılığının altına sırladığı kibri ortaya çıkmasın. Üstelik bana; “Bak ben bir psikiyatrım ama elim de kalem tutar, mürekkep öyle değil böyle inceltilir” diyor haşmetli hünkârımız. Ne o, iki satır tasavvufi jargonlu hikâyeler uydurduğu için mi? Bak bak! Bir de mektupları güllere buluyor, sabahları beni o kokuyla uyandıracak anamı da bu kumpasa dahil ederek! Ulan ben kaçın kurasıyım. Beni vatan sevgimle krem peyniri kıvamına getirin, sonra işe gizem içinde gizemler katın, hastayım oğlum ben, ayılıp bayılıyorum, iyi değilim, konuşacak enerjim isteğim yok, yok, yok!</w:t>
+      </w:r>
+    </w:p>
+    <w:p>
+      <w:r>
+        <w:t xml:space="preserve">İşte o anda aklımdan geçen cümleler bunlardı ve bunları olduğu gibi hastanenin orta yerinde avazım çıktığı kadar bağırmak istiyordum. Ne yolcu ne şahit ne deli herifin teki umurumda değildi. En iyi yaptığımı yapacaktım, üstümü başımı yırtıp, hastane koridorunu birbirine katıp, her yerin, her şeyin, herkesin altını üstüne getirecektim. Peki ben ne yapmıştım? Hiçbir şey! Önümde duran yarı beline kadar dolu olan çay bardağını duvara çarpmak üzere ayağa fırlamış, bardağı havaya kaldırmış sonra da elimde bardak donakalmıştım. Bedenimde bir kasılma başlamıştı, evde olan şey yine oluyordu, bunu anladığım anda öfkemin yerini dehşet bir korku sarınca, kendimden geçince sert zemine çakılmayayım diye hemen kalktığım sandalyeme geri oturmuştum. Yine süresini bilmediğim bir zaman aralığında sandalyede yığılı kalmıştım. Bayılmanın içine sanırım uyku da karışmıştı. Saatin kaç olduğunu bilmiyordum; bıyıklarıma ve sakallarıma ellerim değdiğinde anlamıştım ki ağzım ve burnumdan bir şeyler akmıştı. </w:t>
       </w:r>
       <w:r>
         <w:t xml:space="preserve">Odanın tuvaletine girdim, aynada kendime bakınca şok oldum. Cildim balmumu ile kaplanmış gibi parlak sarı rengindeydi, ağzımdan ve burnumdan epilepsi nöbeti geçiren insanlar gibi salya-köpük karışımı bir şeyler gelmişti. Allah’ım bana neler oluyordu böyle? Kafamı musluğun altına sokup, saçlarımı ıslattım. Karnım aç, hareket etmeye halim, mecalim yok, iştah sıfır. Telefon çalıyor, ısrarla açmıyorum, ısrarla çalıyor, ısrarla açmıyorum. Ekrana baktığımda bir isim görüyorum: “Emrah Cebiroğlu” yazıyor. Şu hayatta en çok sevdiğim iki Emrah var benim, biri Cebiroğlu, diğeri </w:t>
@@ -6524,7 +6522,7 @@
     </w:p>
     <w:p>
       <w:r>
-        <w:t>“Abi, önümüzdeki ramazan cumhurbaşkanımızın baş danışması ile bir organizasyon var, programı senin sunmanı istiyoruz, bununla ilgili bir toplantı yapalım dedik.”</w:t>
+        <w:t>“Abi, önümüzdeki ramazan cumhurbaşkanımızın başdanışmanı ile bir organizasyon var, programı senin sunmanı istiyoruz, bununla ilgili bir toplantı yapalım dedik.”</w:t>
       </w:r>
     </w:p>
     <w:p>
@@ -6544,7 +6542,7 @@
     </w:p>
     <w:p>
       <w:r>
-        <w:t>“Tüyap Kongre Merkezinde, son konferansında fark ettik abi bizde, gel bir hal çaresine bakalım.”</w:t>
+        <w:t>“Tüyap Kongre Merkezi’nde, son konferansında fark ettik abi biz de, gel bir hal çaresine bakalım.”</w:t>
       </w:r>
     </w:p>
     <w:p>
@@ -6571,7 +6569,7 @@
         <w:t xml:space="preserve"> ama bunların ne kadarı şahsi tecrübelerimdi ne kadarını kişiselleştirmiş, hayatıma geçirmiştim. Kendine ayna tutamayan, başkalarına ışık olamaz, derdinin kölesi olursan, dermanın efendisi olamazsın… Ohooo! Say say bitmez! Sahnelerde, konferanslarda ne büyük sözler söylemiştim küçük hayatıma kıyasla kim bilir? Sonra içimde kocaman bir korku peyda olmuştu, Allah’ım benden razı değil miydi? O’nun öfkesini mi çekmiştim üzerime? Yaşamadıklarım, dahası yaşantıma yansıtmadığım sözlerim mi yansıyordu bu öfkeye? Ölmekten de korkuncu öldükten </w:t>
       </w:r>
       <w:r>
-        <w:t>sonrasıydı. Allah’ın benden razı olmadan son nefesimi vermek! Kendimi bir solucanla beraber Allah’ın huzurunda hayal etmiştim.</w:t>
+        <w:t>sonrasıydı. Allah benden razı olmadan son nefesimi vermek! Kendimi bir solucanla beraber Allah’ın huzurunda hayal etmiştim.</w:t>
       </w:r>
     </w:p>
     <w:p>
@@ -6591,12 +6589,12 @@
     </w:p>
     <w:p>
       <w:r>
-        <w:t>“Allah’ım iki metre kare havalandırabilmişim nefsimin eceli gelene kadar dediler bana katipleriniz.”</w:t>
-      </w:r>
-    </w:p>
-    <w:p>
-      <w:r>
-        <w:t>“Dünyada bulunan 150 milyon metre kare topraktan, bu kadarının yapmışsın, cürmün kadar yeri havalandırmışsın, görevini, fıtratını tespih etmişsin.”</w:t>
+        <w:t>“Allah’ım iki metre kare havalandırabilmişim nefsimin eceli gelene kadar dediler bana kâtipleriniz.”</w:t>
+      </w:r>
+    </w:p>
+    <w:p>
+      <w:r>
+        <w:t>“Dünyada bulunan 150 milyon kilometre kare topraktan, bu kadarını yapmışsın, cürmün kadar yeri havalandırmışsın, görevini, fıtratını tespih etmişsin.”</w:t>
       </w:r>
     </w:p>
     <w:p>
@@ -6616,7 +6614,7 @@
     </w:p>
     <w:p>
       <w:r>
-        <w:t>“Katiplerim bana üç roman yazdıklarını söylediler, bu yeterli mi?”</w:t>
+        <w:t>“Kâtiplerim bana üç roman yazdıklarını söylediler, bu yeterli mi?”</w:t>
       </w:r>
     </w:p>
     <w:p>
@@ -6626,7 +6624,7 @@
     </w:p>
     <w:p>
       <w:r>
-        <w:t>“Oku diyerek başladığım, üstelik okumaktan kullarımın büyük bir çoğunluğunun okumayacaklarını bilerek Kur’an gönderdim, sen bir yazar olarak okudun mu tarihin görüp göreceği en büyük kitabımı. Elçilerimi yolladım dünya sahnesine, her elçimin ordularımı vardı peşinden takip eden.”</w:t>
+        <w:t>“Oku diyerek başladığım, üstelik okumaktan kullarımın büyük bir çoğunluğunun okumayacaklarını bilerek Kur’an gönderdim, sen bir yazar olarak okudun mu tarihin görüp göreceği en büyük kitabımı. Elçilerimi yolladım dünya sahnesine, her elçimin orduları mı vardı peşinden takip eden?”</w:t>
       </w:r>
     </w:p>
     <w:p>
@@ -6646,7 +6644,7 @@
     </w:p>
     <w:p>
       <w:r>
-        <w:t>“Hakk’ı Hakikati anlatan oyunları da izlenmeyecek diye oynamadın.”</w:t>
+        <w:t>“Hakk’ı hakikati anlatan oyunları da izlenmeyecek diye oynamadın.”</w:t>
       </w:r>
     </w:p>
     <w:p>
@@ -6696,7 +6694,7 @@
         <w:t>!</w:t>
       </w:r>
       <w:r>
-        <w:t xml:space="preserve"> Söylemleri yazdıkları birbiri ile tutarsız sahne adamı, yazar, üç kağıtçı, kendine geç kalmış, kendini tanımamış, bilememiş Mustafa Sefa… Ruh halimdi, bulanık zihnimdi derken konu nerelere gelmişti böyle. Allah’ın razı olmadığı bir kul olarak karşısına çıkmak, ömür sermayesini bu uğurda değil de saçma sapan nefsani isteklerimle harcamış olmak ihtimali korkunçtu. Ne kadar istemezsem istemeyeyim, </w:t>
+        <w:t xml:space="preserve"> Söylemleri yazdıkları birbiri ile tutarsız sahne adamı, yazar, üçkâğıtçı, kendine geç kalmış, kendini tanımamış, bilememiş Mustafa Sefa… Ruh halimdi, bulanık zihnimdi derken konu nerelere gelmişti böyle. Allah’ın razı olmadığı bir kul olarak karşısına çıkmak, ömür sermayesini bu uğurda değil de saçma sapan nefsani isteklerimle harcamış olmak ihtimali korkunçtu. Ne kadar istemezsem istemeyeyim, </w:t>
       </w:r>
       <w:r>
         <w:rPr>
@@ -6710,7 +6708,7 @@
     </w:p>
     <w:p>
       <w:r>
-        <w:t xml:space="preserve">Tövbeler olsun, derdim sadece okunmak değil, yazmak da olmalıydı! Hakkı anlatan ama önce kendisi anlayan, zafer kazanmak değil sefere çıkmak gayretinde olan olmalıydım ve ben kös kös oturmuş, bunalımlarımı, susmalarımı, anti sosyal tavırlarımı sorguluyordum. Derdimle haşir neşir olurken, derdimde kaybolmuşum, sen kimsin lan! Allah var gam yok demiyor muydun, derdi veren </w:t>
+        <w:t xml:space="preserve">Tövbeler olsun, derdim sadece okunmak değil, yazmak da olmalıydı! Hakkı anlatan ama önce kendisi anlayan, zafer kazanmak değil sefere çıkmak gayretinde olan olmalıydım ve ben kös kös oturmuş, bunalımlarımı, susmalarımı, antisosyal tavırlarımı sorguluyordum. Derdimle haşir neşir olurken, derdimde kaybolmuşum, sen kimsin lan! Allah var gam yok demiyor muydun, derdi veren </w:t>
       </w:r>
       <w:r>
         <w:lastRenderedPageBreak/>
@@ -6870,7 +6868,7 @@
           <w:i/>
           <w:iCs/>
         </w:rPr>
-        <w:t>Tefeül ile okunan her şey bizi düşünmenin ötesinde tefekküre zorlar Mustafa Sefa, düşünmek kapıyı açar, tefekkür etmek kapının ardını gösterir sana. Bugün sana şahitten ilk ipucunu veriyorum, kıymetini bil; o Allah’ın biriciği olarak dünyaya gönderildi, sonra o hayatında kendi tercihlerine şahit edildi. Herhangi birisiydi fakat kendi hikayesinin olmazsa olmazıydı. Her yer sahneydi ve doğumundan ölümüne başrollerdeydi. Ölene kadar nefesle başlayan rızkı, nasibi göklerin karar verdiği oranda taktim ve tahsis edildi. Onu ünlülerden daha ünlü yapan ünsüz olmasıydı, hatta ünlüleri ünlü yapan oydu. Hiçliğini hiç sayan ariflere selam olsun, bunu bilinmek isteyenin değil, bilmesi gerekenin gerçekliğiyle yazıyorum, çünkü hepimizin gerçekleri farklı olsalar da hakikat öyle değil. Sen gerçeği değil, hakikati ara, bulmayacağını bilsen de ara. Aramakla bulunmaz o hakikat yoluna revan olmak, o yolda olmak, o yolun rengine bulanmak dahi mütekâmil olmaya müşteri insanı eşrefi mahlukat eder.</w:t>
+        <w:t>Tefeül ile okunan her şey bizi düşünmenin ötesinde tefekküre zorlar Mustafa Sefa, düşünmek kapıyı açar, tefekkür etmek kapının ardını gösterir sana. Bugün sana şahitten ilk ipucunu veriyorum, kıymetini bil; o Allah’ın biriciği olarak dünyaya gönderildi, sonra o hayatında kendi tercihlerine şahit edildi. Herhangi birisiydi fakat kendi hikâyesinin olmazsa olmazıydı. Her yer sahneydi ve doğumundan ölümüne başrollerdeydi. Ölene kadar nefesle başlayan rızkı, nasibi göklerin karar verdiği oranda takdir ve tahsis edildi. Onu ünlülerden daha ünlü yapan ünsüz olmasıydı, hatta ünlüleri ünlü yapan oydu. Hiçliğini hiç sayan ariflere selam olsun, bunu bilinmek isteyenin değil, bilmesi gerekenin gerçekliğiyle yazıyorum, çünkü hepimizin gerçekleri farklı olsalar da hakikat öyle değil. Sen gerçeği değil, hakikati ara, bulmayacağını bilsen de ara. Aramakla bulunmaz o hakikat yoluna revan olmak, o yolda olmak, o yolun rengine bulanmak dahi mütekâmil olmaya müşteri insanı eşrefi mahlukat eder.</w:t>
       </w:r>
       <w:r>
         <w:rPr>
@@ -6899,7 +6897,7 @@
           <w:i/>
           <w:iCs/>
         </w:rPr>
-        <w:t>Şahit çok susadı Mustafa Sefa, hem de çok ama çok susadı. Suyu arıyor mu? Evet! Bulduğunu zannediyor mu evet, içiyor mu? Evet. Susuzluğunu giderebiliyor mu? Hayır! Ölene kadar suyu arayacak. Bulur mu bilemem, bu sana, bana, bu yolda milimetre taşı olan herkese görev, cürmünce, karınca kararınca hepimiz şahide hizmet ediyoruz, suyu bulsun, bulduğu onu cennete kavuştursun.</w:t>
+        <w:t>Şahit çok susadı Mustafa Sefa, hem de çok ama çok susadı. Suyu arıyor mu? Evet! Bulduğunu zannediyor mu? Evet. İçiyor mu? Evet. Susuzluğunu giderebiliyor mu? Hayır! Ölene kadar suyu arayacak. Bulur mu bilemem, bu sana, bana, bu yolda milimetre taşı olan herkese görev, cürmünce, karınca kararınca hepimiz şahide hizmet ediyoruz, suyu bulsun, bulduğu onu cennete kavuştursun.</w:t>
       </w:r>
     </w:p>
     <w:p>
@@ -7737,57 +7735,48 @@
     </w:p>
     <w:p>
       <w:r>
-        <w:t xml:space="preserve">Muhibbi Amca çay bardağını ışığa doğru kaldırdı. “Bunun içindekine su diyorsun,” dedi, “çaya girince çay, damara girince kanın bir parçası, göze çıkınca yaş. Su, adını her kaba teslim ediyor da aslını kaybetmiyor. İnsan ise kendisine yazar dediklerinde başka, hasta dediklerinde başka, hoca dediklerinde bambaşka biri oluyor. Adı kabına göre değişiyor, sonra kabı kırılınca kendisi de kırıldı sanıyor. Şahit belki suyu aramıyor evlat; belki su olduğunu unutmuş. Denizden bir tas su alsan, tasın içindeki deniz </w:t>
+        <w:t>Muhibbi Amca çay bardağını ışığa doğru kaldırdı. “Bunun içindekine su diyorsun,” dedi, “çaya girince çay, damara girince kanın bir parçası, göze çıkınca yaş. Su, adını her kaba teslim ediyor da aslını kaybetmiyor. İnsan ise kendisine yazar dediklerinde başka, hasta dediklerinde başka, hoca dediklerinde bambaşka biri oluyor. Adı kabına göre değişiyor, sonra kabı kırılınca kendisi de kırıldı sanıyor. Şahit belki suyu aramıyor evlat; belki su olduğunu unutmuş. Denizden bir tas su alsan, tasın içindeki deniz ‘Ben artık deniz değilim’ mi der?</w:t>
       </w:r>
       <w:r>
         <w:rPr>
           <w:rFonts w:ascii="Courier New" w:hAnsi="Courier New" w:cs="Courier New"/>
           <w:sz w:val="20"/>
         </w:rPr>
-        <w:t>Ben artık deniz değilim</w:t>
-      </w:r>
-      <w:r>
-        <w:t xml:space="preserve"> mi der? Tas kırılınca su nereye dökülür? Şimdi bunu kesin cevap sanma. Ben yalnız soruyu genişletiyorum. Sen </w:t>
+      </w:r>
+      <w:r>
+        <w:t xml:space="preserve"> Tas kırılınca su nereye dökülür? Şimdi bunu kesin cevap sanma. Ben yalnız soruyu genişletiyorum. Sen ‘Şahit kim?’ diye</w:t>
       </w:r>
       <w:r>
         <w:rPr>
           <w:rFonts w:ascii="Courier New" w:hAnsi="Courier New" w:cs="Courier New"/>
           <w:sz w:val="20"/>
         </w:rPr>
-        <w:t>Şahit kim?</w:t>
-      </w:r>
-      <w:r>
-        <w:t xml:space="preserve"> diye soruyorsun. Bir gün </w:t>
+      </w:r>
+      <w:r>
+        <w:t xml:space="preserve"> soruyorsun. Bir gün ‘Kim şahitlik ediyor?’ sonra ‘Şahitlik kime ait?’ belki en sonunda ‘Bu soruyu duyan ne?’ diyeceksin</w:t>
       </w:r>
       <w:r>
         <w:rPr>
           <w:rFonts w:ascii="Courier New" w:hAnsi="Courier New" w:cs="Courier New"/>
           <w:sz w:val="20"/>
         </w:rPr>
-        <w:t>Kim şahitlik ediyor?</w:t>
-      </w:r>
-      <w:r>
-        <w:t xml:space="preserve">, sonra </w:t>
-      </w:r>
+      </w:r>
+      <w:r/>
       <w:r>
         <w:rPr>
           <w:rFonts w:ascii="Courier New" w:hAnsi="Courier New" w:cs="Courier New"/>
           <w:sz w:val="20"/>
         </w:rPr>
-        <w:t>Şahitlik kime ait?</w:t>
-      </w:r>
-      <w:r>
-        <w:t xml:space="preserve">, belki en sonunda </w:t>
-      </w:r>
+      </w:r>
+      <w:r/>
       <w:r>
         <w:rPr>
           <w:rFonts w:ascii="Courier New" w:hAnsi="Courier New" w:cs="Courier New"/>
           <w:sz w:val="20"/>
         </w:rPr>
-        <w:t>Bu soruyu duyan ne?</w:t>
-      </w:r>
-      <w:r>
-        <w:t xml:space="preserve"> diyeceksin. O vakit suyu buldun sanma; yalnız susuzluğunun adını doğru koymuş olursun.”</w:t>
+      </w:r>
+      <w:r>
+        <w:t>. O vakit suyu buldun sanma; yalnız susuzluğunun adını doğru koymuş olursun.”</w:t>
       </w:r>
     </w:p>
     <w:p>
@@ -8354,7 +8343,7 @@
     </w:p>
     <w:p>
       <w:r>
-        <w:t xml:space="preserve">Acil serviste tansiyonum, şekerim, ateşim ölçüldü. Sorular soruldu. </w:t>
+        <w:t xml:space="preserve">Acil servisin duvarları soluk yeşildi. Hakan Hoca plastik bir bardakla su uzattı; içtim. Tansiyonum, şekerim, ateşim ölçüldü. Sorular soruldu. </w:t>
       </w:r>
       <w:r>
         <w:t>B</w:t>
@@ -9315,7 +9304,7 @@
         <w:rPr>
           <w:rFonts w:ascii="Courier New" w:hAnsi="Courier New" w:cs="Courier New"/>
         </w:rPr>
-        <w:t>“Babamın bana verdiği vesvese oklarını babama emanet etmiştim, çünkü bana fitne mızrağını vermişti, İşte bunu!”</w:t>
+        <w:t>“Babamın bana verdiği vesvese oklarını babama emanet etmiştim, çünkü bana fitne mızrağını vermişti, işte bunu!”</w:t>
       </w:r>
     </w:p>
     <w:p>
@@ -9367,7 +9356,7 @@
         <w:rPr>
           <w:rFonts w:ascii="Courier New" w:hAnsi="Courier New" w:cs="Courier New"/>
         </w:rPr>
-        <w:t>Şeytan bunu duyunca, dişlerini birbirine vurmaya başladı, diğerleri de aynını yaptılar ve Ceylan donakalmış, olanlara anlam verememişti, bu onların alkışlama biçimiydi.</w:t>
+        <w:t>Şeytan bunu duyunca, dişlerini birbirine vurmaya başladı, diğerleri de aynısını yaptılar ve Ceylan donakalmış, olanlara anlam verememişti, bu onların alkışlama biçimiydi.</w:t>
       </w:r>
     </w:p>
     <w:p>
@@ -9425,7 +9414,7 @@
         <w:rPr>
           <w:rFonts w:ascii="Courier New" w:hAnsi="Courier New" w:cs="Courier New"/>
         </w:rPr>
-        <w:t>“Belam’ın yaşadığı diyarın efendisi olan kral, Allah’ı inkâr edenlerdendi. Atalarının dinsizliği üstüne yaşıyor, ancak Belam’a ilişmiyordu. Ta ki Kızıl denizi ikiye asası ile bölen Musa, rüyasında Allahtan emir alana kadar… Meğer Musa kafir olan krala tebliğde bulunmak, uymazsa da canına kıymak üzere sefere hazırlanıyormuş. Elbette altı yüz bin askerden oluşan ordunun yurtlarına doğru geldiğini öğrenen kralı bir telaş aldı. Onun endişelerini arttırmak için ense köküne oturttuğum cinler onun vehmini arttırdı, vehmi artan kralın olmayan aklı hepten gölgede kaldı.”</w:t>
+        <w:t>“Belam’ın yaşadığı diyarın efendisi olan kral, Allah’ı inkâr edenlerdendi. Atalarının dinsizliği üstüne yaşıyor, ancak Belam’a ilişmiyordu. Ta ki Kızıldeniz’i ikiye asası ile bölen Musa, rüyasında Allah’tan emir alana kadar… Meğer Musa kafir olan krala tebliğde bulunmak, uymazsa da canına kıymak üzere sefere hazırlanıyormuş. Elbette altı yüz bin askerden oluşan ordunun yurtlarına doğru geldiğini öğrenen kralı bir telaş aldı. Onun endişelerini artırmak için ense köküne oturttuğum cinler onun vehmini artırdı, vehmi artan kralın olmayan aklı hepten gölgede kaldı.”</w:t>
       </w:r>
     </w:p>
     <w:p>
@@ -9470,20 +9459,20 @@
         <w:rPr>
           <w:rFonts w:ascii="Courier New" w:hAnsi="Courier New" w:cs="Courier New"/>
         </w:rPr>
-        <w:t>Size Belam’ın özelliklerini söyleyeceğim, küçük dillerinize sahip çıkın yutmamak için. Keramet ehli, çevresinde Allahtan yüz çevirmiş birçoklarına vesile olmuş, yeri geldiğinde mahlukat lisanını duyan ama böyle bir âlimken, insanlık tarihinin ilk ateizm yani Allah’ı inkâr kitabını yazan kişisine dönüşmüştür. Belam Bin Baura, hazretken herif olanlar zümresine itilmiştir. Şimdi devam et evladım.”</w:t>
-      </w:r>
-    </w:p>
-    <w:p>
-      <w:pPr>
-        <w:rPr>
-          <w:rFonts w:ascii="Courier New" w:hAnsi="Courier New" w:cs="Courier New"/>
-        </w:rPr>
-      </w:pPr>
-      <w:r>
-        <w:rPr>
-          <w:rFonts w:ascii="Courier New" w:hAnsi="Courier New" w:cs="Courier New"/>
-        </w:rPr>
-        <w:t>“…Edeyim Babacığım. İnkârcı kral vezirlerini topladı, içlerinde en zeki, en sinsi olanını çoktan tespit edip, seçmiştim, onun adı Balakt’ı. Altınlara, kadınlara, zevki sefaya düşkün şeytanlaşmış bir âdemoğlu. ‘İşte benim kuklam bu olmadı’ dedim ve Fitne silahını onun eline verip, kulağına fısıldadım; ‘Söyle kralına, Belam’ı bulsun, o İsm-i Âzam denilen ret olunmayan duaların ilmini bilen bir âlimdir’ Vezir bu fısıldamamı kıt zekâsından kralına haykırdı. Aklı hepten gölgede kalan kral hemen sordu; ‘Musa’nın dinine inanan Belam’ı nasıl ikna edeceksin buna?’</w:t>
+        <w:t>Size Belam’ın özelliklerini söyleyeceğim, küçük dillerinize sahip çıkın yutmamak için. Keramet ehli, çevresinde Allah’tan yüz çevirmiş birçoklarına vesile olmuş, yeri geldiğinde mahlukat lisanını duyan ama böyle bir âlimken, insanlık tarihinin ilk ateizm yani Allah’ı inkâr kitabını yazan kişisine dönüşmüştür. Belam Bin Baura, hazretken herif olanlar zümresine itilmiştir. Şimdi devam et evladım.”</w:t>
+      </w:r>
+    </w:p>
+    <w:p>
+      <w:pPr>
+        <w:rPr>
+          <w:rFonts w:ascii="Courier New" w:hAnsi="Courier New" w:cs="Courier New"/>
+        </w:rPr>
+      </w:pPr>
+      <w:r>
+        <w:rPr>
+          <w:rFonts w:ascii="Courier New" w:hAnsi="Courier New" w:cs="Courier New"/>
+        </w:rPr>
+        <w:t>“…Edeyim Babacığım. İnkârcı kral vezirlerini topladı, içlerinde en zeki, en sinsi olanını çoktan tespit edip, seçmiştim, onun adı Balakt’tı. Altınlara, kadınlara, zevk ü sefaya düşkün şeytanlaşmış bir âdemoğlu. ‘İşte benim kuklam bu olmalı’ dedim ve Fitne silahını onun eline verip, kulağına fısıldadım; ‘Söyle kralına, Belam’ı bulsun, o İsm-i Âzam denilen ret olunmayan duaların ilmini bilen bir âlimdir.’ Vezir bu fısıldamamı kıt zekâsından kralına haykırdı. Aklı hepten gölgede kalan kral hemen sordu; ‘Musa’nın dinine inanan Belam’ı nasıl ikna edeceksin buna?’</w:t>
       </w:r>
     </w:p>
     <w:p>
@@ -9502,20 +9491,20 @@
         <w:rPr>
           <w:rFonts w:ascii="Courier New" w:hAnsi="Courier New" w:cs="Courier New"/>
         </w:rPr>
-        <w:t>kandıralım’ dedi. Kral da dahil herkes bilirdi ki Baura’nın karısı diyarın en güzel hatunuydu ve o âlim karısına çok aşıktı. Balakt’a tekrar fısıldadım; ‘Karısına gidin, onu mızrakla, yani fitnele yani fitle’</w:t>
-      </w:r>
-    </w:p>
-    <w:p>
-      <w:pPr>
-        <w:rPr>
-          <w:rFonts w:ascii="Courier New" w:hAnsi="Courier New" w:cs="Courier New"/>
-        </w:rPr>
-      </w:pPr>
-      <w:r>
-        <w:rPr>
-          <w:rFonts w:ascii="Courier New" w:hAnsi="Courier New" w:cs="Courier New"/>
-        </w:rPr>
-        <w:t>İşte kudretli efendim ve kardeşlerim, kralın adamları ve en önlerinde Balakt, ensesinde ben, eteklerinde zebanilerim, dayandık kapısına Baura’nın. Belam’ın güzel karısı kapıyı açtı şaşırarak, ‘demek kocamın şanı, ünü krala kadar ulaşmış’ diyerek içinden, sonra içeri buyur etti kralın adamlarını.</w:t>
+        <w:t>kandıralım’ dedi. Kral da dahil herkes bilirdi ki Belam’ın karısı diyarın en güzel hatunuydu ve o âlim karısına çok âşıktı. Balakt’a tekrar fısıldadım; ‘Karısına gidin, onu mızrakla, yani fitnele yani fitle’</w:t>
+      </w:r>
+    </w:p>
+    <w:p>
+      <w:pPr>
+        <w:rPr>
+          <w:rFonts w:ascii="Courier New" w:hAnsi="Courier New" w:cs="Courier New"/>
+        </w:rPr>
+      </w:pPr>
+      <w:r>
+        <w:rPr>
+          <w:rFonts w:ascii="Courier New" w:hAnsi="Courier New" w:cs="Courier New"/>
+        </w:rPr>
+        <w:t>İşte kudretli efendim ve kardeşlerim, kralın adamları ve en önlerinde Balakt, ensesinde ben, eteklerinde zebanilerim, dayandık kapısına Belam’ın. Güzel karısı kapıyı açtı şaşırarak, ‘demek kocamın şanı, ünü krala kadar ulaşmış’ diyerek içinden, sonra içeri buyur etti kralın adamlarını.</w:t>
       </w:r>
     </w:p>
     <w:p>
@@ -9541,7 +9530,7 @@
         <w:rPr>
           <w:rFonts w:ascii="Courier New" w:hAnsi="Courier New" w:cs="Courier New"/>
         </w:rPr>
-        <w:t>‘Ey bu diyarın en âli kişisinin aşkına yaraşır diyarın en güzel hatunu, biz bugün bir endişe ile geldik kapına. Yurdumuz ki üç yüz yıl boyunca beyiniz gibi âlim bir zat-ı muhteremi, keramet ehlini görmedi, ondan ricalimiz vardır, size iletmeye geldik.’</w:t>
+        <w:t>‘Ey bu diyarın en âli kişisinin aşkına yaraşır diyarın en güzel hatunu, biz bugün bir endişe ile geldik kapına. Yurdumuz ki üç yüz yıl boyunca beyiniz gibi âlim bir zat-ı muhteremi, keramet ehlini görmedi, ondan ricamız vardır, size iletmeye geldik.’</w:t>
       </w:r>
     </w:p>
     <w:p>
@@ -9593,20 +9582,20 @@
         <w:rPr>
           <w:rFonts w:ascii="Courier New" w:hAnsi="Courier New" w:cs="Courier New"/>
         </w:rPr>
-        <w:t>‘Bir adam ne yapabilir koca orduya, hem kocam Baura, Musa’nın dinindendir. Askerleri sevk ve idare etmek, yurdu yönetmek kralın işidir, kocam Baura’nın değil.’</w:t>
-      </w:r>
-    </w:p>
-    <w:p>
-      <w:pPr>
-        <w:rPr>
-          <w:rFonts w:ascii="Courier New" w:hAnsi="Courier New" w:cs="Courier New"/>
-        </w:rPr>
-      </w:pPr>
-      <w:r>
-        <w:rPr>
-          <w:rFonts w:ascii="Courier New" w:hAnsi="Courier New" w:cs="Courier New"/>
-        </w:rPr>
-        <w:t>‘Musa peygamberdir, onun yurda geldiğini duyan insanlar üç yüz yıllık Baura’nın itibarını çiğneyerek koşarlar yamacına, onun ismini unuturlar efendim’ dedirttim vezire boynunu büktürerek. Belam Bin Baura’ya ve eşine epeyce mücevherler vermekle kalmadılar, bir de kraldan hemen sonra tüm yetkilere sahip tek kişi olacağına dair söz verdirdim Vezir Balakt’a.”</w:t>
+        <w:t>‘Bir adam ne yapabilir koca orduya, hem kocam Belam, Musa’nın dinindendir. Askerleri sevk ve idare etmek, yurdu yönetmek kralın işidir, kocam Belam’ın değil.’</w:t>
+      </w:r>
+    </w:p>
+    <w:p>
+      <w:pPr>
+        <w:rPr>
+          <w:rFonts w:ascii="Courier New" w:hAnsi="Courier New" w:cs="Courier New"/>
+        </w:rPr>
+      </w:pPr>
+      <w:r>
+        <w:rPr>
+          <w:rFonts w:ascii="Courier New" w:hAnsi="Courier New" w:cs="Courier New"/>
+        </w:rPr>
+        <w:t>‘Musa peygamberdir, onun yurda geldiğini duyan insanlar üç yüz yıllık Belam’ın itibarını çiğneyerek koşarlar yamacına, onun ismini unuturlar efendim’ dedirttim vezire boynunu büktürerek. Belam Bin Baura’ya ve eşine epeyce mücevherler vermekle kalmadılar, bir de kraldan hemen sonra tüm yetkilere sahip tek kişi olacağına dair söz verdirdim Vezir Balakt’a.”</w:t>
       </w:r>
     </w:p>
     <w:p>
@@ -9658,7 +9647,7 @@
         <w:rPr>
           <w:rFonts w:ascii="Courier New" w:hAnsi="Courier New" w:cs="Courier New"/>
         </w:rPr>
-        <w:t>‘Acele işe şeytan demek bu şekilde karışıyordu’ Diye geçirdi Ceylan yani buradaki ismiyle yolcu…</w:t>
+        <w:t>‘Acele işe şeytan demek bu şekilde karışıyordu’ diye içinden geçirdi Ceylan yani buradaki ismiyle yolcu…</w:t>
       </w:r>
     </w:p>
     <w:p>
@@ -9697,7 +9686,7 @@
         <w:rPr>
           <w:rFonts w:ascii="Courier New" w:hAnsi="Courier New" w:cs="Courier New"/>
         </w:rPr>
-        <w:t>‘Yahu Efendi, sözlerim tesir etmez mi sana, kocam Baura Musa’nın dinindendir, ona nasıl beddua eder?’</w:t>
+        <w:t>‘Yahu Efendi, sözlerim tesir etmez mi sana, kocam Belam Musa’nın dinindendir, ona nasıl beddua eder?’</w:t>
       </w:r>
     </w:p>
     <w:p>
@@ -9723,7 +9712,7 @@
         <w:rPr>
           <w:rFonts w:ascii="Courier New" w:hAnsi="Courier New" w:cs="Courier New"/>
         </w:rPr>
-        <w:t>Kadın sözleri ölçüp tartmıştı babacığım, hemen şöyle dedi; ‘tamam bu işi bitmiş bilin’ Artık kesinlikle emindim ki mızrağın keskin bir ucu sağlam ellerdeydi ve Belam Bin Baura’yı diğer ucu bekliyordu.</w:t>
+        <w:t>Kadın sözleri ölçüp tartmıştı babacığım, hemen şöyle dedi; ‘Tamam bu işi bitmiş bilin.’ Artık kesinlikle emindim ki mızrağın keskin bir ucu sağlam ellerdeydi ve Belam Bin Baura’yı diğer ucu bekliyordu.</w:t>
       </w:r>
     </w:p>
     <w:p>
@@ -9775,7 +9764,7 @@
         <w:rPr>
           <w:rFonts w:ascii="Courier New" w:hAnsi="Courier New" w:cs="Courier New"/>
         </w:rPr>
-        <w:t>‘Beyim, bu belde küçük, milleti azizdir. Üç yüz beş yıldır, bize sahiplenir, saygıda kusur etmezler, ikramlarından beri koymazlar. Buralara bir başkasının karıştırmasına gerek yok’ dedi kadın. Bu sefer Baura’nın kalbine öfkeyle harmanlanmış kibri verdim ve Baura karısına;</w:t>
+        <w:t>‘Beyim, bu belde küçük, milleti azizdir. Üç yüz beş yıldır, bizi sahiplenir, saygıda kusur etmezler, ikramlarından beri koymazlar. Buralara bir başkasının karıştırmasına gerek yok’ dedi kadın. Bu sefer Belam’ın kalbine öfkeyle harmanlanmış kibri verdim ve Belam karısına;</w:t>
       </w:r>
     </w:p>
     <w:p>
@@ -9840,20 +9829,20 @@
         <w:rPr>
           <w:rFonts w:ascii="Courier New" w:hAnsi="Courier New" w:cs="Courier New"/>
         </w:rPr>
-        <w:t>‘Musa Peygamber buraya altı yüz bin kişilik ordusuyla gelirse, herkes ona yönelir. Seni seven kalmaz, peşinden gelen olmaz, eskisi gibi rağbet görmeyiz, bizi yedirmezler, içirmez, bakmazlar.’ derken, ben de Baura’nın üstünden, bir yarayı hafifçe tedavi eder gibi üfleyerek Hak kaftanını sıyırıp aldım. Kisve libasını ona o kadar ağır giydirdim ki…</w:t>
-      </w:r>
-    </w:p>
-    <w:p>
-      <w:pPr>
-        <w:rPr>
-          <w:rFonts w:ascii="Courier New" w:hAnsi="Courier New" w:cs="Courier New"/>
-        </w:rPr>
-      </w:pPr>
-      <w:r>
-        <w:rPr>
-          <w:rFonts w:ascii="Courier New" w:hAnsi="Courier New" w:cs="Courier New"/>
-        </w:rPr>
-        <w:t>Sonra, Baura sakalını sıvazladı, kadın sözünü hiç kesmeden konuşuyor, bir yandan da vezirin getirdiği sandıkları birer ikişer açıyordu babacığım. Kadın fermanı çıkarttı ve sordu;</w:t>
+        <w:t>‘Musa Peygamber buraya altı yüz bin kişilik ordusuyla gelirse, herkes ona yönelir. Seni seven kalmaz, peşinden gelen olmaz, eskisi gibi rağbet görmeyiz, bizi yedirmezler, içirmez, bakmazlar.’ derken, ben de Belam’ın üstünden, bir yarayı hafifçe tedavi eder gibi üfleyerek Hak kaftanını sıyırıp aldım. Kisve libasını ona o kadar ağır giydirdim ki…</w:t>
+      </w:r>
+    </w:p>
+    <w:p>
+      <w:pPr>
+        <w:rPr>
+          <w:rFonts w:ascii="Courier New" w:hAnsi="Courier New" w:cs="Courier New"/>
+        </w:rPr>
+      </w:pPr>
+      <w:r>
+        <w:rPr>
+          <w:rFonts w:ascii="Courier New" w:hAnsi="Courier New" w:cs="Courier New"/>
+        </w:rPr>
+        <w:t>Sonra, Belam sakalını sıvazladı, kadın sözünü hiç kesmeden konuşuyor, bir yandan da vezirin getirdiği sandıkları birer ikişer açıyordu babacığım. Kadın fermanı çıkarttı ve sordu;</w:t>
       </w:r>
     </w:p>
     <w:p>
@@ -9892,20 +9881,20 @@
         <w:rPr>
           <w:rFonts w:ascii="Courier New" w:hAnsi="Courier New" w:cs="Courier New"/>
         </w:rPr>
-        <w:t>‘Bu senin için kralın bizzat kendinden çıkmış bir fermandır, kraldan sonra bu ülkedeki ilk söz sahibi senin olacağına dair.’</w:t>
-      </w:r>
-    </w:p>
-    <w:p>
-      <w:pPr>
-        <w:rPr>
-          <w:rFonts w:ascii="Courier New" w:hAnsi="Courier New" w:cs="Courier New"/>
-        </w:rPr>
-      </w:pPr>
-      <w:r>
-        <w:rPr>
-          <w:rFonts w:ascii="Courier New" w:hAnsi="Courier New" w:cs="Courier New"/>
-        </w:rPr>
-        <w:t>Baura’nın gözleri ceviz gibi büyüdü, hayretini yüzünden karısı bile okuyordu.</w:t>
+        <w:t>‘Bu senin için kralın bizzat kendinden çıkmış bir fermandır, kraldan sonra bu ülkedeki ilk söz sahibinin sen olacağına dair.’</w:t>
+      </w:r>
+    </w:p>
+    <w:p>
+      <w:pPr>
+        <w:rPr>
+          <w:rFonts w:ascii="Courier New" w:hAnsi="Courier New" w:cs="Courier New"/>
+        </w:rPr>
+      </w:pPr>
+      <w:r>
+        <w:rPr>
+          <w:rFonts w:ascii="Courier New" w:hAnsi="Courier New" w:cs="Courier New"/>
+        </w:rPr>
+        <w:t>Belam’ın gözleri ceviz gibi büyüdü, hayretini yüzünden karısı bile okuyordu.</w:t>
       </w:r>
     </w:p>
     <w:p>
@@ -9931,7 +9920,7 @@
         <w:rPr>
           <w:rFonts w:ascii="Courier New" w:hAnsi="Courier New" w:cs="Courier New"/>
         </w:rPr>
-        <w:t>‘Musaa peygamberdir, ona beddua edemezsin bey, bari dua et de bu beldeye gelmesin, gelemesin.’</w:t>
+        <w:t>‘Musa peygamberdir, ona beddua edemezsin bey, bari dua et de bu beldeye gelmesin, gelemesin.’</w:t>
       </w:r>
     </w:p>
     <w:p>
@@ -10015,33 +10004,33 @@
         <w:rPr>
           <w:rFonts w:ascii="Courier New" w:hAnsi="Courier New" w:cs="Courier New"/>
         </w:rPr>
-        <w:t>Mikail de Ceylanın burada olduğunu biliyordu, şeytan ve oğulları Hanzeb’i işaret ediyor zannetmişlerdi. Oysa Mikail Ceylanı işaret etmişti yolcu diyerek.</w:t>
-      </w:r>
-    </w:p>
-    <w:p>
-      <w:pPr>
-        <w:rPr>
-          <w:rFonts w:ascii="Courier New" w:hAnsi="Courier New" w:cs="Courier New"/>
-        </w:rPr>
-      </w:pPr>
-      <w:r>
-        <w:rPr>
-          <w:rFonts w:ascii="Courier New" w:hAnsi="Courier New" w:cs="Courier New"/>
-        </w:rPr>
-        <w:t>“Hakk’ın yolundan sapıtan Belam Bin Baura, İsm-i Âzam duası için aldı merkebini, dua edeceği yere doğru yola çıktı. Allah ona yine de adaletle hükmetti. Gözleri görüyordu ama Hakk’a kördü, kulakları duyuyordu ama işitmiyordu. Önce merkebi konuştu onunla, ‘Dur Baura nereye gidersin? Musa peygamberdir ve Allah’ın buyruğu ile yola revan olmuştur. Sen Musa’ya değil, Allah’a isyan edersin’ dediğinde, hemen Baura’nın kulağına eğilip şöyle fısıldadım;</w:t>
-      </w:r>
-    </w:p>
-    <w:p>
-      <w:pPr>
-        <w:rPr>
-          <w:rFonts w:ascii="Courier New" w:hAnsi="Courier New" w:cs="Courier New"/>
-        </w:rPr>
-      </w:pPr>
-      <w:r>
-        <w:rPr>
-          <w:rFonts w:ascii="Courier New" w:hAnsi="Courier New" w:cs="Courier New"/>
-        </w:rPr>
-        <w:t>‘Yürü Baura sen, merkebini konuşturan şeytandır’ Belam buna normalde inanmazdı ama Hak olandan kalbi ayrılınca, aklı örtüldü. Sonra ağaçları, çeşitli hayvan, bitki ve taşların onu yolundan çevirmek için ettiği her söze ‘Bu şeytandandır’ deyince, merkebi ilerlemeyi bıraktı.”</w:t>
+        <w:t>Mikail de Ceylan’ın burada olduğunu biliyordu, şeytan ve oğulları Hanzeb’i işaret ediyor zannetmişlerdi. Oysa Mikail Ceylan’ı işaret etmişti yolcu diyerek.</w:t>
+      </w:r>
+    </w:p>
+    <w:p>
+      <w:pPr>
+        <w:rPr>
+          <w:rFonts w:ascii="Courier New" w:hAnsi="Courier New" w:cs="Courier New"/>
+        </w:rPr>
+      </w:pPr>
+      <w:r>
+        <w:rPr>
+          <w:rFonts w:ascii="Courier New" w:hAnsi="Courier New" w:cs="Courier New"/>
+        </w:rPr>
+        <w:t>“Hakk’ın yolundan sapıtan Belam Bin Baura, İsm-i Âzam duası için aldı merkebini, dua edeceği yere doğru yola çıktı. Allah ona yine de adaletle hükmetti. Gözleri görüyordu ama Hakk’a kördü, kulakları duyuyordu ama işitmiyordu. Önce merkebi konuştu onunla, ‘Dur Belam nereye gidersin? Musa peygamberdir ve Allah’ın buyruğu ile yola revan olmuştur. Sen Musa’ya değil, Allah’a isyan edersin’ dediğinde, hemen Belam’ın kulağına eğilip şöyle fısıldadım;</w:t>
+      </w:r>
+    </w:p>
+    <w:p>
+      <w:pPr>
+        <w:rPr>
+          <w:rFonts w:ascii="Courier New" w:hAnsi="Courier New" w:cs="Courier New"/>
+        </w:rPr>
+      </w:pPr>
+      <w:r>
+        <w:rPr>
+          <w:rFonts w:ascii="Courier New" w:hAnsi="Courier New" w:cs="Courier New"/>
+        </w:rPr>
+        <w:t>‘Yürü Belam sen, merkebini konuşturan şeytandır.’ Belam buna normalde inanmazdı ama Hak olandan kalbi ayrılınca, aklı örtüldü. Sonra ağaçların, çeşitli hayvan, bitki ve taşların onu yolundan çevirmek için ettiği her söze ‘Bu şeytandandır’ deyince, merkebi ilerlemeyi bıraktı.”</w:t>
       </w:r>
     </w:p>
     <w:p>
@@ -10080,7 +10069,7 @@
         <w:rPr>
           <w:rFonts w:ascii="Courier New" w:hAnsi="Courier New" w:cs="Courier New"/>
         </w:rPr>
-        <w:t>“‘Yürü be melun merkep, geri döner miyim ben senin, dağların, taşların sözüyle? Onca insan bana geri dön dediler de dönmedim, şimdi dönersem onlar bana demezler mi bizi değil de hayvanları, nebatatı, dağları, taşları dinledin?’ dedi ve merkebine vurunca, merkebi de onu çifteleyip, dövmeye başladı. Sonunda merkebinden kaçmayı başaran Baura, duasını edeceği yere doğru yürüyerek yoluna devam etti.”</w:t>
+        <w:t>“‘Yürü be melun merkep, geri döner miyim ben senin, dağların, taşların sözüyle? Onca insan bana geri dön dediler de dönmedim, şimdi dönersem onlar bana demezler mi bizi değil de hayvanları, nebatatı, dağları, taşları dinledin?’ dedi ve merkebine vurunca, merkebi de onu çifteleyip, dövmeye başladı. Sonunda merkebinden kaçmayı başaran Belam, duasını edeceği yere doğru yürüyerek yoluna devam etti.”</w:t>
       </w:r>
     </w:p>
     <w:p>
@@ -10106,7 +10095,7 @@
         <w:rPr>
           <w:rFonts w:ascii="Courier New" w:hAnsi="Courier New" w:cs="Courier New"/>
         </w:rPr>
-        <w:t>“Musa ve ordusu Konkoça Sahrasına geldiklerinde, Belam Bin Baura duasını etmişti. Akşama kadar yol gidiyorlar, gece çökünce istirahate çekiliyorlar, sabah kalktıklarında kendilerini yola henüz çıktıkları aynı yerde buluyorlardı. Bu kırk gün böyle devam etti. Sonunda Musa, ellerini semaya kaldırdı ve dua etti.</w:t>
+        <w:t>“Musa ve ordusu Konkoça Sahrası’na geldiklerinde, Belam Bin Baura duasını etmişti. Akşama kadar yol gidiyorlar, gece çökünce istirahate çekiliyorlar, sabah kalktıklarında kendilerini yola henüz çıktıkları aynı yerde buluyorlardı. Bu kırk gün böyle devam etti. Sonunda Musa, ellerini semaya kaldırdı ve dua etti.</w:t>
       </w:r>
     </w:p>
     <w:p>
@@ -10145,7 +10134,7 @@
         <w:rPr>
           <w:rFonts w:ascii="Courier New" w:hAnsi="Courier New" w:cs="Courier New"/>
         </w:rPr>
-        <w:t>Mikail, göz alabildiğince kalabalığı neredeyse her birini süzdükten sonra şeytana döndü güneşten parlak yüzünü.</w:t>
+        <w:t>Mikail, göz alabildiğince kalabalığın neredeyse her birini süzdükten sonra şeytana döndü güneşten parlak yüzünü.</w:t>
       </w:r>
     </w:p>
     <w:p>
@@ -10210,26 +10199,26 @@
         <w:rPr>
           <w:rFonts w:ascii="Courier New" w:hAnsi="Courier New" w:cs="Courier New"/>
         </w:rPr>
-        <w:t xml:space="preserve">“Siz fitne silahını insan üstünde kullanırsınız biliriz. Planlayıcıların en güzeli ve yüceler yücesi Allah’tır, İsmini dahi söyleyemediğiniz kişi, yaratılmışların en güzeli ve alemlerin onun yüzü suyu hürmetine yaratan Allah’a yemin olsun ki yeryüzüne gönderildi. Yeryüzünde Muhammed suretinde görünen ve alemlere rahmet olarak gönderilen Hazreti Muhammed Mustafa (SAV), sadece insanlara değil, sizlere de elçi olarak gönderildi ve siz burada birbirinizi ağırlarken, Belam Bin Baura’dan ona ayetler indirildi. İnsana Kadir ismi öğretildi, Kadir ölçüdür ve fitnenin kalkanıdır. Kadir’in yazılı olanına Kur’an, yaşayanına Hazreti Muhammed denir bilesiniz, o ölçü kalkanını kullanan kişiler çıkarttığınız </w:t>
-      </w:r>
-      <w:r>
-        <w:rPr>
-          <w:rFonts w:ascii="Courier New" w:hAnsi="Courier New" w:cs="Courier New"/>
-        </w:rPr>
-        <w:t>fitnelerin zamanlarından geçerlerken, fitne mızraklarından, oklarından kısacası silahlarından muhafaza olacaklar. Oğulların ümmeti Muhammed’in dinine geçiyorlar saflar halinde” dedikten sonra kalabalığı işaret ederek, eksilen cinleri gösterdi.</w:t>
-      </w:r>
-    </w:p>
-    <w:p>
-      <w:pPr>
-        <w:rPr>
-          <w:rFonts w:ascii="Courier New" w:hAnsi="Courier New" w:cs="Courier New"/>
-        </w:rPr>
-      </w:pPr>
-      <w:r>
-        <w:rPr>
-          <w:rFonts w:ascii="Courier New" w:hAnsi="Courier New" w:cs="Courier New"/>
-        </w:rPr>
-        <w:t>“İşte onlar, az önce Hazreti Muhammed ile yer aleminde buluşup, getirdiği dinine geçen Müslüman cinler oldular. Miraç da yaşandı, Beraat de Kadir de. Sen burada ismi artık Allah tarafından ‘Herif’ diye yad edilen Belam’a çıkarttığın fitneden gururla bahsedersin ama insana sadece seçeneksin. İnsanı düşürdüğünüz her gaflet, Allah’tan bir rahmet olarak tezahür ediyor, kıyamete kadar da bu böyle sürecektir. Çünkü Allah affetmeyi çokça sevendir.”</w:t>
+        <w:t xml:space="preserve">“Siz fitne silahını insan üstünde kullanırsınız biliriz. Planlayıcıların en güzeli ve yüceler yücesi Allah’tır, İsmini dahi söyleyemediğiniz kişi, yaratılmışların en güzeli ve alemleri onun yüzü suyu hürmetine yaratan Allah’a yemin olsun ki yeryüzüne gönderildi. Yeryüzünde Muhammed suretinde görünen ve alemlere rahmet olarak gönderilen Hazreti Muhammed Mustafa (SAV), sadece insanlara değil, sizlere de elçi olarak gönderildi ve siz burada birbirinizi ağırlarken, Belam Bin Baura’dan ona ayetler indirildi. İnsana Kadir ismi öğretildi, Kadir ölçüdür ve fitnenin kalkanıdır. Kadir’in yazılı olanına Kur’an, yaşayanına Hazreti Muhammed denir bilesiniz, o ölçü kalkanını kullanan kişiler çıkarttığınız </w:t>
+      </w:r>
+      <w:r>
+        <w:rPr>
+          <w:rFonts w:ascii="Courier New" w:hAnsi="Courier New" w:cs="Courier New"/>
+        </w:rPr>
+        <w:t>fitnelerin zamanlarından geçerlerken, fitne mızraklarından, oklarından kısacası silahlarından muhafaza olacaklar. Oğulların ümmet-i Muhammed’in dinine geçiyorlar saflar halinde” dedikten sonra kalabalığı işaret ederek, eksilen cinleri gösterdi.</w:t>
+      </w:r>
+    </w:p>
+    <w:p>
+      <w:pPr>
+        <w:rPr>
+          <w:rFonts w:ascii="Courier New" w:hAnsi="Courier New" w:cs="Courier New"/>
+        </w:rPr>
+      </w:pPr>
+      <w:r>
+        <w:rPr>
+          <w:rFonts w:ascii="Courier New" w:hAnsi="Courier New" w:cs="Courier New"/>
+        </w:rPr>
+        <w:t>“İşte onlar, az önce Hazreti Muhammed ile yer aleminde buluşup, getirdiği dinine geçen Müslüman cinler oldular. Miraç da yaşandı, Beraat de Kadir de. Sen burada ismi artık Allah tarafından ‘Herif’ diye yâd edilen Belam’a çıkarttığın fitneden gururla bahsedersin ama insana sadece seçeneksin. İnsanı düşürdüğünüz her gaflet, Allah’tan bir rahmet olarak tezahür ediyor, kıyamete kadar da bu böyle sürecektir. Çünkü Allah affetmeyi çokça sevendir.”</w:t>
       </w:r>
     </w:p>
     <w:p>
@@ -10268,7 +10257,7 @@
         <w:rPr>
           <w:rFonts w:ascii="Courier New" w:hAnsi="Courier New" w:cs="Courier New"/>
         </w:rPr>
-        <w:t xml:space="preserve">Ceylan biraz daha iyi anlamıştı, Allah’ın yarattıklarının içerisinde en başta gelen, hatta alemleri onun yüzü suyu hürmetine yarattığını öğrenmişti. O isim cennetin kapısından sonra, ceylanın derisine yazılmıştı. Bu ne büyük bir şerefti, bu ne büyük bir nasipti, tattığı ecel vardı terazinin bir kefesinde, diğer kefesinde </w:t>
+        <w:t xml:space="preserve">Ceylan biraz daha iyi anlamıştı, Allah’ın yarattıklarının içerisinde en başta geleni, hatta alemleri onun yüzü suyu hürmetine yarattığını öğrenmişti. O isim cennetin kapısından sonra, ceylanın derisine yazılmıştı. Bu ne büyük bir şerefti, bu ne büyük bir nasipti, tattığı ecel vardı terazinin bir kefesinde, diğer kefesinde </w:t>
       </w:r>
       <w:r>
         <w:rPr>
@@ -10314,7 +10303,7 @@
     </w:p>
     <w:p>
       <w:r>
-        <w:t>Bunu düşünüyordum şimdi mektubun cümleleri bittiğinde, düşünürken yazmak, okurken düşünmek derken, düşüncelerimi gönlümden geçtiği gibi akıtmaya karar verdim satırlarıma. Aşk neydi, Allah’tan başkasına âşık olmak haram mıydı? Baura belli ki kıymetlisini, kıymetlisi de belli ki kıymet vereninin katili olmuştu. İkisi de dünya malı için ahiretlerini harcamışlardı. Helal olan aşklarında hata yok, çünkü aşk değil, aşıklar düşer hataya, aşk tüm kusursuzluğu ile orada dimdik kalem gibi duruyor.</w:t>
+        <w:t>Bunu düşünüyordum şimdi mektubun cümleleri bittiğinde, düşünürken yazmak, okurken düşünmek derken, düşüncelerimi gönlümden geçtiği gibi akıtmaya karar verdim satırlarıma. Aşk neydi, Allah’tan başkasına âşık olmak haram mıydı? Belam belli ki kıymetlisini, kıymetlisi de belli ki kıymet vereninin katili olmuştu. İkisi de dünya malı için ahiretlerini harcamışlardı. Helal olan aşklarında hata yok, çünkü aşk değil, âşıklar düşer hataya, aşk tüm kusursuzluğu ile orada dimdik kalem gibi duruyor.</w:t>
       </w:r>
     </w:p>
     <w:p>
@@ -10348,7 +10337,7 @@
         <w:rPr>
           <w:rFonts w:ascii="Courier New" w:hAnsi="Courier New" w:cs="Courier New"/>
         </w:rPr>
-        <w:t>Ademler gelir geçer bir handadır</w:t>
+        <w:t>Âdemler gelir geçer bir handadır</w:t>
       </w:r>
     </w:p>
     <w:p>
@@ -10429,7 +10418,7 @@
     </w:p>
     <w:p>
       <w:r>
-        <w:t>Bahçeye indim. Büfeden iki tost aldım. Kendi çayımı da bir bardağa koyup üst kata çıkınca, Vildan Hanım evrakların arasında başını kaldırdı.</w:t>
+        <w:t>Bahçeye indim. Büfeden iki tost aldım. Kendi çayımı da bir bardağa koyup üst kata çıkınca, Vildan Hanım evrakların arasından başını kaldırdı.</w:t>
       </w:r>
     </w:p>
     <w:p>
@@ -10565,7 +10554,7 @@
     </w:p>
     <w:p>
       <w:r>
-        <w:t>Kâğıdı önüme çektim. Beni kızdırmıştı. Sonra düşündüm; güzel bir sözün ağırlığını arttırmak için niye ille de uzaktan gelmesi gerekiyordu? Sözü değil, gönderen zarfı mı okuyordum ben?</w:t>
+        <w:t>Kâğıdı önüme çektim. Beni kızdırmıştı. Sonra düşündüm; güzel bir sözün ağırlığını artırmak için niye ille de uzaktan gelmesi gerekiyordu? Sözü değil, gönderen zarfı mı okuyordum ben?</w:t>
       </w:r>
     </w:p>
     <w:p>
@@ -10602,7 +10591,7 @@
         <w:rPr>
           <w:rFonts w:ascii="Courier New" w:hAnsi="Courier New" w:cs="Courier New"/>
         </w:rPr>
-        <w:t xml:space="preserve">Ailesinin biriciği Mabeh için yeniden doğduğu gündü bugün. Anne ve babası o kadar üzerine titriyorlardı ki, onun diğer çocuklar gibi sokağa salmayı hiç göze alamamışlardı. Ancak birkaç yıl sonra, bunun yanlış bir karar olduğuna hükmetmiş, onu ilk defa dışarı yollamışlardı. Bir dönem İsfihan’da hanedanlık yapmış Abülmülk ailenin son temsilcisi olarak, bu onun ilk çıkışıyla henüz başlamıştı. Dönemin Mecusi alimlerinin ilgisini üstünde toplamıştı. Kısa bir süre sonra ona en önemli vazife verilmişti; ateşi diri tutmak ve körüklemek. Dİhkan sınıfından gelen bu genç, yönetici konumda olmasına rağmen nöbetlere riayet ediyor, görevini eksiksiz yapıyordu, ancak körük ateşi harlamakla kalmıyor, susuzluğunu da körüklüyordu. Yakınlarında bulunan bir manastır vardı ama orada hiç ayine denk gelmemişti ancak işte o gün bugündü. </w:t>
+        <w:t xml:space="preserve">Ailesinin biriciği Mabeh için yeniden doğduğu gündü bugün. Anne ve babası o kadar üzerine titriyorlardı ki, onu diğer çocuklar gibi sokağa salmayı hiç göze alamamışlardı. Ancak birkaç yıl sonra, bunun yanlış bir karar olduğuna hükmetmiş, onu ilk defa dışarı yollamışlardı. Bir dönem İsfihan’da hanedanlık yapmış Abülmülk ailesinin son temsilcisi olarak, bu onun ilk çıkışıyla henüz başlamıştı. Dönemin Mecusi alimlerinin ilgisini üstünde toplamıştı. Kısa bir süre sonra ona en önemli vazife verilmişti; ateşi diri tutmak ve körüklemek. Dihkan sınıfından gelen bu genç, yönetici konumda olmasına rağmen nöbetlere riayet ediyor, görevini eksiksiz yapıyordu, ancak körük ateşi harlamakla kalmıyor, susuzluğunu da körüklüyordu. Yakınlarında bulunan bir manastır vardı ama orada hiç ayine denk gelmemişti ancak işte o gün bugündü. </w:t>
       </w:r>
       <w:r>
         <w:rPr>
@@ -10621,7 +10610,7 @@
         <w:rPr>
           <w:rFonts w:ascii="Courier New" w:hAnsi="Courier New" w:cs="Courier New"/>
         </w:rPr>
-        <w:t>Babası hiç alışık olmadığı bu gecikmeden dolayı öfke küpüne dönmüş, geldiği anda onu hesaba çekmişti. Hakk bir dinin susuzluğu ile yanan Mabeh, dürüstçe babasına olup, biteni anlatmış ve babası tarafından evdeki bir odaya zincirlenmişti. Ancak bu sefer mızrak çuvala sığmıyordu, içindeki Hak ateşi, taptığı hiçbir ateş kadar yakıcı değildi. Sonunda bir yolunu bulup, evden kaçıp, tanıştığı rahiplere sığınmıştı. Orada bulunan piskopos, bu işi Şam yakınlarında bir başka piskopostan öğrendiği anda tarif edilen yere gitmiştir.</w:t>
+        <w:t>Babası hiç alışık olmadığı bu gecikmeden dolayı öfke küpüne dönmüş, geldiği anda onu hesaba çekmişti. Hak bir dinin susuzluğu ile yanan Mabeh, dürüstçe babasına olup biteni anlatmış ve babası tarafından evdeki bir odaya zincirlenmişti. Ancak bu sefer mızrak çuvala sığmıyordu, taptığı hiçbir ateş, içindeki Hak ateşi kadar yakıcı değildi. Sonunda bir yolunu bulup, evden kaçıp, tanıştığı rahiplere sığınmıştı. Orada bulunan piskopostan, bu işi Şam yakınlarında bir başka piskoposun bildiğini öğrendiği anda tarif edilen yere gitmiştir.</w:t>
       </w:r>
     </w:p>
     <w:p>
@@ -10653,65 +10642,65 @@
         <w:rPr>
           <w:rFonts w:ascii="Courier New" w:hAnsi="Courier New" w:cs="Courier New"/>
         </w:rPr>
-        <w:t>selamlarımı söyle, o senin aradığın kişidir” demiştir. Mabeh, piskoposu defnettikten sonra, Musul’da tarif edilen kişiyi bulur, durumunu anlatır ve buradaki manastıra yerleşir. İlginçtir ki buradaki kimsede bir süre sonra vefat eder. Vefatından az önce de arayışını bildiği Mabeh’e Nusaybin’de gerçek Hristiyanlığı yaşayan bir ismi işaret eder. Musul’daki şahıs öldükten sonra, oradaki kişilerin dinlerini nasıl yozlaştırdıklarına tanıklık eder ve tavsiye edilen yere gitmek üzere yola çıkar. Burada da aradığı kısmen bulur ancak artık ömrünün son günlerini yaşayan rahip, ona son nefesinde Rum diyarında bulunan Amuriye (Sivrihisar) taraflarında bir manastırı tavsiye eder. Bu onun son durağıdır ancak genç Mabeh’in içinde yanan ateş hala serinlememiştir. Oysaki ona tavsiyede bulunacak bu kimse de hasta olmuş ve öleceği belli olunca;</w:t>
-      </w:r>
-    </w:p>
-    <w:p>
-      <w:pPr>
-        <w:rPr>
-          <w:rFonts w:ascii="Courier New" w:hAnsi="Courier New" w:cs="Courier New"/>
-        </w:rPr>
-      </w:pPr>
-      <w:r>
-        <w:rPr>
-          <w:rFonts w:ascii="Courier New" w:hAnsi="Courier New" w:cs="Courier New"/>
-        </w:rPr>
-        <w:t>“Evladım, ben gerçek Hristiyanlığın son temsilcisiyim, benim bildiğim kimse yoktur, ancak üstadımız bana bir İncil’den bahsetmişti, onu bizzat okumadım ama üstadım bizzat kendisi okumuş, bir ceylan derisine yazılmış Barnabas İncilinde yazılanları ve onun bana söylediklerini sana aynen aktarıyorum;</w:t>
-      </w:r>
-    </w:p>
-    <w:p>
-      <w:pPr>
-        <w:rPr>
-          <w:rFonts w:ascii="Courier New" w:hAnsi="Courier New" w:cs="Courier New"/>
-        </w:rPr>
-      </w:pPr>
-      <w:r>
-        <w:rPr>
-          <w:rFonts w:ascii="Courier New" w:hAnsi="Courier New" w:cs="Courier New"/>
-        </w:rPr>
-        <w:t xml:space="preserve">“Ahir zaman peygamberinin gölgesi üzerimize düşmüştür. O kişi İbrahim Peygamber (AS) dini üzerine gelecekmiş. Kendisinin Arap topraklarından ortaya çıkacak, hurma </w:t>
-      </w:r>
-      <w:r>
-        <w:rPr>
-          <w:rFonts w:ascii="Courier New" w:hAnsi="Courier New" w:cs="Courier New"/>
-        </w:rPr>
-        <w:t>bahçelerinin bolca olduğu bir yere hicret edecekmiş. Hurma bahçeleri bolca bulunan yeri bul, Arabistan Hicaz bölgesinden gelecek olan ahir zaman peygamberinin kim olduğunu anlamak için onda şu üç alameti ara; 1.Hediyenden yer 2.Ama sadakandan yemez ve sonuncu alameti de iki kürek kemiği arasındaki peygamberlik mührüdür. O diyara gitmeye gücün yeterse git, tanrı seninle olsun evladım” bir süre sonra ölen rahipten sonra, Mabeh o diyarda kalmış, çalışmış, bir miktar servet biriktirip, koyun ve büyük baş hayvanlar satın almıştır.</w:t>
-      </w:r>
-    </w:p>
-    <w:p>
-      <w:pPr>
-        <w:rPr>
-          <w:rFonts w:ascii="Courier New" w:hAnsi="Courier New" w:cs="Courier New"/>
-        </w:rPr>
-      </w:pPr>
-      <w:r>
-        <w:rPr>
-          <w:rFonts w:ascii="Courier New" w:hAnsi="Courier New" w:cs="Courier New"/>
-        </w:rPr>
-        <w:t>Günlerden bir gün, Hicaz bölgesine gidecek olan Yahudi bir kervancı başı ile tanışır. Elinde bulunan davarların karşılığında, onlarla gidebileceğini, Arap Haydutlarına saldırılarına karşı koruma karşılığında, güvenli bir şekilde Yesrib diyarına ulaşabileceğini söyler. Ancak Yesrib’e belli bir mesafe kala kervan baskın yemiş, bazı mallarına karşı, Yahudi kervancı başı, sözünde durmayarak Mabeh’i köle olarak satmıştır. Yesrib’e götürülen Mabeh, bir hurma bahçesinde çalıştırılmak üzere, yine bir Yahudi’ye satılmıştır. Köledir ama onun göğsündeki iman ateşini, Hakk’a susamışlığını giderecek olan Mabeh, Amuriye Rahibi’nin tasvir ettiği şehir ile Yesrib’in aynı yer olup olmadığından henüz emin olmuştur. Sahibi olan Yahudi ile hurma bahçesinde çalışırken, komşu bahçenin sahibi olan bir başka yanına koşarak gelmişti;</w:t>
-      </w:r>
-    </w:p>
-    <w:p>
-      <w:pPr>
-        <w:rPr>
-          <w:rFonts w:ascii="Courier New" w:hAnsi="Courier New" w:cs="Courier New"/>
-        </w:rPr>
-      </w:pPr>
-      <w:r>
-        <w:rPr>
-          <w:rFonts w:ascii="Courier New" w:hAnsi="Courier New" w:cs="Courier New"/>
-        </w:rPr>
-        <w:t>“Duydun mu? Yesrib’e Kuba köyüne hicret etmiş diyorlar.”</w:t>
+        <w:t>selamlarımı söyle, o senin aradığın kişidir” demiştir. Mabeh, piskoposu defnettikten sonra, Musul’da tarif edilen kişiyi bulur, durumunu anlatır ve buradaki manastıra yerleşir. İlginçtir ki buradaki kimse de bir süre sonra vefat eder. Vefatından az önce de arayışını bildiği Mabeh’e Nusaybin’de gerçek Hristiyanlığı yaşayan bir ismi işaret eder. Musul’daki şahıs öldükten sonra, oradaki kişilerin dinlerini nasıl yozlaştırdıklarına tanıklık eder ve tavsiye edilen yere gitmek üzere yola çıkar. Burada da aradığını kısmen bulur ancak artık ömrünün son günlerini yaşayan rahip, ona son nefesinde Rum diyarında bulunan Amuriye (bugünkü Emirdağ yakınları) taraflarında bir manastırı tavsiye eder. Bu onun son durağıdır ancak genç Mabeh’in içinde yanan ateş hâlâ serinlememiştir. Oysaki ona tavsiyede bulunacak bu kimse de hasta olmuş ve öleceği belli olunca;</w:t>
+      </w:r>
+    </w:p>
+    <w:p>
+      <w:pPr>
+        <w:rPr>
+          <w:rFonts w:ascii="Courier New" w:hAnsi="Courier New" w:cs="Courier New"/>
+        </w:rPr>
+      </w:pPr>
+      <w:r>
+        <w:rPr>
+          <w:rFonts w:ascii="Courier New" w:hAnsi="Courier New" w:cs="Courier New"/>
+        </w:rPr>
+        <w:t>“Evladım, ben gerçek Hristiyanlığın son temsilcisiyim, benim bildiğim kimse yoktur, ancak üstadımız bana bir İncil’den bahsetmişti, onu bizzat okumadım ama üstadım bizzat kendisi okumuş, bir ceylan derisine yazılmış Barnabas İncili’nde yazılanları ve onun bana söylediklerini sana aynen aktarıyorum;</w:t>
+      </w:r>
+    </w:p>
+    <w:p>
+      <w:pPr>
+        <w:rPr>
+          <w:rFonts w:ascii="Courier New" w:hAnsi="Courier New" w:cs="Courier New"/>
+        </w:rPr>
+      </w:pPr>
+      <w:r>
+        <w:rPr>
+          <w:rFonts w:ascii="Courier New" w:hAnsi="Courier New" w:cs="Courier New"/>
+        </w:rPr>
+        <w:t xml:space="preserve">“Ahir zaman peygamberinin gölgesi üzerimize düşmüştür. O kişi İbrahim Peygamber (AS) dini üzerine gelecekmiş. Kendisi Arap topraklarından ortaya çıkacak, hurma </w:t>
+      </w:r>
+      <w:r>
+        <w:rPr>
+          <w:rFonts w:ascii="Courier New" w:hAnsi="Courier New" w:cs="Courier New"/>
+        </w:rPr>
+        <w:t>bahçelerinin bolca olduğu bir yere hicret edecekmiş. Hurma bahçeleri bolca bulunan yeri bul, Arabistan Hicaz bölgesinden gelecek olan ahir zaman peygamberinin kim olduğunu anlamak için onda şu üç alameti ara; 1. Hediyenden yer 2. Ama sadakandan yemez ve sonuncu alameti de iki kürek kemiği arasındaki peygamberlik mührüdür. O diyara gitmeye gücün yeterse git, tanrı seninle olsun evladım.” Bir süre sonra ölen rahipten sonra, Mabeh o diyarda kalmış, çalışmış, bir miktar servet biriktirip, koyun ve büyük baş hayvanlar satın almıştır.</w:t>
+      </w:r>
+    </w:p>
+    <w:p>
+      <w:pPr>
+        <w:rPr>
+          <w:rFonts w:ascii="Courier New" w:hAnsi="Courier New" w:cs="Courier New"/>
+        </w:rPr>
+      </w:pPr>
+      <w:r>
+        <w:rPr>
+          <w:rFonts w:ascii="Courier New" w:hAnsi="Courier New" w:cs="Courier New"/>
+        </w:rPr>
+        <w:t>Günlerden bir gün, Hicaz bölgesine gidecek olan Kelb kabilesinden bir kervancı başı ile tanışır. Elinde bulunan davarların karşılığında, onlarla gidebileceğini, Arap haydutlarının saldırılarına karşı koruma karşılığında, güvenli bir şekilde Yesrib diyarına ulaşabileceğini söyler. Ancak Yesrib’e belli bir mesafe kala kervan baskın yemiş, bazı mallarına karşı, kervancı başı, sözünde durmayarak Mabeh’i Vâdi’l-Kurâ’da bir Yahudi’ye köle olarak satmıştır. Yesrib’e götürülen Mabeh, bir hurma bahçesinde çalıştırılmak üzere, o adamın amcasının oğluna satılmıştır. Köledir ama onun göğsündeki iman ateşini, Hakk’a susamışlığını giderecek olan Mabeh, Amuriye Rahibi’nin tasvir ettiği şehir ile Yesrib’in aynı yer olup olmadığından henüz emin olamamıştır. Sahibi olan Yahudi ile hurma bahçesinde çalışırken, komşu bahçenin sahibi olan bir başkası yanına koşarak gelmişti;</w:t>
+      </w:r>
+    </w:p>
+    <w:p>
+      <w:pPr>
+        <w:rPr>
+          <w:rFonts w:ascii="Courier New" w:hAnsi="Courier New" w:cs="Courier New"/>
+        </w:rPr>
+      </w:pPr>
+      <w:r>
+        <w:rPr>
+          <w:rFonts w:ascii="Courier New" w:hAnsi="Courier New" w:cs="Courier New"/>
+        </w:rPr>
+        <w:t>“Duydun mu? Yesrib’e, Kuba köyüne biri hicret etmiş diyorlar.”</w:t>
       </w:r>
     </w:p>
     <w:p>
@@ -10841,7 +10830,7 @@
         <w:rPr>
           <w:rFonts w:ascii="Courier New" w:hAnsi="Courier New" w:cs="Courier New"/>
         </w:rPr>
-        <w:t>Sadaka olarak ikram edilen hurmaları kendisine değil, çevresindekilere verildiğini görünce;</w:t>
+        <w:t>Sadaka olarak ikram edilen hurmaları kendisine değil, çevresindekilere verdiğini görünce;</w:t>
       </w:r>
     </w:p>
     <w:p>
@@ -10880,7 +10869,7 @@
         <w:rPr>
           <w:rFonts w:ascii="Courier New" w:hAnsi="Courier New" w:cs="Courier New"/>
         </w:rPr>
-        <w:t>“Bu bana öğretilen peygamberlik alametinin ikincisidir” demiştir.</w:t>
+        <w:t>“Bu bana öğretilen peygamberlik alametlerinin ikincisidir” demiştir.</w:t>
       </w:r>
     </w:p>
     <w:p>
@@ -10919,20 +10908,20 @@
         <w:rPr>
           <w:rFonts w:ascii="Courier New" w:hAnsi="Courier New" w:cs="Courier New"/>
         </w:rPr>
-        <w:t>Onun niyetini bilen Peygamberimiz sırtını açar ve güvercin yumurtası büyüklüğündeki mührü görür. Hemen peygamberimizi kucaklar, mührünü öper ve oracıkta şehadet getirip Müslüman olur. Yıllardan beri başına gelenleri, içindeki ateşi, susuzluğunu ve suyu bulduğunu anlatır peygamberimize. Bunu çevrede bulunan sahabeler ile paylaşmasını ister peygamberimiz, ancak kendisi de sahabeler de bu adamın lisanını bilmemektedir, Arap lisanını bilmeyen Mabeh bir tercüman ister, gelen tercüman bir Yahudi’dir ve Mabeh’in peygamberimize övgü dolu sözlerini kasten yanlış tercüme etmektedir. Tercüman, bir süre sonra Cebrail (AS) peygamberimize sözleri doğru olarak aktarması üzerine şehadet getirerek Müslüman olmuştu.</w:t>
-      </w:r>
-    </w:p>
-    <w:p>
-      <w:pPr>
-        <w:rPr>
-          <w:rFonts w:ascii="Courier New" w:hAnsi="Courier New" w:cs="Courier New"/>
-        </w:rPr>
-      </w:pPr>
-      <w:r>
-        <w:rPr>
-          <w:rFonts w:ascii="Courier New" w:hAnsi="Courier New" w:cs="Courier New"/>
-        </w:rPr>
-        <w:t xml:space="preserve">Artık sadece Allah’a köle olmak isteyen Mabeh’in bu durumu sahibine iletmesi üzerine ki bunu bizzat peygamberimiz kendisine iletmiştir, kendisinin azat olabilmesi için hurma bahçesinin sahibi Yahudi, 40 altın ve üç yüz hurma fidesini </w:t>
+        <w:t>Onun niyetini bilen Peygamberimiz sırtını açar ve güvercin yumurtası büyüklüğündeki mührü görür. Hemen peygamberimizi kucaklar, mührünü öper ve oracıkta şehadet getirip Müslüman olur. Yıllardan beri başına gelenleri, içindeki ateşi, susuzluğunu ve suyu bulduğunu anlatır peygamberimize. Bunu çevrede bulunan sahabeler ile paylaşmasını ister peygamberimiz, ancak kendisi de sahabeler de bu adamın lisanını bilmemektedir, derdini Arap lisanıyla anlatamayan Mabeh bir tercüman ister, gelen tercüman bir Yahudi’dir ve Mabeh’in peygamberimize övgü dolu sözlerini kasten yanlış tercüme etmektedir. Tercüman, bir süre sonra Cebrail’in (AS) peygamberimize sözleri doğru olarak aktarması üzerine şehadet getirerek Müslüman olmuştu.</w:t>
+      </w:r>
+    </w:p>
+    <w:p>
+      <w:pPr>
+        <w:rPr>
+          <w:rFonts w:ascii="Courier New" w:hAnsi="Courier New" w:cs="Courier New"/>
+        </w:rPr>
+      </w:pPr>
+      <w:r>
+        <w:rPr>
+          <w:rFonts w:ascii="Courier New" w:hAnsi="Courier New" w:cs="Courier New"/>
+        </w:rPr>
+        <w:t xml:space="preserve">Artık sadece Allah’a köle olmak isteyen Mabeh’in bu durumu sahibine iletmesi üzerine ki bunu bizzat peygamberimiz kendisine iletmiştir, kendisinin azat olabilmesi için hurma bahçesinin sahibi Yahudi, 40 altın vermesini ve üç yüz hurma fidesini </w:t>
       </w:r>
       <w:r>
         <w:rPr>
@@ -10951,7 +10940,7 @@
         <w:rPr>
           <w:rFonts w:ascii="Courier New" w:hAnsi="Courier New" w:cs="Courier New"/>
         </w:rPr>
-        <w:t>Kimisi Hindu kimisi Habeşli, Mekkeli, Hicaz’lı, başka ailelerden, soylardan gelen başka analardan doğmuş, başka babalardan olmuş düzinelerce kardeşi… Selman-ı Farisi susuzluğunu çölde bir vahada, ismi önceleri Yesrib sonradan Medine olarak (Medeniyetin Temeli olan) değişen bu diyarda gidermişti.</w:t>
+        <w:t>Kimisi Hindu kimisi Habeşli, Mekkeli, Hicazlı, başka ailelerden, soylardan gelen başka analardan doğmuş, başka babalardan olmuş düzinelerce kardeşi… Selman-ı Farisi susuzluğunu çölde bir vahada, ismi önceleri Yesrib sonradan Medine olarak (Medeniyetin Temeli olan) değişen bu diyarda gidermişti.</w:t>
       </w:r>
     </w:p>
     <w:p>
@@ -11003,7 +10992,7 @@
     </w:p>
     <w:p>
       <w:r>
-        <w:t>Tüm yaşananlardan, özellikle son mektuplardan sonra, bu yazacaklarım beni de bir yolcu yapıyordu, hala şahidi bulamamıştım, benden istenen bir roman düzenlemesi değildi ki şahidi bulmam isteniyordu benden. Ancak gerek mektupları okurken gerekse de onları buraya aktarırken, kendimi ilk defa ceylanla kıyaslıyorum, sonra da hiç tanışmadığım deli ile… Demem o ki bunları aktarabilecek tek isim benim. Anlam veremediğim bu davranış benim açımdan bir nebze de olsa anlam kazanıyordu. Büfede kendime bir çay söyledim, sigaramı yaktım, çevremdeki insanları incelerken herkes için dua ettim. Derken o kadife sesi duydum;</w:t>
+        <w:t>Tüm yaşananlardan, özellikle son mektuplardan sonra, bu yazacaklarım beni de bir yolcu yapıyordu, hâlâ şahidi bulamamıştım, benden istenen bir roman düzenlemesi değildi ki şahidi bulmam isteniyordu benden. Ancak gerek mektupları okurken gerekse de onları buraya aktarırken, kendimi ilk defa ceylanla kıyaslıyorum, sonra da hiç tanışmadığım deli ile… Demem o ki bunları aktarabilecek tek isim benim. Anlam veremediğim bu davranış benim açımdan bir nebze de olsa anlam kazanıyordu. Büfede kendime bir çay söyledim, sigaramı yaktım, çevremdeki insanları incelerken herkes için dua ettim. Derken o kadife sesi duydum;</w:t>
       </w:r>
     </w:p>
     <w:p>
@@ -11081,21 +11070,21 @@
       </w:r>
       <w:proofErr w:type="spellStart"/>
       <w:r>
-        <w:t>Bilali</w:t>
+        <w:t>Bilal-i Habeşi</w:t>
       </w:r>
       <w:proofErr w:type="spellEnd"/>
       <w:r>
-        <w:t xml:space="preserve"> Habeşi.”</w:t>
-      </w:r>
-    </w:p>
-    <w:p>
-      <w:r>
-        <w:t>“Habeşli ama Mekke doğumlu, annesi Hamâme bir Habeş kölesi olduğu için "Habeşî" (Habeşistanlı) lakabıyla anılmıştır. Genç Bilal, Mekke'de Ümeyye Halef’in kölesiydi. İslam'ı ilk kabul eden yedi kişiden biridir. Anadan köle olan Bilal, konuşmaz, yorum yapmaz, etliye sütlüye müdahil olmazdı, iyi bir köle olmanın ana kriterlerinden biriydi bu. Ancak o gün Ümeyye Halef, ilk defa konuşmasına izin vermişti kölesi Bilal’in. Dini tebliğe gelen sahabeye saldırmasını söylemiş, ancak beklenmedik bir şekilde Bilal bunu reddetmişti. Bunun üzerine Ümeyye Bilal’e, kızgın güneş altında kamçılatmış, bir de ağır kayaların altında ezmiştir. Bunu duyan Hz Ebu Bekir, onu yüksek bir ücret karşılığında satın almış ve himaye etmiştir. İşkence altındayken bile Habeşli anadan köle Bilal’in ağzından ilk duyulan kelime Ehad yani Allah tektir, birdir kelimesi olmuştur.”</w:t>
-      </w:r>
-    </w:p>
-    <w:p>
-      <w:r>
-        <w:t>“Biliyorum bu kıssayı Muhibbi amca.”</w:t>
+        <w:t>.”</w:t>
+      </w:r>
+    </w:p>
+    <w:p>
+      <w:r>
+        <w:t>“Habeşli ama Mekke doğumlu, annesi Hamâme bir Habeş kölesi olduğu için ‘Habeşî’ (Habeşistanlı) lakabıyla anılmıştır. Genç Bilal, Mekke'de Ümeyye Halef’in kölesiydi. İslam'ı ilk kabul eden yedi kişiden biridir. Anadan köle olan Bilal, konuşmaz, yorum yapmaz, etliye sütlüye müdahil olmazdı, iyi bir köle olmanın ana kriterlerinden biriydi bu. Ancak o gün Ümeyye Halef, ilk defa konuşmasına izin vermişti kölesi Bilal’in. Dini tebliğe gelen sahabeye saldırmasını söylemiş, ancak beklenmedik bir şekilde Bilal bunu reddetmişti. Bunun üzerine Ümeyye Bilal’i, kızgın güneş altında kamçılatmış, bir de ağır kayaların altında ezmiştir. Bunu duyan Hz. Ebu Bekir, onu yüksek bir ücret karşılığında satın almış ve himaye etmiştir. İşkence altındayken bile Habeşli anadan köle Bilal’in ağzından ilk duyulan kelime Ehad yani Allah tektir, birdir kelimesi olmuştur.”</w:t>
+      </w:r>
+    </w:p>
+    <w:p>
+      <w:r>
+        <w:t>“Biliyorum bu kıssayı Muhibbi Amca.”</w:t>
       </w:r>
     </w:p>
     <w:p>
@@ -11115,7 +11104,7 @@
     </w:p>
     <w:p>
       <w:r>
-        <w:t>“Kölelik düzenine karşı sarf edilen bu dik duruşa karşı söylenen ilk kelime; Ehad! Onca yıl sus ve ilk kelimen bu olsun. Allah onu sadece kölelikten kurtarmadı, sadakati karşılığında ona ilk ezan okuyan, ilk yedi sahabeden biri olmakla müşerref eyledi, bitti mi? Hayır, ona bu işkenceleri reva gören, sözde sahibi Ümeyye’nin canını Bilal’in elleriyle aldırdı. Hem de ilk savaş Bedir’de… Mekke’den Hicret etmek zorunda kalan ama aynı Mekke’nin fethedilişinden sonra en önemli parçası Kâbe’de ilk ezanı okuyan bir efendiydi Bilal Habeş, ancak kimse onun kölesi değildi. Medine’de Selman’ı Farisi’yi kucaklayan ve kardeşim diyen isimlerin arasındaydı. Eskiden ister köle ol, ister efendi, ister Habeşli bir köle, ister Mecusi, orası medeniyetin temellerinin atıldığı yerdi, orası Medine’ydi. Medeniyet nedir Mustafa Sefa, anladın mı şimdi?”</w:t>
+        <w:t>“Kölelik düzenine karşı sarf edilen bu dik duruşa karşı söylenen ilk kelime; Ehad! Onca yıl sus ve ilk kelimen bu olsun. Allah onu sadece kölelikten kurtarmadı, sadakati karşılığında ona ilk ezan okuyan, ilk yedi sahabeden biri olmakla müşerref eyledi, bitti mi? Hayır, ona bu işkenceleri reva gören, sözde sahibi Ümeyye’nin canını Bilal’in elleriyle aldırdı. Hem de ilk savaş Bedir’de… Mekke’den Hicret etmek zorunda kalan ama aynı Mekke’nin fethedilişinden sonra en önemli parçası Kâbe’de ilk ezanı okuyan bir efendiydi Bilal Habeş, ancak kimse onun kölesi değildi. Medine’de Selman-ı Farisi’yi kucaklayan ve kardeşim diyen isimlerin arasındaydı. Eskiden ister köle ol, ister efendi, ister Habeşli bir köle, ister Mecusi, orası medeniyetin temellerinin atıldığı yerdi, orası Medine’ydi. Medeniyet nedir Mustafa Sefa, anladın mı şimdi?”</w:t>
       </w:r>
     </w:p>
     <w:p>
@@ -11125,7 +11114,7 @@
     </w:p>
     <w:p>
       <w:r>
-        <w:t>“Zulmün, insanların mutsuz, teninden ya da ırkından, geçmişteki veya seçtiği dini özgürce yaşadığı her yer medenidir. Allah’ın yasalarının aynen uygulandığı neresi medeni değildir. Medeniyet o gün bu şekilde, gariplere geldi, gariplerin ellerinde yükseldi ve garip gidecektir. Şimdi bize medeniyet diye sattıklarına bak, teknolojik olmayı, soyunmayı, batılı olmayı uygarlık zanneden ve kendi gök kubbesini deldirmiş bir yığın insan var etrafımızda. Şimdi onlar mı deli, buradakiler mi? Oysa hakikat öyle değildir, şahidi arıyorsun değil mi? Şahit hakikatin hemen ardında. Şimdi git bunları yaz ve okuyan herkesin buna şahit olmasına vesile ol, çünkü şahit olduğun oranda şahit tutulursun, ancak herkesin hakikati kendine, Allah’ın hakikati zatında sırlıdır.”</w:t>
+        <w:t>“Zulmün, insanların mutsuz, teninden ya da ırkından, geçmişteki veya seçtiği dini özgürce yaşadığı her yer medenidir. Allah’ın yasalarının aynen uygulandığı neresi medeni değildir. Medeniyet o gün bu şekilde, gariplere geldi, gariplerin ellerinde yükseldi ve garip gidecektir. Şimdi bize medeniyet diye sattıklarına bak, teknolojik olmayı, soyunmayı, Batılı olmayı uygarlık zanneden ve kendi gök kubbesini deldirmiş bir yığın insan var etrafımızda. Şimdi onlar mı deli, buradakiler mi? Oysa hakikat öyle değildir, şahidi arıyorsun değil mi? Şahit hakikatin hemen ardında. Şimdi git bunları yaz ve okuyan herkesin buna şahit olmasına vesile ol, çünkü şahit olduğun oranda şahit tutulursun, ancak herkesin hakikati kendine, Allah’ın hakikati zatında sırlıdır.”</w:t>
       </w:r>
     </w:p>
     <w:p>
@@ -11179,7 +11168,7 @@
     </w:p>
     <w:p>
       <w:r>
-        <w:t>İlk sayfalardaki kalın kelimeleri yeniden alt alta yazdım. Sonra defterime geçirdiğim karşılıkla yan yana koydum. Arada küçük görünen, hiç de küçük olmayan bir fark vardı. Sayfa “âlemlere rahmet olan Allah'ın adıyla” diyordu. Ben alıştığım tamlamayı araya sokmuş, okuduğumu düzeltirken kendimi doğru sanmıştım.</w:t>
+        <w:t>İlk sayfalardaki kalın kelimeleri yeniden alt alta yazdım. Sonra defterime geçirdiğim karşılıkla yan yana koydum. Arada küçük görünen, hiç de küçük olmayan bir fark vardı. Sayfa “âlemlere rahmet olan Allah'ın adıyla” diyordu. Ben alıştığım tamlamayı araya sokmuş, okuduğumu düzeltirken kendimi doğru sanmıştım. Oysa âlemlere rahmet olmak Peygamber’in sıfatıydı; mektubu yazan el, o sıfatı besmelenin içine taşımıştı.</w:t>
       </w:r>
     </w:p>
     <w:p>
@@ -11218,7 +11207,7 @@
     </w:p>
     <w:p>
       <w:r>
-        <w:t xml:space="preserve">Bir sonraki yaprağa üç başlık attım: SES, KAPI, BEKLEME. Mektubu çözmekten yorulmuş, kendi sahnemi deniyordum. SES'in altına eski bir kaydı dinleyen iki insan yazdım. Sahnedeki kayıtta metale üç kez vuruluyor, ardından biri su istiyordu. Bunu gerçekten işittiğimden emin değildim. KAPI'nın altında sağ başparmağı bantlı bir adam, </w:t>
+        <w:t xml:space="preserve">Bir sonraki yaprağa üç başlık attım: SES, KAPI, BEKLEME. Mektubu çözmekten yorulmuş, kendi sahnemi deniyordum. SES'in altına eski bir kaydı dinleyen iki insan yazdım. Sahnedeki kayıtta metale üç kez vuruluyor, sonra biri su istiyordu. Bunu gerçekten işittiğimden emin değildim. KAPI'nın altında sağ başparmağı bantlı bir adam, </w:t>
       </w:r>
       <w:r>
         <w:t>çantasıyla dar bir geçitte bekliyordu. BEKLEME'nin karşısını boş bıraktım.</w:t>
@@ -11447,6 +11436,12 @@
           <w:i/>
         </w:rPr>
         <w:t>Kapıyı açtım. İçeri girecek adamın adını henüz bilmiyorum.</w:t>
+      </w:r>
+    </w:p>
+    <w:p>
+      <w:r>
+        <w:rPr/>
+        <w:t>Altına boş bir sandalye çizdim.</w:t>
       </w:r>
     </w:p>
     <w:p>
@@ -12317,7 +12312,7 @@
         </w:rPr>
       </w:pPr>
       <w:r>
-        <w:t>Dosyanın bir sayfasında şizofreni tanısını gördüm. Kelime, sayfanın ortasında olduğundan büyük görünüyordu. Hakan'ın dersini hatırladım: Birbirinden haberdar olmakla kendinde olanı tanımak aynı şey midir? Soruyu o sormuştu. Cevabın dışında durduğunu sanmıştı.</w:t>
+        <w:t>Dosyanın bir sayfasında şizofreni ön tanısını gördüm. Kelime, sayfanın ortasında olduğundan büyük görünüyordu. Hakan'ın dersini hatırladım: Birbirinden haberdar olmakla kendinde olanı tanımak aynı şey midir? Soruyu o sormuştu. Cevabın dışında durduğunu sanmıştı.</w:t>
       </w:r>
       <w:r>
         <w:t xml:space="preserve"> </w:t>
@@ -12326,7 +12321,7 @@
         <w:rPr>
           <w:color w:val="FF0000"/>
         </w:rPr>
-        <w:t>Bu tanı Hakan’a mı aitti yoksa bana mı?</w:t>
+        <w:t>Bu ön tanı Hakan’a mı aitti yoksa bana mı?</w:t>
       </w:r>
     </w:p>
     <w:p>
@@ -13037,7 +13032,7 @@
     </w:p>
     <w:p>
       <w:r>
-        <w:t>Vildan ajandasını açmadı. “Toplantılarda bazen cümleniz kesiliyordu. Kimi zaman bir kelimeyi bulup devam ediyordunuz. Kimi zaman konuyu başka türlü anlatıyordunuz. Bir iki kez toplantının ortasında gözleriniz kapandı. Ben yorgunluktan sandım. Birkaç defa da sol ayağınız eşiğe sürttü. Size ‘Bir doktora görünseniz’ dedim.”</w:t>
+        <w:t>Vildan ajandasını açmadı. “Toplantılarda bazen cümleniz kesiliyordu. Kimi zaman bir kelimeyi bulup devam ediyordunuz. Kimi zaman konuyu başka türlü anlatıyordunuz. Bir iki kez toplantının ortasında gözleriniz kapandı. Ben yorgunluktan sandım. Birkaç defa da sağ ayağınız eşiğe sürttü. Size ‘Bir doktora görünseniz’ dedim.”</w:t>
       </w:r>
     </w:p>
     <w:p>
@@ -13142,13 +13137,13 @@
     </w:p>
     <w:p>
       <w:r>
-        <w:t xml:space="preserve">Bu cümleyi annemden duymuştum. İkisi aynı şeyi söylemiyordu; biri oğlunu, diğeri </w:t>
+        <w:t>Bu cümleyi annemden duymuştum. İkisi aynı şeyi söylemiyordu; biri oğlunu, diğeri mesaisini paylaştığı</w:t>
       </w:r>
       <w:r>
         <w:rPr>
           <w:color w:val="FF0000"/>
         </w:rPr>
-        <w:t>mesaini paylaştığı kişiyi</w:t>
+        <w:t xml:space="preserve"> kişiyi</w:t>
       </w:r>
       <w:r>
         <w:t xml:space="preserve"> anlatıyordu. Yine de ikisinin dünyasında da bana ayrı bir beden eklenmiyordu.</w:t>
@@ -13230,16 +13225,15 @@
         <w:pStyle w:val="Opening"/>
       </w:pPr>
       <w:r>
-        <w:t xml:space="preserve">Ertesi gün </w:t>
+        <w:t>Ertesi gün Prof. Dr. Hakikat Bey’e</w:t>
       </w:r>
       <w:r>
         <w:rPr>
           <w:color w:val="FF0000"/>
         </w:rPr>
-        <w:t xml:space="preserve">Psikiyatr Dr. </w:t>
-      </w:r>
-      <w:r>
-        <w:t>Hakikat Bey’e annemle kısa bir yürüyüş için hastane bahçesine ineceğimizi söyledim. Dönmemiz gereken saati birlikte netleştirdik. Muhibbi Amca’yı aramaya gitmiyordum. Kayıttaki üç metal sesin nereden geldiğini anlamak istiyordum. Sesin kendisi belki önemsizdi; benim ona yüklediğim anlam değildi.</w:t>
+      </w:r>
+      <w:r>
+        <w:t xml:space="preserve"> annemle kısa bir yürüyüş için hastane bahçesine ineceğimizi söyledim. Dönmemiz gereken saati birlikte netleştirdik. Muhibbi Amca’yı aramaya gitmiyordum. Kayıttaki üç metal sesin nereden geldiğini anlamak istiyordum. Sesin kendisi belki önemsizdi; benim ona yüklediğim anlam değildi.</w:t>
       </w:r>
     </w:p>
     <w:p>
@@ -13481,7 +13475,7 @@
     </w:p>
     <w:p>
       <w:r>
-        <w:t>O dünyaya bir profesör girmişti. Bana benziyordu. Ama burada beni tanımlayan her şey ona ait değildi. Yazı, yüzü ödünç alıyor, görevini değiştiriyordu. Muhibbi'nin sorduğu soru bir odanın duvarına dönüşüyor; Nazım'ın çevirdiği anahtar başka birinin elinde bambaşka bir kapıyı açıyordu. Aynı işaret, aynı hüküm değildi.</w:t>
+        <w:t>O dünyaya bir doktor girmişti. Bana benziyordu. Ama burada beni tanımlayan her şey ona ait değildi. Yazı, yüzü ödünç alıyor, görevini değiştiriyordu. Muhibbi'nin adı bir sayfanın kenarında çay lekesine dönüşüyor; Nazım'ın çevirdiği anahtar başka birinin elinde bambaşka bir kapıyı açıyordu. Aynı işaret, aynı hüküm değildi.</w:t>
       </w:r>
     </w:p>
     <w:p>
@@ -13732,7 +13726,7 @@
     </w:p>
     <w:p>
       <w:r>
-        <w:t>İçerideki yazarın adsız adamı ise kapısını açmıştı. Siyah paketten bir kitap çıkıyordu. Beyaz bir cildin gölgesi, başka bir sayfaya düşüyordu. Kırmızı ip çözülünce hikâye bitmiyor, iki ucunun kimin elinde olduğu sorusu başlıyordu. Adam başını çevirdi; içeriden çocuğunun sesini duydu. Paketle ilgili sorumu orada bırakıp çocuğa gitti. Ben onun peşinden bir cümle gönderecektim, durdum. Bana cevap vermediği bir hayatı da vardı.</w:t>
+        <w:t>İçerideki yazarın adsız adamı ise kapısını açmıştı. Siyah paketten bir kitap çıkıyordu. Beyaz bir cildin gölgesi, başka bir sayfaya düşüyordu. Kırmızı ip çözülünce hikâye bitmiyor, iki ucunun kimin elinde olduğu sorusu başlıyordu. Adam başını çevirdi; içeriden bir çocuk sesi duydu. Paketle ilgili sorumu orada bırakıp sese gitti. Ben onun peşinden bir cümle gönderecektim, durdum. Bana cevap vermediği bir hayatı da vardı.</w:t>
       </w:r>
     </w:p>
     <w:p>

</xml_diff>

<commit_message>
iki-roman: Kontroll-Jury eingearbeitet – ŞAHİT Runde 3 (34 Korrekturen: Mâide/Tîh, Cebbârîn, Selman, Gottesrede in Anführung, Grammatik), Redezeichen nach TDK (93 Absätze); YOLCU Runde 3 (9); Pipeline reproduzierbar
Co-Authored-By: Claude Opus 5.5 <noreply@anthropic.com>
Claude-Session: https://claude.ai/code/session_01VkFweucEM9zfUt3hW6rSer
</commit_message>
<xml_diff>
--- a/iki-roman/interior/src/SAHIT_TR_v6.docx
+++ b/iki-roman/interior/src/SAHIT_TR_v6.docx
@@ -312,7 +312,7 @@
         <w:rPr>
           <w:rFonts w:ascii="Courier New" w:hAnsi="Courier New" w:cs="Courier New"/>
         </w:rPr>
-        <w:t>muştu karaca için. Olanlar sad</w:t>
+        <w:t>muştu yavru ceylan için. Olanlar sad</w:t>
       </w:r>
       <w:r>
         <w:rPr>
@@ -390,7 +390,7 @@
         <w:rPr>
           <w:rFonts w:ascii="Courier New" w:hAnsi="Courier New" w:cs="Courier New"/>
         </w:rPr>
-        <w:t>kları keskinleşen karaca, artık yetişkin bir ceylandı. Kimi zaman çimenlerin korkuyla çığlıklarını duyardı ve bunu umursamazdı;</w:t>
+        <w:t>kları keskinleşen yavru, artık yetişkin bir ceylandı. Kimi zaman çimenlerin korkuyla çığlıklarını duyardı ve bunu umursamazdı:</w:t>
       </w:r>
     </w:p>
     <w:p>
@@ -422,7 +422,6 @@
         <w:rPr>
           <w:rFonts w:ascii="Courier New" w:hAnsi="Courier New" w:cs="Courier New"/>
         </w:rPr>
-        <w:lastRenderedPageBreak/>
         <w:t>düzene ters düşer. Ancak bu saba</w:t>
       </w:r>
       <w:r>
@@ -527,7 +526,7 @@
         <w:rPr>
           <w:rFonts w:ascii="Courier New" w:hAnsi="Courier New" w:cs="Courier New"/>
         </w:rPr>
-        <w:t>, kafasını kaldırmış, sesin hangi çimenden geldiğini çözmeye çalışmış, kısa bir süre başını sağa yatırıp çimenleri inceledikten sonra, yemek üzere tekrar eğilirken, aynı sesi, farklı cümlelerle, biraz da irkilerek duymuştu;</w:t>
+        <w:t>, kafasını kaldırmış, sesin hangi çimenden geldiğini çözmeye çalışmış, kısa bir süre başını sağa yatırıp çimenleri inceledikten sonra, yemek üzere tekrar eğilirken, aynı sesi, farklı cümlelerle, biraz da irkilerek duymuştu:</w:t>
       </w:r>
     </w:p>
     <w:p>
@@ -715,7 +714,7 @@
         <w:rPr>
           <w:rFonts w:ascii="Courier New" w:hAnsi="Courier New" w:cs="Courier New"/>
         </w:rPr>
-        <w:t xml:space="preserve"> gülümsedi;</w:t>
+        <w:t xml:space="preserve"> gülümsedi:</w:t>
       </w:r>
     </w:p>
     <w:p>
@@ -819,7 +818,7 @@
         <w:rPr>
           <w:rFonts w:ascii="Courier New" w:hAnsi="Courier New" w:cs="Courier New"/>
         </w:rPr>
-        <w:t>lgalanmasıydı, ceylan ise zaten hiç anlam verememişti bu sözlere, yüreği korkuyla sekerek atıyor, göğüs kafesini dövüyordu. Çimen ise ne dediğini ne istediğini çok iyi biliyordu, onun derdi yolcu olmaktı ve şahidi tanımaktı;</w:t>
+        <w:t>lgalanmasıydı, ceylan ise zaten hiç anlam verememişti bu sözlere, yüreği korkuyla sekerek atıyor, göğüs kafesini dövüyordu. Çimen ise ne dediğini ne istediğini çok iyi biliyordu, onun derdi yolcu olmaktı ve şahidi tanımaktı:</w:t>
       </w:r>
     </w:p>
     <w:p>
@@ -845,7 +844,7 @@
         <w:rPr>
           <w:rFonts w:ascii="Courier New" w:hAnsi="Courier New" w:cs="Courier New"/>
         </w:rPr>
-        <w:t>Ceylan, çimenin dileklerini yerine getirmekten ziyade, onu hepten korkutan sözleri kesmek için bir hamlede ısırdı çimeni ve öfkeyle çiğnedi, çiğnedi, çiğnedi… Yutağından aşağıya kayıp giderken, çimenin teşekkür ettiğini işitti. Ani bir kalkışla koşmaya başladı, bir aslan gören ceylan ancak bu kadar hızlı kaçardı ama ortada onu avlayacak bir aslan yoktu. Sadece kalbinden gelen fısıltı, onun duyduğu sözler;</w:t>
+        <w:t>Ceylan, çimenin dileklerini yerine getirmekten ziyade, onu hepten korkutan sözleri kesmek için bir hamlede ısırdı çimeni ve öfkeyle çiğnedi, çiğnedi, çiğnedi… Yutağından aşağıya kayıp giderken, çimenin teşekkür ettiğini işitti. Ani bir kalkışla koşmaya başladı, bir aslan gören ceylan ancak bu kadar hızlı kaçardı ama ortada onu avlayacak bir aslan yoktu. Sadece kalbinden gelen fısıltı, onun duyduğu sözler:</w:t>
       </w:r>
     </w:p>
     <w:p>
@@ -929,20 +928,20 @@
         <w:rPr>
           <w:rFonts w:ascii="Courier New" w:hAnsi="Courier New" w:cs="Courier New"/>
         </w:rPr>
-        <w:t>“Ey! Ceylan, ismi cennet kapısında yazılı Ahmed’e olan aşkımızı söyle, bülbüller bize, biz ona âşığız, ne mutlu sana ki cennetten sonra, ismi ilk defa senin derine yazılacak o rahmet peygamberine bizim muhabbetlerimizi söyle. Ona de ki; Ahmed gül kokmaz, güller Ahmed kokar, ne mutlu sana ki bir de şahitle tanışacaksın, ona da bizden selam söyle, çünkü Es Selam olan Allah CC cenneti de cehennemi de alemleri de kusursuz yaratmıştır. Kusurlarından dönenler cennete, kusurundan dönmeyenler cehenneme ve alemleri de fanilerin kendi nefislerine şahitlik için halk etmiştir. Ömür zamandır, ömür sermayedir ve her nefis zamanı dolunca ölümü tadacaktır.”</w:t>
-      </w:r>
-    </w:p>
-    <w:p>
-      <w:pPr>
-        <w:rPr>
-          <w:rFonts w:ascii="Courier New" w:hAnsi="Courier New" w:cs="Courier New"/>
-        </w:rPr>
-      </w:pPr>
-      <w:r>
-        <w:rPr>
-          <w:rFonts w:ascii="Courier New" w:hAnsi="Courier New" w:cs="Courier New"/>
-        </w:rPr>
-        <w:t>Ama ceylanın duyduğu son sözler bunlar değildi, yanına koşarak gelen insan, geride kalan diğer insana seslenmişti;</w:t>
+        <w:t>“Ey! Ceylan, ismi cennet kapısında yazılı Ahmed’e olan aşkımızı söyle, bülbüller bize, biz ona âşığız, ne mutlu sana ki cennetten sonra, ismi ilk defa senin derine yazılacak o rahmet peygamberine bizim muhabbetlerimizi söyle. Ona de ki; Ahmed gül kokmaz, güller Ahmed kokar, ne mutlu sana ki bir de şahitle tanışacaksın, ona da bizden selam söyle, çünkü es-Selâm olan Allah (c.c.) cenneti de cehennemi de alemleri de kusursuz yaratmıştır. Kusurlarından dönenler cennete, kusurundan dönmeyenler cehenneme ve alemleri de fanilerin kendi nefislerine şahitlik için halk etmiştir. Ömür zamandır, ömür sermayedir ve her nefis zamanı dolunca ölümü tadacaktır.”</w:t>
+      </w:r>
+    </w:p>
+    <w:p>
+      <w:pPr>
+        <w:rPr>
+          <w:rFonts w:ascii="Courier New" w:hAnsi="Courier New" w:cs="Courier New"/>
+        </w:rPr>
+      </w:pPr>
+      <w:r>
+        <w:rPr>
+          <w:rFonts w:ascii="Courier New" w:hAnsi="Courier New" w:cs="Courier New"/>
+        </w:rPr>
+        <w:t>Ama ceylanın duyduğu son sözler bunlar değildi, yanına koşarak gelen insan, geride kalan diğer insana seslenmişti:</w:t>
       </w:r>
     </w:p>
     <w:p>
@@ -968,7 +967,7 @@
         <w:rPr>
           <w:rFonts w:ascii="Courier New" w:hAnsi="Courier New" w:cs="Courier New"/>
         </w:rPr>
-        <w:t>Cebinden bıçağını çekip, kesmeye başlayacaktı ki Barnabas yanına geldi koşar adım;</w:t>
+        <w:t>Cebinden bıçağını çekip, kesmeye başlayacaktı ki Barnabas yanına geldi koşar adım:</w:t>
       </w:r>
     </w:p>
     <w:p>
@@ -994,7 +993,7 @@
         <w:rPr>
           <w:rFonts w:ascii="Courier New" w:hAnsi="Courier New" w:cs="Courier New"/>
         </w:rPr>
-        <w:t>Ceylanın gözlerinden iki damla yaş düşerken sürme çekerek pınarlarından dolup taştı, ölmüştü zahirde dünyaya son bakışı ile ve uyanacaktı Hakk’a sürme çekilen gözlerle. İşte nice edebiyatçıya ilham olan ceylan gözlerinin sırrı o gün mühürlendi, tüm âşıklar maşuklarının bakışlarını ceylanların sürmeli gözlerine benzettiler, ancak ceylanın gözünün şeklinden değil, sırrın bakıştan gelen sürmenin nakışlandığını hiç bilemediler.</w:t>
+        <w:t>Ceylanın gözlerinden iki damla yaş düşerken sürme çekerek pınarlarından dolup taştı, ölmüştü zahirde dünyaya son bakışı ile ve uyanacaktı Hakk’a sürme çekilen gözlerle. İşte nice edebiyatçıya ilham olan ceylan gözlerinin sırrı o gün mühürlendi, tüm âşıklar maşuklarının bakışlarını ceylanların sürmeli gözlerine benzettiler, ancak o güzelliğin gözün şeklinden değil, bakışa sürme gibi nakşolunan sırdan geldiğini hiç bilemediler.</w:t>
       </w:r>
     </w:p>
     <w:p>
@@ -1214,7 +1213,7 @@
     </w:p>
     <w:p>
       <w:r>
-        <w:t>Acaba çaktırmadan kapıyı açıp, sessizce en arkada bir koltuğu el yordamı ile bulup yerleşip otursa mıydım? Hemen kapının aralığını geçebileceğim miktarda artırdım. Yukarıdan aşağıya inen basamaklar bir sinema salonu gibiydi ve karanlıktı. Amfi ne kadar kalabalıktı bilmiyorum, çünkü sahneye yakın yerlere oturanların kımıldanan kafalarını seçebiliyordum. Sessizce açılmasını umduğum kapı, ispiyoncu bir öğrenci gibi çığlık atarak gıcırdadı, profesörün kafası dahil, sahnenin ön kısmında aydınlıkta oturan tüm kafalar bana döndü. İşte o an anladım ki oldukça kalabalıktı amfi.</w:t>
+        <w:t>Acaba çaktırmadan kapıyı açıp, sessizce en arkada bir koltuğu el yordamı ile bulup yerleşip otursa mıydım? Hemen kapının aralığını geçebileceğim miktarda artırdım. Yukarıdan aşağıya inen basamaklar bir sinema salonu gibiydi ve karanlıktı. Amfi ne kadar kalabalıktı bilmiyorum, çünkü yalnızca sahneye yakın yerlere oturanların kımıldanan kafalarını seçebiliyordum. Sessizce açılmasını umduğum kapı, ispiyoncu bir öğrenci gibi çığlık atarak gıcırdadı, profesörün kafası dahil, sahnenin ön kısmında aydınlıkta oturan tüm kafalar bana döndü. İşte o an anladım ki oldukça kalabalıktı amfi.</w:t>
       </w:r>
     </w:p>
     <w:p>
@@ -1224,7 +1223,7 @@
     </w:p>
     <w:p>
       <w:r>
-        <w:t>Saatine bakıp devam etti;</w:t>
+        <w:t>Saatine bakıp devam etti:</w:t>
       </w:r>
     </w:p>
     <w:p>
@@ -1234,7 +1233,7 @@
     </w:p>
     <w:p>
       <w:r>
-        <w:t>En üstte durmuş, pardon donakalmış, deliler gibi cevabı arıyordum, soru şuydu;</w:t>
+        <w:t>En üstte durmuş, pardon donakalmış, deliler gibi cevabı arıyordum, soru şuydu:</w:t>
       </w:r>
     </w:p>
     <w:p>
@@ -1249,7 +1248,7 @@
     </w:p>
     <w:p>
       <w:r>
-        <w:t>İstemsizce duvara yansıtılmış yazıya ilişti gözüm;</w:t>
+        <w:t>İstemsizce duvara yansıtılmış yazıya ilişti gözüm:</w:t>
       </w:r>
     </w:p>
     <w:p>
@@ -1293,7 +1292,7 @@
     </w:p>
     <w:p>
       <w:r>
-        <w:t>Tanıttım kendimi, hem de iki dakikada, kalan sekiz dakika için kendimi tanıtmak uzun bir süreydi, bir şeyleri katarak anlatmak için süre kısa kalırdı; yani az çok iyi bir şekilde anlatmaya çalıştım kendimi, kalan dakikalarımı profesör doldurmuştu;</w:t>
+        <w:t>Tanıttım kendimi, hem de iki dakikada, kalan sekiz dakika için kendimi tanıtmak uzun bir süreydi, bir şeyleri katarak anlatmak için süre kısa kalırdı; yani az çok iyi bir şekilde anlatmaya çalıştım kendimi, kalan dakikalarımı profesör doldurmuştu:</w:t>
       </w:r>
     </w:p>
     <w:p>
@@ -1303,12 +1302,12 @@
     </w:p>
     <w:p>
       <w:r>
-        <w:t>Sahne adamı olmama tamam, yazdığım üç roman da var ama oynadığım tiyatro oyunları sadece iki, o da birkaç dakika, diziler desen maksimum iki bölüm görünen karakterler, reklam yapımcılığı kısmında ise sadece bir reklamda oynamışlığım hariç iki reklam işinde yapımcı olmuşum, sanırım hocamız benden hoca diye bahsederken yaptığı abartılı tanıtımdan kendine de hisse çıkarıyordu. Ne diyecek koca profesör, size bir hıyar getirdim, kilosu şu kadar mı? “Bu sözü yazan kossskoca Sefa Hocanız, oyuncu, yazar, sahne adamı, falan filan, cart, curt…”</w:t>
-      </w:r>
-    </w:p>
-    <w:p>
-      <w:r>
-        <w:t>Sonra öğrenciler ders bitip, amfiyi terk ederlerken ne kadar sarsıcı dakikalar yaşadığımı anlamıştım. Benim gibi iki kelimeyi bir araya getirmeyi çok iyi beceren bir adam için son üç aydır konuşmak adeta zulüm gibi geliyordu. Geveze Mustafa Sefa’ya alışmış tüm dost, arkadaş, aile efradımdan kim varsa, son üç aydır suskunluğumu sorgulamışlardı. Ne oldu bilmiyorum aynı anda hepsi bu sorgulamayı kesti, bunu ben bile kendime yaptım onlara bu çok görmediğim şeyi; artık bu kadar konuşken bir adamken neden suskunlaştığımı.</w:t>
+        <w:t>Sahne adamı olmam tamam, yazdığım üç roman da var ama oynadığım tiyatro oyunları sadece iki, o da birkaç dakika, diziler desen maksimum iki bölüm görünen karakterler, reklam yapımcılığı kısmında ise sadece bir reklamda oynamışlığım hariç iki reklam işinde yapımcı olmuşum, sanırım hocamız benden hoca diye bahsederken yaptığı abartılı tanıtımdan kendine de hisse çıkarıyordu. Ne diyecek koca profesör, size bir hıyar getirdim, kilosu şu kadar mı? “Bu sözü yazan kossskoca Sefa Hocanız, oyuncu, yazar, sahne adamı, falan filan, cart, curt…”</w:t>
+      </w:r>
+    </w:p>
+    <w:p>
+      <w:r>
+        <w:t>Sonra öğrenciler ders bitip, amfiyi terk ederlerken ne kadar sarsıcı dakikalar yaşadığımı anlamıştım. Benim gibi iki kelimeyi bir araya getirmeyi çok iyi beceren bir adam için son üç aydır konuşmak adeta zulüm gibi geliyordu. Geveze Mustafa Sefa’ya alışmış tüm dost, arkadaş, aile efradımdan kim varsa, son üç aydır suskunluğumu sorgulamışlardı. Ne oldu bilmiyorum aynı anda hepsi bu sorgulamayı kesti, bunu ben bile kendime yaptım onlara bu çok görmediğim şeyi; artık bu kadar konuşkan bir adamken neden suskunlaştığımı.</w:t>
       </w:r>
       <w:r>
         <w:t xml:space="preserve"> Bir dostum bana tükenmişlik sendromu demişti ve bu bana çok mantıklı gelmişti. Bunca koşturma, türlü iş, memleket meseleleri derken bir anda fişimi kendi ellerimle çekmiş ve kabuğuma çekilmiştim kabullenerek. Hasılı sahneye çıktığım o gün neler konuştuğum hakkında en küçük bir fikrim yok, konuşmak için mecalim, isteğim de yok. Muhtemelen bu profesör için bir hayal kırıklığı olmuştu, bunca şeyleri yazabilen, kariyerinde sahne insanı olmuş bir âdemin berbat sahne performansı onu da hayrete düşürmüştü.</w:t>
@@ -1535,7 +1534,7 @@
     </w:p>
     <w:p>
       <w:r>
-        <w:t>“Yahu, diyorum ya: Hiç konuşmayan, yemeğini yiyip içmeyi kendi başına beceremeyen, tuvaletini sondaya bağlıyken yapan bir vaka. O güne kadar bir demet maydanozun yiyip içen, yürüyen hâli gibiydi; hepsi bu.”</w:t>
+        <w:t>“Yahu, diyorum ya: Hiç konuşmayan, yemeğini yiyip içmeyi kendi başına beceremeyen, tuvaletini sondaya bağlıyken yapan bir vaka. O güne kadar bir demet maydanozun nefes alan, kıpırdayan hâli gibiydi; hepsi bu.”</w:t>
       </w:r>
     </w:p>
     <w:p>
@@ -1585,7 +1584,7 @@
     </w:p>
     <w:p>
       <w:r>
-        <w:t>“Ben de ilk başta aynen böyle düşünmüştüm. Kalem yorabilirdi, yazısı da okunaksız olabilirdi. Ayrıca bu vakada sivri uçlu şeyleri güvenli bulmuyorduk. Bilgisayar da tehlikeliydi; ekran camını kırıp parçalarıyla bileklerini kesebilirdi. Resmî bir kurum olan hastanemize bilgisayar sokulamazdı; hele böyle bir vakanın odasına konmasına asla izin verilmezdi. O da bunun farkındaydı.”</w:t>
+        <w:t>“Ben de ilk başta aynen böyle düşünmüştüm. Kalem yorabilirdi, yazısı da okunaksız olabilirdi. Ayrıca bu vakada sivri uçlu şeyleri güvenli bulmuyorduk. Bilgisayar da tehlikeliydi; ekran camını kırıp parçalarıyla bileklerini kesebilirdi. Resmî bir kurum olan hastanemize dışarıdan bilgisayar sokulamazdı; hele böyle bir vakanın odasına konmasına asla izin verilmezdi. O da bunun farkındaydı.”</w:t>
       </w:r>
     </w:p>
     <w:p>
@@ -1865,7 +1864,7 @@
     </w:p>
     <w:p>
       <w:r>
-        <w:t>Ne okumuştum ben böyle? Hakan Hoca, “Bir yazar gibi yazıyor,” derken şaka yapmıyormuş; “gibi” sözü fazlaydı. Bu adam, yazar olduğunun farkında olmayan yazarlardandı. Bu adamı merak etmeye başlamıştım bile. Kimdi? Bu hikâyelerin devamında ne vardı?</w:t>
+        <w:t>Ne okumuştum ben böyle? Hakan Hoca, “Bir yazar gibi yazıyor,” derken şaka yapmıyormuş: “gibi” sözü fazlaydı. Bu adam, yazar olduğunun farkında olmayan yazarlardandı. Bu adamı merak etmeye başlamıştım bile. Kimdi? Bu hikâyelerin devamında ne vardı?</w:t>
       </w:r>
     </w:p>
     <w:p>
@@ -2999,7 +2998,7 @@
     </w:p>
     <w:p>
       <w:r>
-        <w:t>Yine arkasını dönecek gibi oldu hemen sordum;</w:t>
+        <w:t>Yine arkasını dönecek gibi oldu hemen sordum:</w:t>
       </w:r>
     </w:p>
     <w:p>
@@ -3277,7 +3276,7 @@
         <w:rPr>
           <w:rFonts w:ascii="Courier New" w:hAnsi="Courier New" w:cs="Courier New"/>
         </w:rPr>
-        <w:t>Bir süre sonra ki bu süre ne kadar Allah bilir, henüz yeni formuna ve bulunduğu ortama alışırken, biraz uzakta bir dalgalanma oldu, bir kıpırdanma; ürktü. Kaçacak gibi oldu ama nereye? Hiçbir şeyin eskisi gibi olmadığı bu yerde ne kadar yeni olursa olsun, gelmek için en büyük acıyı tatmış ve bedelini en büyük korkusu olan teninde ölümüyle ödemişti, ölüm yaşayanların ilk kıyametiydi. Önce bir nida işitti, başka hiçbir sese benzemiyordu;</w:t>
+        <w:t>Bir süre sonra ki bu süre ne kadar Allah bilir, henüz yeni formuna ve bulunduğu ortama alışırken, biraz uzakta bir dalgalanma oldu, bir kıpırdanma; ürktü. Kaçacak gibi oldu ama nereye? Hiçbir şeyin eskisi gibi olmadığı bu yerde ne kadar yeni olursa olsun, gelmek için en büyük acıyı tatmış ve bedelini en büyük korkusu olan teninde ölümüyle ödemişti, ölüm yaşayanların ilk kıyametiydi. Önce bir nida işitti, başka hiçbir sese benzemiyordu:</w:t>
       </w:r>
     </w:p>
     <w:p>
@@ -3732,7 +3731,7 @@
         <w:rPr>
           <w:rFonts w:ascii="Courier New" w:hAnsi="Courier New" w:cs="Courier New"/>
         </w:rPr>
-        <w:t>“Şükürler olsun o zaman ceylan kardeş, yeni yerin burası, hadi yolun da gazan da mübarek olsun,” dedikten sonra buharlaşan bir su gibi uçtu gitti. Ama son sözleri henüz buharlaşırken yankılandı;</w:t>
+        <w:t>“Şükürler olsun o zaman ceylan kardeş, yeni yerin burası, hadi yolun da gazan da mübarek olsun,” dedikten sonra buharlaşan bir su gibi uçtu gitti. Ama son sözleri henüz buharlaşırken yankılandı:</w:t>
       </w:r>
     </w:p>
     <w:p>
@@ -3801,20 +3800,20 @@
         <w:rPr>
           <w:rFonts w:ascii="Courier New" w:hAnsi="Courier New" w:cs="Courier New"/>
         </w:rPr>
-        <w:t>Ceylan çevresine baktı, amaçsızca birkaç adım attı. Bir suyun başına geldi, eğildi ve kokladı, o ne güzel kokuydu. İçti, susamamış olsa da içti, içtiği su olmasa da içti. Uzaklardan bir yankılanma işitti, onu içtiğinden alıkoyan bir kahkaha sesiydi bu. Sesin geldiği yere doğru yürüdü, gökler mesafelerince, asırlar süresince yürüdü, ne kadar zaman ve mekân değiştirdiğini bilmeden. İki beden gördü, dumansız ateşlerden libaslar kuşanmış iki şey daha doğrusu… Görünmek endişesi ile yaklaşmaktan ürkse de o sözü anımsadı; “Korkma, seni görünmezlik zırhına büründüren yola revan edendir…”</w:t>
-      </w:r>
-    </w:p>
-    <w:p>
-      <w:pPr>
-        <w:rPr>
-          <w:rFonts w:ascii="Courier New" w:hAnsi="Courier New" w:cs="Courier New"/>
-        </w:rPr>
-      </w:pPr>
-      <w:r>
-        <w:rPr>
-          <w:rFonts w:ascii="Courier New" w:hAnsi="Courier New" w:cs="Courier New"/>
-        </w:rPr>
-        <w:t>Daha da yaklaştı, daha da daha da… Sonunda kahkaha atanların sıcaklığı yüzünü yalayana kadar yaklaştı. Sözlerini gayet net işitebiliyordu. Oturan ve kahkahası daha gür olan sustu, başını ceylanın olduğu tarafa çevirdi;</w:t>
+        <w:t>Ceylan çevresine baktı, amaçsızca birkaç adım attı. Bir suyun başına geldi, eğildi ve kokladı, o ne güzel kokuydu. İçti, susamamış olsa da içti, içtiği su olmasa da içti. Uzaklardan bir yankılanma işitti, onu içtiğinden alıkoyan bir kahkaha sesiydi bu. Sesin geldiği yere doğru yürüdü, gökler mesafelerince, asırlar süresince yürüdü, ne kadar zaman ve mekân değiştirdiğini bilmeden. İki beden gördü, dumansız ateşlerden libaslar kuşanmış iki şey daha doğrusu… Görünmek endişesi ile yaklaşmaktan ürkse de o sözü anımsadı: “Korkma, seni görünmezlik zırhına büründüren yola revan edendir…”</w:t>
+      </w:r>
+    </w:p>
+    <w:p>
+      <w:pPr>
+        <w:rPr>
+          <w:rFonts w:ascii="Courier New" w:hAnsi="Courier New" w:cs="Courier New"/>
+        </w:rPr>
+      </w:pPr>
+      <w:r>
+        <w:rPr>
+          <w:rFonts w:ascii="Courier New" w:hAnsi="Courier New" w:cs="Courier New"/>
+        </w:rPr>
+        <w:t>Daha da yaklaştı, daha da daha da… Sonunda kahkaha atanların sıcaklığı yüzünü yalayana kadar yaklaştı. Sözlerini gayet net işitebiliyordu. Oturan ve kahkahası daha gür olan sustu, başını ceylanın olduğu tarafa çevirdi:</w:t>
       </w:r>
     </w:p>
     <w:p>
@@ -3931,7 +3930,7 @@
         <w:rPr>
           <w:rFonts w:ascii="Courier New" w:hAnsi="Courier New" w:cs="Courier New"/>
         </w:rPr>
-        <w:t>“O zamanlar cennetteydim, ilmim üstüne ilim, bildiklerim üstüne bilen yoktu. Yeryüzünde atam Can’ın soyundan gelen bozguncu iblisleri yok etmiş, itibarımın zirvesindeydim. Kürsüme çıkmış, cennetteki meleklere bildiklerimi anlatıyordum. İki cennet günü, çıt sesi çıkmadı hiçbirisinden, yani altı bin iki yüz kırk koca insan yılı. Nice sonra birer, ikişer, onar ve nihayetinde binlerce meleğin saflar hâlinde çözüldüklerini fark ettim, neler olduğunu merak edip, meleklerin akın ettikleri yöne doğru yürümeye başladım. ‘Ne oldu, nereye gidiyorsunuz?’ dedim. Sonunda biri cevap verdi;</w:t>
+        <w:t>“O zamanlar cennetteydim, ilmim üstüne ilim, bildiklerim üstüne bilen yoktu. Yeryüzünde atam Can’ın soyundan gelen bozguncu iblisleri yok etmiş, itibarımın zirvesindeydim. Kürsüme çıkmış, cennetteki meleklere bildiklerimi anlatıyordum. İki cennet günü, çıt sesi çıkmadı hiçbirisinden, yani altı bin iki yüz kırk koca insan yılı. Nice sonra birer, ikişer, onar ve nihayetinde binlerce meleğin saflar hâlinde çözüldüklerini fark ettim, neler olduğunu merak edip, meleklerin akın ettikleri yöne doğru yürümeye başladım. ‘Ne oldu, nereye gidiyorsunuz?’ dedim. Sonunda biri cevap verdi:</w:t>
       </w:r>
     </w:p>
     <w:p>
@@ -3963,33 +3962,33 @@
         <w:rPr>
           <w:rFonts w:ascii="Courier New" w:hAnsi="Courier New" w:cs="Courier New"/>
         </w:rPr>
-        <w:t>arasındaki mesafe semaları geçen, heybetli, azametli, dört büyük melekten bile çok… Allah’ın halifesi olacaktı nihayetinde. Safları yararak olanca hızımla ilerledim, sonunda kalabalığın öbek olduğu yerde seslendim;</w:t>
-      </w:r>
-    </w:p>
-    <w:p>
-      <w:pPr>
-        <w:rPr>
-          <w:rFonts w:ascii="Courier New" w:hAnsi="Courier New" w:cs="Courier New"/>
-        </w:rPr>
-      </w:pPr>
-      <w:r>
-        <w:rPr>
-          <w:rFonts w:ascii="Courier New" w:hAnsi="Courier New" w:cs="Courier New"/>
-        </w:rPr>
-        <w:t>‘Açılın, Azazil görmeye geldi halifeyi’ bir de ne göreyim, hurma ağacı boyunca bir suret. Seslendim, önce cevap vermedi zannettim, meğer gerçekten de duymuyormuş. Cebrail’e sordum;</w:t>
-      </w:r>
-    </w:p>
-    <w:p>
-      <w:pPr>
-        <w:rPr>
-          <w:rFonts w:ascii="Courier New" w:hAnsi="Courier New" w:cs="Courier New"/>
-        </w:rPr>
-      </w:pPr>
-      <w:r>
-        <w:rPr>
-          <w:rFonts w:ascii="Courier New" w:hAnsi="Courier New" w:cs="Courier New"/>
-        </w:rPr>
-        <w:t>‘Allah’ın halifesi olacak ama henüz ruhu üflenmedi’ dedi. Parmağımı dokundurdum, tıngırdadı. ‘Oysa ateşi yakmalıydı elimi’ dedim, İsrafil alaycı bir ifade ile ‘Elini yakmaz korkma, Allah onu topraktan yarattı’ dedi. Burun deliklerinden bedenine girdim, tıngırdamasındaki hikmet, içi bomboş, su katılmamış kuru toprak olmasıymış meğer. Dışarı çıktım bedeninden, göremediğim ne varmış bunda diye iyiden iyiye süzdüm ve nihayetinde dayanamayıp; ‘Bu mu Allah’ın halifesi olacak, bu tıngırdayan kuru toprak parçası mı?’ Sanırım biraz yüksek sesle söyledim bunu. Birkaç melek gür sesimden korkup, sağda solda uçuştular, tam tekrar bir araya geldiklerinde, Allah’tan malum nidayı duydum, ‘Âdem’e doğru secde edin.’</w:t>
+        <w:t>arasındaki mesafe semaları geçen, heybetli, azametli, dört büyük melekten bile çok… Allah’ın halifesi olacaktı nihayetinde. Safları yararak olanca hızımla ilerledim, sonunda kalabalığın öbek olduğu yerde seslendim:</w:t>
+      </w:r>
+    </w:p>
+    <w:p>
+      <w:pPr>
+        <w:rPr>
+          <w:rFonts w:ascii="Courier New" w:hAnsi="Courier New" w:cs="Courier New"/>
+        </w:rPr>
+      </w:pPr>
+      <w:r>
+        <w:rPr>
+          <w:rFonts w:ascii="Courier New" w:hAnsi="Courier New" w:cs="Courier New"/>
+        </w:rPr>
+        <w:t>‘Açılın, Azazil görmeye geldi halifeyi’ bir de ne göreyim, hurma ağacı boyunca bir suret. Seslendim, önce cevap vermedi zannettim, meğer gerçekten de duymuyormuş. Cebrail’e sordum:</w:t>
+      </w:r>
+    </w:p>
+    <w:p>
+      <w:pPr>
+        <w:rPr>
+          <w:rFonts w:ascii="Courier New" w:hAnsi="Courier New" w:cs="Courier New"/>
+        </w:rPr>
+      </w:pPr>
+      <w:r>
+        <w:rPr>
+          <w:rFonts w:ascii="Courier New" w:hAnsi="Courier New" w:cs="Courier New"/>
+        </w:rPr>
+        <w:t>‘Allah’ın halifesi olacak ama henüz ruhu üflenmedi’ dedi. Parmağımı dokundurdum, tıngırdadı. ‘Oysa ateşi yakmalıydı elimi’ dedim, İsrafil alaycı bir ifade ile ‘Elini yakmaz korkma, Allah onu topraktan yarattı’ dedi. Burun deliklerinden bedenine girdim, tıngırdamasındaki hikmet, içi bomboş, su katılmamış kuru toprak olmasıymış meğer. Dışarı çıktım bedeninden, göremediğim ne varmış bunda diye iyiden iyiye süzdüm ve nihayetinde dayanamayıp: ‘Bu mu Allah’ın halifesi olacak, bu tıngırdayan kuru toprak parçası mı?’ Sanırım biraz yüksek sesle söyledim bunu. Birkaç melek gür sesimden korkup, sağda solda uçuştular, tam tekrar bir araya geldiklerinde, Allah’tan malum nidayı duydum, ‘Âdem’e doğru secde edin.’</w:t>
       </w:r>
     </w:p>
     <w:p>
@@ -4138,7 +4137,7 @@
         <w:rPr>
           <w:rFonts w:ascii="Courier New" w:hAnsi="Courier New" w:cs="Courier New"/>
         </w:rPr>
-        <w:t>“Azazil, haşmetli Şeytan, tacına, tahtına yemin olsun ki, ben böyle içli ağlama duymadım. Meleklerden biri diğerine şöyle tarif ederken duymuş dedem;</w:t>
+        <w:t>“Azazil, haşmetli Şeytan, tacına, tahtına yemin olsun ki, ben böyle içli ağlama duymadım. Meleklerden biri diğerine şöyle tarif ederken duymuş dedem:</w:t>
       </w:r>
     </w:p>
     <w:p>
@@ -4229,20 +4228,20 @@
         <w:rPr>
           <w:rFonts w:ascii="Courier New" w:hAnsi="Courier New" w:cs="Courier New"/>
         </w:rPr>
-        <w:t>İblis öyle korktu ki koca bir gülle gibi duran göbeği, iki dağ arasında kalan ovalar gibi geniş omuzları cebe girecek kadar küçüldü. Titrek, cılız ve acizliğini her sözüyle belli eden ses tonuyla cevapladı;</w:t>
-      </w:r>
-    </w:p>
-    <w:p>
-      <w:pPr>
-        <w:rPr>
-          <w:rFonts w:ascii="Courier New" w:hAnsi="Courier New" w:cs="Courier New"/>
-        </w:rPr>
-      </w:pPr>
-      <w:r>
-        <w:rPr>
-          <w:rFonts w:ascii="Courier New" w:hAnsi="Courier New" w:cs="Courier New"/>
-        </w:rPr>
-        <w:t>“Bilirim efendimiz, size vereceğim sır buydu işte” dedi.</w:t>
+        <w:t>İblis öyle korktu ki koca bir gülle gibi duran göbeği, iki dağ arasında kalan ovalar gibi geniş omuzları cebe girecek kadar küçüldü. Titrek, cılız ve acizliğini her sözüyle belli eden ses tonuyla cevapladı:</w:t>
+      </w:r>
+    </w:p>
+    <w:p>
+      <w:pPr>
+        <w:rPr>
+          <w:rFonts w:ascii="Courier New" w:hAnsi="Courier New" w:cs="Courier New"/>
+        </w:rPr>
+      </w:pPr>
+      <w:r>
+        <w:rPr>
+          <w:rFonts w:ascii="Courier New" w:hAnsi="Courier New" w:cs="Courier New"/>
+        </w:rPr>
+        <w:t>“Bilirim efendimiz, size vereceğim sır buydu işte,” dedi.</w:t>
       </w:r>
     </w:p>
     <w:p>
@@ -4359,7 +4358,7 @@
         <w:rPr>
           <w:rFonts w:ascii="Courier New" w:hAnsi="Courier New" w:cs="Courier New"/>
         </w:rPr>
-        <w:t>“Nasıl olacakmış o dediğin, bu alemden onların alemine eşyayı zaten sokamazsın, Allah bana dedi ki; ‘İster yaya ister koşarak ister süvarilerinle, cinlerinle insanların peşine düş’ yani peşine düşeceklerim ya da peşimden gelecekleri cehenneme sokacağını söyledi ama bana yeryüzüne eşya sokabileceğimi söylemedi iblis.”</w:t>
+        <w:t>“Nasıl olacakmış o dediğin, bu alemden onların alemine eşyayı zaten sokamazsın, Allah bana dedi ki: ‘İster yaya ister koşarak ister süvarilerinle, cinlerinle insanların peşine düş’ yani peşine düşeceklerim ya da peşimden gelecekleri cehenneme sokacağını söyledi ama bana yeryüzüne eşya sokabileceğimi söylemedi iblis.”</w:t>
       </w:r>
     </w:p>
     <w:p>
@@ -4463,33 +4462,33 @@
         <w:rPr>
           <w:rFonts w:ascii="Courier New" w:hAnsi="Courier New" w:cs="Courier New"/>
         </w:rPr>
-        <w:t>“Cennetin kapısında ismi yazanın ardında saf tutanlar, dediğim gibi bu iki ucu keskin bir mızrak, kim ki ortasından tutup, iki tarafın arasına bu mızrağı atar, işte o kazanır savaşı, kim ki bıçaklı uçları tutup karşısındakine diğer ucu saplamaya çalışır hem karşısındakini hem kendini ruhen keser, böler ve parçalar. Bu rahmet olarak yeryüzüne gönderilecek olanın ardında saf tutacakların birbirlerine çekeceği bir mızrak. Bu beyazın içindeki beyaz, siyahın içindeki siyah, suyun içindeki su, ateşin içindeki ateş olduğu için kimse fark etmeyecek sinsi bir parçalayıcı, bölücü bir mızrak, üstünde ne yazdığına gelince…”</w:t>
-      </w:r>
-    </w:p>
-    <w:p>
-      <w:pPr>
-        <w:rPr>
-          <w:rFonts w:ascii="Courier New" w:hAnsi="Courier New" w:cs="Courier New"/>
-        </w:rPr>
-      </w:pPr>
-      <w:r>
-        <w:rPr>
-          <w:rFonts w:ascii="Courier New" w:hAnsi="Courier New" w:cs="Courier New"/>
-        </w:rPr>
-        <w:t>Ceylan biraz daha yaklaştı isminin ne olduğunu duymak için ve ismini duyduğunda sebepsiz yere içi ürperdi;</w:t>
-      </w:r>
-    </w:p>
-    <w:p>
-      <w:pPr>
-        <w:rPr>
-          <w:rFonts w:ascii="Courier New" w:hAnsi="Courier New" w:cs="Courier New"/>
-        </w:rPr>
-      </w:pPr>
-      <w:r>
-        <w:rPr>
-          <w:rFonts w:ascii="Courier New" w:hAnsi="Courier New" w:cs="Courier New"/>
-        </w:rPr>
-        <w:t>“Onu size vermem, üstünde yazanı okumam için bana bir sefere mahsus izin verecek misiniz?”</w:t>
+        <w:t>“Cennetin kapısında ismi yazılı olanın ardında saf tutanlar, dediğim gibi bu iki ucu keskin bir mızrak, kim ki ortasından tutup, iki tarafın arasına bu mızrağı atar, işte o kazanır savaşı, kim ki bıçaklı uçları tutup karşısındakine diğer ucu saplamaya çalışır hem karşısındakini hem kendini ruhen keser, böler ve parçalar. Bu rahmet olarak yeryüzüne gönderilecek olanın ardında saf tutacakların birbirlerine çekeceği bir mızrak. Bu beyazın içindeki beyaz, siyahın içindeki siyah, suyun içindeki su, ateşin içindeki ateş olduğu için kimse fark etmeyecek sinsi bir parçalayıcı, bölücü bir mızrak, üstünde ne yazdığına gelince…”</w:t>
+      </w:r>
+    </w:p>
+    <w:p>
+      <w:pPr>
+        <w:rPr>
+          <w:rFonts w:ascii="Courier New" w:hAnsi="Courier New" w:cs="Courier New"/>
+        </w:rPr>
+      </w:pPr>
+      <w:r>
+        <w:rPr>
+          <w:rFonts w:ascii="Courier New" w:hAnsi="Courier New" w:cs="Courier New"/>
+        </w:rPr>
+        <w:t>Ceylan biraz daha yaklaştı isminin ne olduğunu duymak için ve ondan söz edildiğini duyduğunda sebepsiz yere içi ürperdi:</w:t>
+      </w:r>
+    </w:p>
+    <w:p>
+      <w:pPr>
+        <w:rPr>
+          <w:rFonts w:ascii="Courier New" w:hAnsi="Courier New" w:cs="Courier New"/>
+        </w:rPr>
+      </w:pPr>
+      <w:r>
+        <w:rPr>
+          <w:rFonts w:ascii="Courier New" w:hAnsi="Courier New" w:cs="Courier New"/>
+        </w:rPr>
+        <w:t>“Onu size vermem ve üstünde yazanı okumam için bana bir sefere mahsus izin verecek misiniz?”</w:t>
       </w:r>
     </w:p>
     <w:p>
@@ -4541,7 +4540,7 @@
         <w:rPr>
           <w:rFonts w:ascii="Courier New" w:hAnsi="Courier New" w:cs="Courier New"/>
         </w:rPr>
-        <w:t>İblis, şeytanın sesinden ve hiddetinden öyle korktu ki, bu sefer çömelmekle kalmadı, secdeye kapandı, nefes nefese ve ıslık çalan kısık sesiyle tekrarladı;</w:t>
+        <w:t>İblis, şeytanın sesinden ve hiddetinden öyle korktu ki, bu sefer çömelmekle kalmadı, secdeye kapandı, nefes nefese ve ıslık çalan kısık sesiyle tekrarladı:</w:t>
       </w:r>
     </w:p>
     <w:p>
@@ -4567,7 +4566,7 @@
         <w:rPr>
           <w:rFonts w:ascii="Courier New" w:hAnsi="Courier New" w:cs="Courier New"/>
         </w:rPr>
-        <w:t>Şeytan başını ceylana çevirerek;</w:t>
+        <w:t>Şeytan başını ceylana çevirerek:</w:t>
       </w:r>
     </w:p>
     <w:p>
@@ -4831,7 +4830,7 @@
       <w:r/>
       <w:r/>
       <w:r>
-        <w:t>Yerimden ok gibi fırladım, koşar adım Hakan Hıdıroğlu’nun odasına doğru yöneldim. Böyle bildiğim en düz dalışı odasından içeri girip yapacaktım, o kısa mesafede aklımdan geçen tonlarca şey var;</w:t>
+        <w:t>Yerimden ok gibi fırladım, koşar adım Hakan Hıdıroğlu’nun odasına doğru yöneldim. Böyle bildiğim en düz dalışı odasından içeri girip yapacaktım, o kısa mesafede aklımdan geçen tonlarca şey var:</w:t>
       </w:r>
     </w:p>
     <w:p>
@@ -4851,7 +4850,7 @@
     </w:p>
     <w:p>
       <w:r>
-        <w:t>Elini telefonuna kapatıp, işaret parmağıyla müsaade istedi;</w:t>
+        <w:t>Elini telefonuna kapatıp, işaret parmağıyla müsaade istedi:</w:t>
       </w:r>
     </w:p>
     <w:p>
@@ -4876,7 +4875,7 @@
     </w:p>
     <w:p>
       <w:r>
-        <w:t>Hakan Hoca alkışlamaya başladı;</w:t>
+        <w:t>Hakan Hoca alkışlamaya başladı:</w:t>
       </w:r>
     </w:p>
     <w:p>
@@ -4931,7 +4930,7 @@
     </w:p>
     <w:p>
       <w:r>
-        <w:t>Arkamı döndüm, bu sefer Zehra değil Vildan Hanım oturuyordu sekreter masasında, beni görünce;</w:t>
+        <w:t>Arkamı döndüm, bu sefer Zehra değil Vildan Hanım oturuyordu sekreter masasında, beni görünce:</w:t>
       </w:r>
     </w:p>
     <w:p>
@@ -4941,7 +4940,7 @@
     </w:p>
     <w:p>
       <w:r>
-        <w:t>“Ya kardeşim, başlatmayın hocanızdan, ne hocası…” demiştim zavallı kadına. Bahçeye indim, temiz hava almak bana iyi gelecek, sinirlerimi yatıştıracaktı. Etrafıma bakındım, her yerde birileri oturuyordu, Hakan Hoca'ya söyleyecek çok fazla şeyler vardı ama başından beri dediğim gibi inanılmaz bir konuşma isteksizliği vardı bende. Bir kahve içmek sakinleştirir miydi? Denemek için hazır bahçeye çıkmışken kendime bir kahve söyledim.</w:t>
+        <w:t>“Ya kardeşim, başlatmayın hocanızdan, ne hocası…” demiştim zavallı kadına. Bahçeye indim, temiz hava almak bana iyi gelecek, sinirlerimi yatıştıracaktı. Etrafıma bakındım, her yerde birileri oturuyordu, Hakan Hoca'ya söyleyecek çok fazla şey vardı ama başından beri dediğim gibi inanılmaz bir konuşma isteksizliği vardı bende. Bir kahve içmek sakinleştirir miydi? Denemek için hazır bahçeye çıkmışken kendime bir kahve söyledim.</w:t>
       </w:r>
     </w:p>
     <w:p>
@@ -4966,12 +4965,12 @@
     </w:p>
     <w:p>
       <w:r>
-        <w:t>“Kahve benden ama masanıza oturmama müsaade varsa” dedim.</w:t>
-      </w:r>
-    </w:p>
-    <w:p>
-      <w:r>
-        <w:t>“Kahve bahanedir, sohbet ehli ile edilir muhabbet, hem masaya değil, sandalyeye oturulur” dedi gülümseyerek.</w:t>
+        <w:t>“Kahve benden ama masanıza oturmama müsaade varsa,” dedim.</w:t>
+      </w:r>
+    </w:p>
+    <w:p>
+      <w:r>
+        <w:t>“Kahve bahanedir, sohbet ehli ile edilir muhabbet, hem masaya değil, sandalyeye oturulur,” dedi gülümseyerek.</w:t>
       </w:r>
     </w:p>
     <w:p>
@@ -5024,7 +5023,7 @@
     </w:p>
     <w:p>
       <w:r>
-        <w:t>“Maşallah, neler yazıyorsunuz?” gibi bir sürü şeyler konuştuk yığınla…</w:t>
+        <w:t>“Maşallah, neler yazıyorsunuz?” gibi yığınla şey konuştuk…</w:t>
       </w:r>
     </w:p>
     <w:p>
@@ -5143,12 +5142,12 @@
         <w:t xml:space="preserve">“Ne dedi cevap olarak (SAV) ‘Ben okuma bilmem ki’… Bilinmek isteyen Cenabı Hak, onu en iyi bilecek olana ilk olarak OKU dediğinde Ben Okuma Bilmem ki diyor, bilmediğini bilmek, bilmek için atılan ilk en doğru adımdır. Bunun için kâinatın kapıları aralanıyor, hangi kâinatın? Dışındaki sonsuz evrenin mi? Hayır! Eşyanın içini dışıyla </w:t>
       </w:r>
       <w:r>
-        <w:t>ölçeriz. İnsanın içine gelince aynı hesap tutar mı? Alemlere sığmayan Allah, bundan dolayıdır ki mümin kullarının gönlüne sığacağını söylüyor, ancak bunun için küçülen haşa Allah CC değil, büyüyen ya da büyümesi gereken kulun gönlüdür. Bilmediğini bilen, öğrendikçe acizliğini idrak eden, idrak ettirene teslim olur. Müthiş bir alışveriş değil mi bu? Allah ona en iyi müşteri olacak olanı biliyor, çünkü onu seçmiş! Seçtiği ise bilinmek istenene bilmediğini söylüyor, vay canına.”</w:t>
-      </w:r>
-    </w:p>
-    <w:p>
-      <w:r>
-        <w:t>Aklım acayip karışmıştı… Hâlâ karışık! Yazdım ama ses kaydında söyleneni aktarıyorum, aktarırken kendimi bir daktilo gibi hissediyorum. Çünkü yazan ben değilim, söyleyen Muhibbi Amca değil. Söyleten de yazdıran da Allah deyip, işin içinden çıkıyorum. İşte bu yüzden bilinmek istenen bizi aklımızla sınırlamamış, bir de aşk vermiş. Niye mi aşk? Şöyle devam etmişti Muhibbi Amca sözlerine;</w:t>
+        <w:t>ölçeriz. İnsanın içine gelince aynı hesap tutar mı? Alemlere sığmayan Allah, bundan dolayıdır ki mümin kullarının gönlüne sığacağını söylüyor, ancak bunun için küçülen haşa Allah (c.c.) değil, büyüyen ya da büyümesi gereken kulun gönlüdür. Bilmediğini bilen, öğrendikçe acizliğini idrak eden, idrak ettirene teslim olur. Müthiş bir alışveriş değil mi bu? Allah ona en iyi müşteri olacak olanı biliyor, çünkü onu seçmiş! Seçtiği ise bilinmek istenene bilmediğini söylüyor, vay canına.”</w:t>
+      </w:r>
+    </w:p>
+    <w:p>
+      <w:r>
+        <w:t>Aklım acayip karışmıştı… Hâlâ karışık! Yazdım ama ses kaydında söyleneni aktarıyorum, aktarırken kendimi bir daktilo gibi hissediyorum. Çünkü yazan ben değilim, söyleyen Muhibbi Amca değil. Söyleten de yazdıran da Allah deyip, işin içinden çıkıyorum. İşte bu yüzden bilinmek istenen bizi aklımızla sınırlamamış, bir de aşk vermiş. Niye mi aşk? Şöyle devam etmişti Muhibbi Amca sözlerine:</w:t>
       </w:r>
     </w:p>
     <w:p>
@@ -5244,12 +5243,12 @@
     </w:p>
     <w:p>
       <w:r>
-        <w:t>Söyledikleri beni nasıl içine aldılarsa, hipnozdan uyanırmışçasına silkelendim ve sadece;</w:t>
-      </w:r>
-    </w:p>
-    <w:p>
-      <w:r>
-        <w:t>“Hemen, hemen Muhibbi Amca” deyip, yerimden ok gibi fırladım. Büfeciye yanaşırken iki çay işareti yaptım. “Sen masaya geç hocam ben getiririm” dedi.</w:t>
+        <w:t>Söyledikleri beni nasıl içine aldılarsa, hipnozdan uyanırmışçasına silkelendim ve sadece:</w:t>
+      </w:r>
+    </w:p>
+    <w:p>
+      <w:r>
+        <w:t>“Hemen, hemen Muhibbi Amca,” deyip, yerimden ok gibi fırladım. Büfeciye yanaşırken iki çay işareti yaptım. “Sen masaya geç hocam ben getiririm,” dedi.</w:t>
       </w:r>
     </w:p>
     <w:p>
@@ -5280,7 +5279,7 @@
     </w:p>
     <w:p>
       <w:r>
-        <w:t>Bu soruyu kendime onlarca kere sormuşumdur, gözlerim nasıl bu sorunun içinde kaybolup gittiyse ya da yaşlı kurt bunu nasıl anlamışsa, cümlelerin oluşturacağı sisli düşüncelerimin karaya oturmaması için deniz feneri gibi tek tur ışık çaktı beynimde;</w:t>
+        <w:t>Bu soruyu kendime onlarca kere sormuşumdur, gözlerim nasıl bu sorunun içinde kaybolup gittiyse ya da yaşlı kurt bunu nasıl anlamışsa, cümlelerin oluşturacağı sisli düşüncelerimin karaya oturmaması için deniz feneri gibi tek tur ışık çaktı beynimde:</w:t>
       </w:r>
     </w:p>
     <w:p>
@@ -5498,7 +5497,7 @@
         <w:rPr>
           <w:i/>
         </w:rPr>
-        <w:t>Kasım ayının sonlarına doğru sıcaklık iyiden iyiye düşmüş, soğuk kendini hepten belli etmişti, hatta sabahları kalkmak, kuyudan su çekmek, ısıtmadan abdest almak güçleşmişti. Her yıl, uzak diyarlardan, sırtlarında çift baltası, enseleri, kolları, boyunları kalın, geneli genç oduncu kardeşlerim gelirdi buralara ama bu sene ne olduysa, sanki hepsine birden kıran girmiş, bir Allah’ın oduncusu değil evin önünden, yakınlarımda bulunan köye bile uğramamıştı hiçbiri, öyle olsa, sakalık yapan ve bana haftada bir içme suyu getiren Agâh Efendi sıkı sıkıya köye oduncu gelirse bana da gönder tembihimi tutardı. Gelmemişti demek kimsecikler, bir oduncuya kıyasla ellerim narindi, hat işlemek için de öyle olmak zorundaydılar, maazallah en küçük yaralanma, işleyeceğim ve pazar yerinde satacağım hatlarımı yapamama sebep olurdu, bu eller benim ekmek teknemdi. Bir süre sonra, gökten yere düşen kar tanesi, yüreğime düşen bir ateş oldu adeta, gözlerimi açarak “Aman Allah’ım kar da geliyor, ben ne yapacağım” diye feryat ederken, sesime karışan bir ses işittim; “Oduncu, oduncu” Hey kurban olduğum Çalap gönderdi sana işte sıkıştığın anda Hızır’ını diyerek fırladım evden. Bir de ne göreyim, sırtındaki baltalardan başka hiçbir yeri ya da hiçbir şeyi oduncuya benzemeyen bir ihtiyar. Beni görünce dikeldi, bir daha söyledi;</w:t>
+        <w:t>Kasım ayının sonlarına doğru sıcaklık iyiden iyiye düşmüş, soğuk kendini hepten belli etmişti, hatta sabahları kalkmak, kuyudan su çekmek, ısıtmadan abdest almak güçleşmişti. Her yıl, uzak diyarlardan, sırtlarında çift baltası, enseleri, kolları, boyunları kalın, geneli genç oduncu kardeşlerim gelirdi buralara ama bu sene ne olduysa, sanki hepsine birden kıran girmiş, bir Allah’ın oduncusu değil evin önünden, yakınlarımda bulunan köye bile uğramamıştı hiçbiri, öyle olsa, sakalık yapan ve bana haftada bir içme suyu getiren Agâh Efendi sıkı sıkıya köye oduncu gelirse bana da gönder tembihimi tutardı. Gelmemişti demek kimsecikler, bir oduncuya kıyasla ellerim narindi, hat işlemek için de öyle olmak zorundaydılar, maazallah en küçük yaralanma, işleyeceğim ve pazar yerinde satacağım hatlarımı yapamama sebep olurdu, bu eller benim ekmek teknemdi. Bir süre sonra, gökten yere düşen kar tanesi, yüreğime düşen bir ateş oldu adeta, gözlerimi açarak “Aman Allah’ım kar da geliyor, ben ne yapacağım,” diye feryat ederken, sesime karışan bir ses işittim: “Oduncu, oduncu” Hey kurban olduğum Çalap gönderdi sana işte sıkıştığın anda Hızır’ını diyerek fırladım evden. Bir de ne göreyim, sırtındaki baltalardan başka hiçbir yeri ya da hiçbir şeyi oduncuya benzemeyen bir ihtiyar. Beni görünce dikeldi, bir daha söyledi:</w:t>
       </w:r>
     </w:p>
     <w:p>
@@ -5658,7 +5657,7 @@
         <w:rPr>
           <w:i/>
         </w:rPr>
-        <w:t>Dedim demesine ama eve girdiğim anda, amcayı da gözümün ucuyla takip ettim küçük penceremin ardından. Amca evvela çıkardı bilediği baltayı, kırmak üzere yaslama kütüğüne bir odun yerleştirdi. Sonra bir de ne göreyim, eline aldığı balta ile konuşuyor, aha dedim hattat efendi, aradıysan buldun, bulduğun da ya velidir ya delidir. Tüm bunlar yetmezmiş gibi kırmak üzere olduğu odunla, hatta diğer odunlarla konuşmaya başladı. Ara sıra parmak sallıyor, sesi yükseliyor ama belli belirsiz, bir odunlarla bir baltayla pazarlık gibi bir şey ediyordu. Sonunda o ihtiyar, hafif kambur, minik adamın gövdesinden nasıl çıktığını bilemediğim bir kükreme geldi;</w:t>
+        <w:t>Dedim demesine ama eve girdiğim anda, amcayı da gözümün ucuyla takip ettim küçük penceremin ardından. Amca evvela çıkardı bilediği baltayı, kırmak üzere yaslama kütüğüne bir odun yerleştirdi. Sonra bir de ne göreyim, eline aldığı balta ile konuşuyor, aha dedim hattat efendi, aradıysan buldun, bulduğun da ya velidir ya delidir. Tüm bunlar yetmezmiş gibi kırmak üzere olduğu odunla, hatta diğer odunlarla konuşmaya başladı. Ara sıra parmak sallıyor, sesi yükseliyor ama belli belirsiz, bir odunlarla bir baltayla pazarlık gibi bir şey ediyordu. Sonunda o ihtiyar, hafif kambur, minik adamın gövdesinden nasıl çıktığını bilemediğim bir kükreme geldi:</w:t>
       </w:r>
     </w:p>
     <w:p>
@@ -5682,7 +5681,7 @@
         <w:rPr>
           <w:i/>
         </w:rPr>
-        <w:t>Kaşığı eline aldı, çekti besmelesini, iştahla çorbasını içerken, gözüme bakmadan sordu;</w:t>
+        <w:t>Kaşığı eline aldı, çekti besmelesini, iştahla çorbasını içerken, gözüme bakmadan sordu:</w:t>
       </w:r>
     </w:p>
     <w:p>
@@ -5858,7 +5857,7 @@
         <w:rPr>
           <w:i/>
         </w:rPr>
-        <w:t>– Bak oğul, 60 koca yıl oldu ben bu mesleğe başlayalı, baba mesleğidir odun kırmak. Babam sadece baltasının ve kıracağı odunların duyacakları şekilde konuşurdu onlarla ne konuşur ne söyler anlamazdım ama odunların kırılırken çıkarttığı ses ile bağırlarından yükselen kokuyu çok severdim. Annem ağabeyim gibi hep tezhip yapmamı istedi, altın suyuyla çekilen kıl inceliğindeki tezhipleri yapmak için nefesini tutarmış, sen de bilirsin bir hattat olarak, bazı harfler nefesi tutmak, nefesi kontrollü bir terbiye ile alıp vermek gerektiğini…</w:t>
+        <w:t>– Bak oğul, 60 koca yıl oldu ben bu mesleğe başlayalı, baba mesleğidir odun kırmak. Babam sadece baltasının ve kıracağı odunların duyacakları şekilde konuşurdu onlarla ne konuşur ne söyler anlamazdım ama odunların kırılırken çıkarttığı ses ile bağırlarından yükselen kokuyu çok severdim. Annem ağabeyim gibi hep tezhip yapmamı istedi, altın suyuyla çekilen kıl inceliğindeki tezhipleri yapmak için nefesini tutarmış, sen de bilirsin bir hattat olarak, bazı harflerde nefesi tutmak, nefesi kontrollü bir terbiye ile alıp vermek gerektiğini…</w:t>
       </w:r>
     </w:p>
     <w:p>
@@ -5977,7 +5976,7 @@
         <w:t xml:space="preserve">Allah, Allah; ne yaşıyorum ben burada şu son iki gündür? Ya da şöyle mi yazmalıyım ne yaşatılıyor bana iki gündür? Muhibbi Amca devlet için çalışan ve o mektupları bana gönderen kişi olabilir miydi yahu? Yok ya ne alaka? Ne alaka diyorum ama söylemleri bir şeylerle örtüşüyor gibi de… Sanki gelen mektupların dilinden, Hakan Hoca'nın söylemlerinden, çevremde daralan ama daraldıkça göğsümde genişlik veren bir hissiyat da var. Bana tahsis edilen oda çok ferahtı ama oraya tıkılmak, tüm merakıma rağmen </w:t>
       </w:r>
       <w:r>
-        <w:t>mektupların arasında kaybolmak gelmiyordu içimden. Bana bir değil bin yıllık bilgiler verilmişti sanki ve benim kafam hiçbir şey almayacaktı, bugünlük paydos dedim ve eve geçtim. Yemeğimizi, annemle sinema keyfi seansımızı, filmin finalinde anama filmi baştan sonra Türkçeden Türkçeye tercüme etme işini bitirdim. Yorgundum, son birkaç gündür yaşadıklarım, kulaklarımda bir çınlamanın peyda olmasına sebep olmuştu, çok gürültülü bir diskodan çıkıp, aniden sessiz bir odaya geçen bir adamın beyin uğultusuydu bu. Miskinleşip, oturduğum üçlü kanepeye uzanınca, annem ikaz etti;</w:t>
+        <w:t>mektupların arasında kaybolmak gelmiyordu içimden. Bana bir değil bin yıllık bilgiler verilmişti sanki ve benim kafam hiçbir şey almayacaktı, bugünlük paydos dedim ve eve geçtim. Yemeğimizi, annemle sinema keyfi seansımızı, filmin finalinde anama filmi baştan sonra Türkçeden Türkçeye tercüme etme işini bitirdim. Yorgundum, son birkaç gündür yaşadıklarım, kulaklarımda bir çınlamanın peyda olmasına sebep olmuştu, çok gürültülü bir diskodan çıkıp, aniden sessiz bir odaya geçen bir adamın beyin uğultusuydu bu. Miskinleşip, oturduğum üçlü kanepeye uzanınca, annem ikaz etti:</w:t>
       </w:r>
     </w:p>
     <w:p>
@@ -6029,7 +6028,7 @@
     </w:p>
     <w:p>
       <w:r>
-        <w:t xml:space="preserve">“Hocam gerek yok x ray cihazına girmenize, böyle buyurun” dedi güvenlikçi. Teşekkür ettim güvenlikçiye, içimden de Hakan Hoca'ya, sevmiyordum ben bu üst tarama, arama işlerini. Sabah namazından hemen sonra, nasılsa çok vaktim var diyerek odama geçmeye karar verdim, hastanede vardiya değişimi vardı, mesaisini bitirenlerle, mesaiye yeni başlayanlar bir aradaydı ve neredeyse doktorundan hemşiresine gören herkes selam verdi. Bunlara benim kim olduğumu anlatmıştı bu Hakan Hoca bilmiyorum ama artık benimle ilgili değildi konu, </w:t>
+        <w:t xml:space="preserve">“Hocam gerek yok x ray cihazına girmenize, böyle buyurun,” dedi güvenlikçi. Teşekkür ettim güvenlikçiye, içimden de Hakan Hoca'ya, sevmiyordum ben bu üst tarama, arama işlerini. Sabah namazından hemen sonra, nasılsa çok vaktim var diyerek odama geçmeye karar verdim, hastanede vardiya değişimi vardı, mesaisini bitirenlerle, mesaiye yeni başlayanlar bir aradaydı ve neredeyse doktorundan hemşiresine gören herkes selam verdi. Bunlara benim kim olduğumu anlatmıştı bu Hakan Hoca bilmiyorum ama artık benimle ilgili değildi konu, </w:t>
       </w:r>
       <w:r>
         <w:t>tamamen onun egoları ile alakalıydı sanırım, artık zerre umurumda değildi. Koridoru bitirip, nihayetinde odamdan içeri girdiğimde, içerisi mis gibi gül kokuyordu, oda yeteri kadar aydınlık olmadığı için ışıkları açtım, dışarıdan sızan saydam yeşil rengin yerini sıcak sarı tonları aldı. Yastıktan yüzüme gözüme mi bulaşmıştı bu koku? Önce kaba taslak oda genelini taradım gözlerimle, kokunun kaynağını bulmam gerekiyordu. Pencereler kapalıydı, masa üstlerinde gül demeti yoktu, kâğıtlar masanın üzerinde dün bıraktığım gibi yığınlar halinde duruyorlardı. Anlaşıldı bu koku benden geliyordu ve açık havada almamıştı burnum kokuyu derken… Masa bana tahsis edilmişti ama çekmecelerine hiç bakmamıştım, doğal bir refleksle çekmeceleri açtım, sol yanda üçlü çekmecelerden ortada olanını açtım, gül kokusu anında ortamı doldurdu, onca kâğıt tomarı içinden seçilmiş, ayrı bir çekmeceye koyulmuş, üç yaprak öylece duruyordu. Biri ya da birileri bu kâğıtları gül kokusuna bulayıp, ayrıca çekmeceye koymuştu. Ki bu Hakan Hoca'dan başkası değildi. Bunu neden yaptığını, hangi mantıkla hareket ettiğini çözmeye çalışmak mı, umurumda değildi. Sırf millete, devlete hizmet etmek, hatta Muhibbi Amca ile yaptığımız sohbetler bile benim böyle bir işe girmeme yeterli sebepti. He delinin satır aralarında neyi yazdığı, kimi yazdığı, ne için yazdığı da cabasıydı. Kim yolcuymuş kim şahitmiş, bunlar ne yapmışlar, niye yapmışlar, hepsi ikinci planımda kalmışlardı. Kalmışlardı diyordum, çünkü henüz hiçbir şey bilmiyordum!</w:t>
@@ -6059,7 +6058,6 @@
         <w:rPr>
           <w:i/>
         </w:rPr>
-        <w:lastRenderedPageBreak/>
         <w:t xml:space="preserve">yazarken senin ve sanıyorum ki okurken de okuyanların canı yanacak. Öldük be Mustafa Sefa, yaşamasın diye diğerkâm insanlar aynı acıları belki de. Öyle değil mi, herkes </w:t>
       </w:r>
       <w:r>
@@ -6153,12 +6151,12 @@
     </w:p>
     <w:p>
       <w:r>
-        <w:t>Gerçekten de bir Hodri vardı, bazen Fikirtepe Mahallesi Onikiler camisinde kılardım ben vakit veya cuma namazlarını. Günlerden bir gündü işte, caminin altındaki çay ocağında namaz sonrası çay içip, sofu bir abimiz ile sohbet ederken, bir bankın üstünde kıvrılmış uyurken görmüştüm ben Hodri’yi. Doğrulup, ayağa kalkmış, titreyerek yanımıza gelmiş, hiç sormadan masamıza oturmuştu.</w:t>
-      </w:r>
-    </w:p>
-    <w:p>
-      <w:r>
-        <w:t>“Çay içer misin kardeş, üşümüş gibisin” diye sormuştum ona.</w:t>
+        <w:t>Gerçekten de bir Hodri vardı, bazen Fikirtepe Mahallesi Onikiler Camisi’nde kılardım ben vakit veya cuma namazlarını. Günlerden bir gündü işte, caminin altındaki çay ocağında namaz sonrası çay içip, sofu bir abimiz ile sohbet ederken, bir bankın üstünde kıvrılmış uyurken görmüştüm ben Hodri’yi. Doğrulup, ayağa kalkmış, titreyerek yanımıza gelmiş, hiç sormadan masamıza oturmuştu.</w:t>
+      </w:r>
+    </w:p>
+    <w:p>
+      <w:r>
+        <w:t>“Çay içer misin kardeş, üşümüş gibisin,” diye sormuştum ona.</w:t>
       </w:r>
     </w:p>
     <w:p>
@@ -6182,12 +6180,12 @@
     </w:p>
     <w:p>
       <w:r>
-        <w:t>“Ben kardeşin değilim, Hodri benim adım” demişti ve eklemişti; “Açım, lütfen.”</w:t>
-      </w:r>
-    </w:p>
-    <w:p>
-      <w:r>
-        <w:t>Çay ocağındaki hacı abiye tost sipariş edince;</w:t>
+        <w:t>“Ben kardeşin değilim, Hodri benim adım,” demişti ve eklemişti: “Açım, lütfen.”</w:t>
+      </w:r>
+    </w:p>
+    <w:p>
+      <w:r>
+        <w:t>Çay ocağındaki hacı abiye tost sipariş edince:</w:t>
       </w:r>
     </w:p>
     <w:p>
@@ -6203,17 +6201,17 @@
     </w:p>
     <w:p>
       <w:r>
-        <w:t>“Konuşmayı pek sevmiyorsun anlaşılan” dedim.</w:t>
-      </w:r>
-    </w:p>
-    <w:p>
-      <w:r>
-        <w:t>“Yemek yerken konuşulmaz” deyince,</w:t>
-      </w:r>
-    </w:p>
-    <w:p>
-      <w:r>
-        <w:t>“Yemekte ecnebiler konuşmaz, yemekte sohbet sünnettir” dedim.</w:t>
+        <w:t>“Konuşmayı pek sevmiyorsun anlaşılan,” dedim.</w:t>
+      </w:r>
+    </w:p>
+    <w:p>
+      <w:r>
+        <w:t>“Yemek yerken konuşulmaz,” deyince,</w:t>
+      </w:r>
+    </w:p>
+    <w:p>
+      <w:r>
+        <w:t>“Yemekte ecnebiler konuşmaz, yemekte sohbet sünnettir,” dedim.</w:t>
       </w:r>
     </w:p>
     <w:p>
@@ -6228,7 +6226,7 @@
     </w:p>
     <w:p>
       <w:r>
-        <w:t>“Arkandaki masada kardeş, görmüyor musun” dedi. Gayriihtiyari ardıma döndüğümde göremedim, ayağa kalktım ve oturan birkaç kişiye seslendim,</w:t>
+        <w:t>“Arkandaki masada kardeş, görmüyor musun,” dedi. Gayriihtiyari ardıma döndüğümde göremedim, ayağa kalktım ve oturan birkaç kişiye seslendim,</w:t>
       </w:r>
     </w:p>
     <w:p>
@@ -6301,7 +6299,7 @@
         <w:rPr>
           <w:i/>
         </w:rPr>
-        <w:t>“Eğer benimle tanışmak istersen, Mandıra Caddesi’ndeki Gül Pastanesi’ne gel</w:t>
+        <w:t>“Eğer benimle tanışmak istersen, Mandıra Caddesi’ndeki Gül Pastanesi’ne gel,</w:t>
       </w:r>
       <w:r>
         <w:t>” diye. Bir umuttur kız randevuya gelir diye hamama gitmiş, temizlenmiş, sonra nasıl olmuşsa üstüne temiz kıyafetler ayarlayıp, elinde bir adet sarı gül, önceden yazdığı bir mektup daha cebine koymuş. Ve derken, Hodri hiç umut etmese de ceylan gözlüsü gelmiş. Kısacası kızla bir aşk yaşıyordu en son ondan dinlediğimde. Yerine bambaşka bir adam gelmiş, konuşması, sözleri, bakışları başka bir can bulmuştu bu mecaz aşk ile…</w:t>
@@ -6309,7 +6307,7 @@
     </w:p>
     <w:p>
       <w:r>
-        <w:t xml:space="preserve">Aradan birkaç hafta geçmişti tekrar İstanbul’a dönene kadar, bereketli geçen Ege, Akdeniz iş seyahati sonrası soluğu bir cuma günü Onikiler camisinde almıştım. Cemaat dağılmış, kimi işlerine, kimi çay ocağına geçmişti. Gözlerim bir süre Hodri’yi aradı, göremeyince çay ocağındaki hacı abiye sordum. “Arka avluya bak” dedi. Çayımı masada bırakıp, koşar adım gittim arka avluya, onu başka bir bankta yatarken görünce beynimden vurulmuşa dönmüştüm. Üstü başı paçavra, keskin tiner kokusu ve eskisinden daha beter olmuş virane Hodri! Uyandırmak </w:t>
+        <w:t xml:space="preserve">Aradan birkaç hafta geçmişti tekrar İstanbul’a dönene kadar, bereketli geçen Ege, Akdeniz iş seyahati sonrası soluğu bir cuma günü Onikiler Camisi’nde almıştım. Cemaat dağılmış, kimi işlerine, kimi çay ocağına geçmişti. Gözlerim bir süre Hodri’yi aradı, göremeyince çay ocağındaki hacı abiye sordum. “Arka avluya bak,” dedi. Çayımı masada bırakıp, koşar adım gittim arka avluya, onu başka bir bankta yatarken görünce beynimden vurulmuşa dönmüştüm. Üstü başı paçavra, keskin tiner kokusu ve eskisinden daha beter olmuş virane Hodri! Uyandırmak </w:t>
       </w:r>
       <w:r>
         <w:t>istedim, olmadı, bir ölü gibi uyuyordu, hani nefes aldığını fark etmesem öldü sanırdım. İşte benim için Hodri’nin o yarım hikâyesi burada bitmişti. Bir daha o camiye de gitmedim, ondan haber de almadım, sanırım duymak istemiyordum ben bu hikâyenin sonunu. İlk romanımda sokak insanlarından bir lakap olarak geçmişti satırlarımda. İşte bu satırları okurken gül kokulu kâğıttan, titreyen ellerimin bir sebebi de buydu. O kadar çok soru vardı ki aklımda; Hodri adresimi bilmez, Hodri ile yaşadıklarımızı ikimizden başkası bilmez, dahası Hodri benim yarım kalmışlığımı bilmez, hadi sosyal medyadan beni takip edip buna karar verdi diyelim, onun benimle bu temasının adını kimse koyamaz. Bu mektupları yazan yoksa Hodri miydi? Devam ettim haliyle okumaya ‘nasılsa anlarız şimdi’ diyerek.</w:t>
@@ -6380,7 +6378,7 @@
         <w:rPr>
           <w:i/>
         </w:rPr>
-        <w:t>kula yarısını dünyaya gelmeden önce veriyor aşkın. Biz kalan yarısını karşı cinsten olanlarda antrenman edip, tamam etmek için Mevla’mızı bulduruluyoruz. Oysa âşık olduğumuz kadınlarla evlensek dahi o yarımlık hissi hiç bitmeyecek, tamamlanmayacak, susuzluk ancak sana susayanla giderilir, yarımın tamamlanması için Mevla’yı bulmak, gerçek aşkı ona duymak gerekir. Kimi aklını, kimi aşkını hibe eder Allah’a, aklını hibe eden meczuptur yani delidir, aşkını hibe eden velidir vesselam.</w:t>
+        <w:t>kula yarısını dünyaya gelmeden önce veriyor aşkın. Biz kalan yarısını karşı cinsten olanlarda antrenman edip, tamam etmek için Mevla’mızı bulmaya uğraşıyoruz. Oysa âşık olduğumuz kadınlarla evlensek dahi o yarımlık hissi hiç bitmeyecek, tamamlanmayacak, susuzluk ancak sana susayanla giderilir, yarımın tamamlanması için Mevla’yı bulmak, gerçek aşkı ona duymak gerekir. Kimi aklını, kimi aşkını hibe eder Allah’a, aklını hibe eden meczuptur yani delidir, aşkını hibe eden velidir vesselam.</w:t>
       </w:r>
     </w:p>
     <w:p>
@@ -6388,7 +6386,7 @@
         <w:rPr>
           <w:i/>
         </w:rPr>
-        <w:t>Şimdi okumaktan haz etmeyeceğini tahmin ettiğim gerçeği yazma sırasına geldi Mustafa Sefa, umre ziyaretimi tamamladıktan sonra, Fikirtepe’de bir kahvede işe başlamıştım. Sanırım işe başladıktan üç ay sonra beni doktora gitmeye ikna edecek derecede bitmeyen öksürük ile başım dertteydi, dermanım ise derdin kendisiydi. Doktor ciğer filmime baktı, parça almak için ameliyat etti. Test sonuçlarını aldıktan sonra, yaşımı sordu, akrabam, eşim, annem, babam, evladım olup olmadığını öğrendikten sonra; “Kardeşim ciğerinizde portakal büyüklüğünde bir habis var, metastaz bir habis ve oldukça agresif bir seyir gösteriyor” Doktor abi ben anlamam bu laflardan kısaca söyle yaşayacak mıyım, ölecek miyim? Doktor başını önüne eğdi, tüm sevdiklerimle vedalaşmam gerektiğini tekrarlayarak söyledi, süreyi bilememekle beraber, hastaneye yatmam gerektiğini de ekledi. Hastaneye yatıp da ömrümün son aylarını hiç de hastane köşelerinde geçirmeye niyetli değildim. Ancak aylarım falan yokmuş, bilemiyor insan haliyle, son günüm, yani dünyadaki son, sonsuzluktaki günlerimin arifesinde, bizim hacı abi ile çayımı içerken ilk defa yine ceylanı gördüm camiye girerken. Ardına düşmüştüm ki hacı abi seslendi; “Abdestin var mı mübarek camiye gidersin? Ezana daha bir saat var, nereye gidersin böyle?”</w:t>
+        <w:t>Şimdi okumaktan haz etmeyeceğini tahmin ettiğim gerçeği yazma sırasına geldi Mustafa Sefa, umre ziyaretimi tamamladıktan sonra, Fikirtepe’de bir kahvede işe başlamıştım. Sanırım işe başladıktan üç ay sonra beni doktora gitmeye ikna edecek derecede bitmeyen öksürük ile başım dertteydi, dermanım ise derdin kendisiydi. Doktor ciğer filmime baktı, parça almak için ameliyat etti. Test sonuçlarını aldıktan sonra, yaşımı sordu, akrabam, eşim, annem, babam, evladım olup olmadığını öğrendikten sonra: “Kardeşim ciğerinizde portakal büyüklüğünde bir habis var, metastatik bir habis ve oldukça agresif bir seyir gösteriyor” Doktor abi ben anlamam bu laflardan kısaca söyle yaşayacak mıyım, ölecek miyim? Doktor başını önüne eğdi, tüm sevdiklerimle vedalaşmam gerektiğini tekrarlayarak söyledi, süreyi bilememekle beraber, hastaneye yatmam gerektiğini de ekledi. Hastaneye yatıp da ömrümün son aylarını hiç de hastane köşelerinde geçirmeye niyetli değildim. Ancak aylarım falan yokmuş, bilemiyor insan haliyle, son günüm, yani dünyadaki son, sonsuzluktaki günlerimin arifesinde, bizim hacı abi ile çayımı içerken ilk defa yine ceylanı gördüm camiye girerken. Ardına düşmüştüm ki hacı abi seslendi: “Abdestin var mı mübarek camiye gidersin? Ezana daha bir saat var, nereye gidersin böyle?”</w:t>
       </w:r>
     </w:p>
     <w:p>
@@ -6396,7 +6394,7 @@
         <w:rPr>
           <w:i/>
         </w:rPr>
-        <w:t>Halbuki bir sürü kaza namazım vardı kılmam gereken, elimi sallayıp öylesine, şadırvanda abdest aldım, camide ceylanı görmesem bile kaza niyeti ile huzura varacaktım. İçeride kimse yoktu, aha oradaydı, hasılı bir ceylan bir de ben. Kıyam, rükû ve secde derken bir daha başımı hiç kaldıramadım. Ceylan yanıma geldi, kokladı ve seslendi;</w:t>
+        <w:t>Halbuki bir sürü kaza namazım vardı kılmam gereken, elimi sallayıp öylesine, şadırvanda abdest aldım, camide ceylanı görmesem bile kaza niyeti ile huzura varacaktım. İçeride kimse yoktu, aha oradaydı, hasılı bir ceylan bir de ben. Kıyam, rükû ve secde derken bir daha başımı hiç kaldıramadım. Ceylan yanıma geldi, kokladı ve seslendi:</w:t>
       </w:r>
     </w:p>
     <w:p>
@@ -6412,7 +6410,7 @@
         <w:rPr>
           <w:i/>
         </w:rPr>
-        <w:t xml:space="preserve">Daha nice sözler fısıldadı bana yol boyunca anlatamam, yani anlatmam yasak olduğu için değil, o kelimeler henüz dünyaya indirilmediği için anlatamam. Anlayacağın Mustafa Sefa, Beni banktan alıp camiye taşıyan ne ceylan kılığına girmiş Hz. Azrail’di ne de âşık olduğum hatundu. Caminin avlusunda dahi olsa, edilen dualar ile ruhumda uyanan yarım hikâyemin geri kalanını bana fısıldayan vaazlar, dualar, aminlerdi. Hodri yani Mehmet kardeşini unutma, unutma ki hatırlayanlardan olasın, hatırlarsan şahidi bulacaksın, hatırlamazsan nereden buraya geldiğini, buradan nereye gideceğini bilemeyenlerden olursun maazallah. İnsan </w:t>
+        <w:t xml:space="preserve">Daha nice sözler fısıldadı bana yol boyunca anlatamam, yani anlatmam yasak olduğu için değil, o kelimeler henüz dünyaya indirilmediği için anlatamam. Anlayacağın Mustafa Sefa, beni banktan alıp camiye taşıyan ne ceylan kılığına girmiş Hz. Azrail’di ne de âşık olduğum hatundu. Caminin avlusunda dahi olsa, edilen dualar ile ruhumda uyanan yarım hikâyemin geri kalanını bana fısıldayan vaazlar, dualar, aminlerdi. Hodri yani Mehmet kardeşini unutma, unutma ki hatırlayanlardan olasın, hatırlarsan şahidi bulacaksın, hatırlamazsan nereden buraya geldiğini, buradan nereye gideceğini bilemeyenlerden olursun maazallah. İnsan </w:t>
       </w:r>
       <w:r>
         <w:rPr>
@@ -6467,7 +6465,7 @@
         <w:t xml:space="preserve">kurmuştu ama niye? Ben kimim ki bana kumpas kursunlar? Olaylar tesadüfi olmayacak kadar peş peşe geliyorlar, hızla gelişiyor, içime afakanlar basıyor, nefesimi kesiyordu. Bir mahkeme kurulmuş gıyabımda ama hâkim de savcı da yargılayan da yargılanan da avukat da hatta mübaşir ve kâtip de bendim, en çok kâtip gibiyim. Ortada tek bir eksik vardı; suç! Sahi ben niye bunların mücadelesi içindeyim, madem herkes ve her şey benim, karar da benim, hüküm de benim, çünkü ben ben ben diyen ‘ben’ bir hiçim. Yazmıyorum kardeş, ben yokum, benim derdim bana yeter, belki de bir tedaviye ihtiyacım varken, yok şahitmiş, yok ceylanmış, şeytanmış… Mektuplar ama sözüm ona mektuplardan ben hariç herkesin sanki haberi var, buna Muhibbi Amca da dahil, çevremde ne kadar insan varsa ya bu kumpası kurmuşlar ya da bu kumpasın planlı bir şekilde devam etmesi için iş birliği yapıyorlar. Gereksiz teveccüh gösterileri, hele bir de hastane içerisindeki tavırlar, ulan başhekimin yeğeni olsam kaç yazar, nasibi veren Allah, kula minnet eylemek nedir? Saygı adı altında bu yapışkan, yılışık, vıcık vıcık davranışlar… Hocalar, üstatlar, ustalar, beyli, hanımlı ölçeklendirmeler, hepsi havalarda uçuşuyor. Sabrın da bir sınırı var, Hodri midir, Mehmet midir, ulan ısmarladığım çorbalar dişini mi </w:t>
       </w:r>
       <w:r>
-        <w:t>kırmış o da bu işin içine dahil edilmişti, müptezel herifin teki. Makam araçlarıyla beni hastanesinden içeri sokan bir başhekim ama abimiz tevazu sahibi ya sözüm ona, başhekimliğini benden saklıyor, tabii saklar, saklayacak ki sonradan mütevazılığının altına sırladığı kibri ortaya çıkmasın. Üstelik bana; “Bak ben bir psikiyatrım ama elim de kalem tutar, mürekkep öyle değil böyle inceltilir” diyor haşmetli hünkârımız. Ne o, iki satır tasavvufi jargonlu hikâyeler uydurduğu için mi? Bak bak! Bir de mektupları güllere buluyor, sabahları beni o kokuyla uyandıracak anamı da bu kumpasa dahil ederek! Ulan ben kaçın kurasıyım. Beni vatan sevgimle krem peyniri kıvamına getirin, sonra işe gizem içinde gizemler katın, hastayım oğlum ben, ayılıp bayılıyorum, iyi değilim, konuşacak enerjim isteğim yok, yok, yok!</w:t>
+        <w:t>kırmış o da bu işin içine dahil edilmişti, müptezel herifin teki. Makam araçlarıyla beni hastanesinden içeri sokan bir başhekim ama abimiz tevazu sahibi ya sözüm ona, başhekimliğini benden saklıyor, tabii saklar, saklayacak ki sonradan mütevazılığının altına sırladığı kibri ortaya çıkmasın. Üstelik bana: “Bak ben bir psikiyatrım ama elim de kalem tutar, mürekkep öyle değil böyle inceltilir” diyor haşmetli hünkârımız. Ne o, iki satır tasavvufi jargonlu hikâyeler uydurduğu için mi? Bak bak! Bir de mektupları güllere buluyor, sabahları beni o kokuyla uyandıracak anamı da bu kumpasa dahil ederek! Ulan ben kaçın kurasıyım. Beni vatan sevgimle krem peyniri kıvamına getirin, sonra işe gizem içinde gizemler katın, hastayım oğlum ben, ayılıp bayılıyorum, iyi değilim, konuşacak enerjim isteğim yok, yok, yok!</w:t>
       </w:r>
     </w:p>
     <w:p>
@@ -6557,7 +6555,7 @@
     </w:p>
     <w:p>
       <w:r>
-        <w:t>Direkt kapadım telefonu sonrasında. Bitirmem gereken bir iş ve buna karşın içimde katlanılmaz bir daralma vardı. Sanırım yıllarca çok ama çok fazla milletin derdi ile dertlendim ve bende bir şeyler patlak veriyordu. Ne yapardım ben çok bunalınca, elime bir kalem alır ya kaligrafik anlamsız kelimeler yazardım ya bir boks torbası yumruklardım ya namaz kılardım ya da resimler çizerdim. Ama içimden bunlar da gelmiyordu. Masanın başına oturdum, bu sefer sadece ağlıyordum, bana neler olduğu hakkında en küçük bir fikrim yoktu, ruh halim karmaşık, zihnim bulanıktı. Vardır bunun da bir sebebi elbet, merhameti sonsuz olan ya günahlarıma kefaret olsun diye bana bu sıkıntıları veriyordu ya da sanırım ecelim geliyordu. Ölümü sorgulamak garip bir duygu, çünkü ölümün sorgulanması için hayatını sorgulaması gerekiyordu insanın, yaşadıklarım, yaşattıklarım, anılarım ve bu işin sonu… Şunu söylemiştim en son; “Demek ölmek böyle bir şeymiş.”</w:t>
+        <w:t>Direkt kapadım telefonu sonrasında. Bitirmem gereken bir iş ve buna karşın içimde katlanılmaz bir daralma vardı. Sanırım yıllarca çok ama çok fazla milletin derdi ile dertlendim ve bende bir şeyler patlak veriyordu. Ne yapardım ben çok bunalınca, elime bir kalem alır ya kaligrafik anlamsız kelimeler yazardım ya bir boks torbası yumruklardım ya namaz kılardım ya da resimler çizerdim. Ama içimden bunlar da gelmiyordu. Masanın başına oturdum, bu sefer sadece ağlıyordum, bana neler olduğu hakkında en küçük bir fikrim yoktu, ruh halim karmaşık, zihnim bulanıktı. Vardır bunun da bir sebebi elbet, merhameti sonsuz olan ya günahlarıma kefaret olsun diye bana bu sıkıntıları veriyordu ya da sanırım ecelim geliyordu. Ölümü sorgulamak garip bir duygu, çünkü ölümün sorgulanması için hayatını sorgulaması gerekiyordu insanın, yaşadıklarım, yaşattıklarım, anılarım ve bu işin sonu… Şunu söylemiştim en son: “Demek ölmek böyle bir şeymiş.”</w:t>
       </w:r>
     </w:p>
     <w:p>
@@ -6574,7 +6572,7 @@
     </w:p>
     <w:p>
       <w:r>
-        <w:t>“Ben kimim” diye soruyor solucana ve bana, biz de cevap veriyoruz;</w:t>
+        <w:t>“Ben kimim,” diye soruyor solucana ve bana, biz de cevap veriyoruz:</w:t>
       </w:r>
     </w:p>
     <w:p>
@@ -6599,7 +6597,7 @@
     </w:p>
     <w:p>
       <w:r>
-        <w:t>Sonra hayalimde Allah bana soruyor;</w:t>
+        <w:t>Sonra hayalimde Allah bana soruyor:</w:t>
       </w:r>
     </w:p>
     <w:p>
@@ -6614,7 +6612,7 @@
     </w:p>
     <w:p>
       <w:r>
-        <w:t>“Kâtiplerim bana üç roman yazdıklarını söylediler, bu yeterli mi?”</w:t>
+        <w:t>“Kâtiplerim bana üç roman yazdığımı söylediler, bu yeterli mi?”</w:t>
       </w:r>
     </w:p>
     <w:p>
@@ -6711,7 +6709,6 @@
         <w:t xml:space="preserve">Tövbeler olsun, derdim sadece okunmak değil, yazmak da olmalıydı! Hakkı anlatan ama önce kendisi anlayan, zafer kazanmak değil sefere çıkmak gayretinde olan olmalıydım ve ben kös kös oturmuş, bunalımlarımı, susmalarımı, antisosyal tavırlarımı sorguluyordum. Derdimle haşir neşir olurken, derdimde kaybolmuşum, sen kimsin lan! Allah var gam yok demiyor muydun, derdi veren </w:t>
       </w:r>
       <w:r>
-        <w:lastRenderedPageBreak/>
         <w:t>Allah’tır demiyor muydun, şehit olayım demiyor muydun edepsiz herif. Kibrini kendinden saklayan egoist, sinsi</w:t>
       </w:r>
       <w:r>
@@ -6721,7 +6718,7 @@
         <w:rPr>
           <w:color w:val="FF0000"/>
         </w:rPr>
-        <w:t>sen ancak kendi kendini tatmin ediyorsun, neymiş efendim; “</w:t>
+        <w:t>sen ancak kendi kendini tatmin ediyorsun, neymiş efendim: “</w:t>
       </w:r>
       <w:r>
         <w:rPr>
@@ -6868,7 +6865,7 @@
           <w:i/>
           <w:iCs/>
         </w:rPr>
-        <w:t>Tefeül ile okunan her şey bizi düşünmenin ötesinde tefekküre zorlar Mustafa Sefa, düşünmek kapıyı açar, tefekkür etmek kapının ardını gösterir sana. Bugün sana şahitten ilk ipucunu veriyorum, kıymetini bil; o Allah’ın biriciği olarak dünyaya gönderildi, sonra o hayatında kendi tercihlerine şahit edildi. Herhangi birisiydi fakat kendi hikâyesinin olmazsa olmazıydı. Her yer sahneydi ve doğumundan ölümüne başrollerdeydi. Ölene kadar nefesle başlayan rızkı, nasibi göklerin karar verdiği oranda takdir ve tahsis edildi. Onu ünlülerden daha ünlü yapan ünsüz olmasıydı, hatta ünlüleri ünlü yapan oydu. Hiçliğini hiç sayan ariflere selam olsun, bunu bilinmek isteyenin değil, bilmesi gerekenin gerçekliğiyle yazıyorum, çünkü hepimizin gerçekleri farklı olsalar da hakikat öyle değil. Sen gerçeği değil, hakikati ara, bulmayacağını bilsen de ara. Aramakla bulunmaz o hakikat yoluna revan olmak, o yolda olmak, o yolun rengine bulanmak dahi mütekâmil olmaya müşteri insanı eşrefi mahlukat eder.</w:t>
+        <w:t>Tefeül ile okunan her şey bizi düşünmenin ötesinde tefekküre zorlar Mustafa Sefa, düşünmek kapıyı açar, tefekkür etmek kapının ardını gösterir sana. Bugün sana şahitten ilk ipucunu veriyorum, kıymetini bil; o Allah’ın yarattığı biricik bir kul olarak dünyaya gönderildi, sonra o hayatında kendi tercihlerine şahit edildi. Herhangi birisiydi fakat kendi hikâyesinin olmazsa olmazıydı. Her yer sahneydi ve doğumundan ölümüne başrollerdeydi. Ölene kadar nefesle başlayan rızkı, nasibi göklerin karar verdiği oranda takdir ve tahsis edildi. Onu ünlülerden daha ünlü yapan ünsüz olmasıydı, hatta ünlüleri ünlü yapan oydu. Hiçliğini hiç sayan ariflere selam olsun, bunu bilinmek isteyenin değil, bilmesi gerekenin gerçekliğiyle yazıyorum, çünkü hepimizin gerçekleri farklı olsalar da hakikat öyle değil. Sen gerçeği değil, hakikati ara, bulmayacağını bilsen de ara. Aramakla bulunmaz o hakikat yoluna revan olmak, o yolda olmak, o yolun rengine bulanmak dahi mütekâmil olmaya müşteri insanı eşrefi mahlukat eder.</w:t>
       </w:r>
       <w:r>
         <w:rPr>
@@ -6882,7 +6879,7 @@
           <w:i/>
           <w:iCs/>
         </w:rPr>
-        <w:t xml:space="preserve"> Dünya hakiki olanı, hakiki olanın çizdiği rota ile taklit etme alanıdır. Onu taklit edene ne mutlu; kölelikte özgürleşen, teslimiyette emniyet bulan, yaşamla ölümü, ölümle yaşamı, sonla başlangıcı, korkarak cesareti birleyene ne mutlu… Çünkü Necip Fazıl’ın da dediği gibi; “Hürriyet, Hakk’a esaret halkasındadır.”</w:t>
+        <w:t xml:space="preserve"> Dünya hakiki olanı, hakiki olanın çizdiği rota ile taklit etme alanıdır. Onu taklit edene ne mutlu; kölelikte özgürleşen, teslimiyette emniyet bulan, yaşamla ölümü, ölümle yaşamı, sonla başlangıcı, korkarak cesareti birleyene ne mutlu… Çünkü Necip Fazıl’ın da dediği gibi: “Hürriyet, Hakk’a esaret halkasındadır.”</w:t>
       </w:r>
     </w:p>
     <w:p>
@@ -6926,7 +6923,7 @@
     </w:p>
     <w:p>
       <w:r>
-        <w:t>Ölümü, yeniden dirilişi, şahidi, suyun hakikatini düşünüyorum ama dilimin üstündeki tat bana “Sen hele bir dişlerini fırçala da âlemlerin sırrını sonra çözersin” diyor. Beden dediğin edepsiz bir dost gibidir; en ciddi konuşmanın ortasında karnını guruldatır, secdeye varırsın dizini ağrıtır, aşkı anlatırsın tuvaletini hatırlatır. Şimdi iki nöbet, birkaç mektup ve nereden geldiğini bilmediğim gül kokusu bütün o büyük laflarımdan beni aşağı çekiyor, “Gel bakalım Mustafa Sefa, önce şu etten, kemikten, sudan yapılmış adamın hesabını ver” diyordu.</w:t>
+        <w:t>Ölümü, yeniden dirilişi, şahidi, suyun hakikatini düşünüyorum ama dilimin üstündeki tat bana “Sen hele bir dişlerini fırçala da âlemlerin sırrını sonra çözersin” diyor. Beden dediğin edepsiz bir dost gibidir; en ciddi konuşmanın ortasında karnını guruldatır, secdeye varırsın dizini ağrıtır, aşkı anlatırsın tuvaletini hatırlatır. Şimdi iki nöbet, birkaç mektup ve nereden geldiğini bilmediğim gül kokusu bütün o büyük laflarımdan beni aşağı çekiyor, “Gel bakalım Mustafa Sefa, önce şu etten, kemikten, sudan yapılmış adamın hesabını ver,” diyordu.</w:t>
       </w:r>
     </w:p>
     <w:p>
@@ -7307,7 +7304,6 @@
         <w:t xml:space="preserve">Muhibbi Amca benim bu halimi seyretti, sonra simidini acele etmeden katladı. “Bak evlat,” dedi, “insan her yazıyı birinin yazdığını bilir de yazının yazanı nereye götürdüğünü pek düşünmez. Sen mesajı kimin attığını arıyorsun; doğru, ara. Numara kimin, cihaz nerede, saat kaçta gönderilmiş, bunları da ara. Lakin bir mesaj seni yatağından </w:t>
       </w:r>
       <w:r>
-        <w:lastRenderedPageBreak/>
         <w:t xml:space="preserve">kaldırıp buraya getirmişse, sen de beni bekleyecek kadar ona inanmışsan, o yazı artık yalnız gönderenin malı değildir. Sende yaptığı iş kadar senindir. Şimdi birileri sana </w:t>
       </w:r>
       <w:r>
@@ -7463,7 +7459,7 @@
     </w:p>
     <w:p>
       <w:r>
-        <w:t>Bu soruya hemen cevap veremedim. Yazarın en büyük kibri, yazdığı her şeyi bildiğini sanmasıydı belki. Oysa bazen bir cümle yazarsınız, yıllar sonra okur size ne demek istediğinizi anlatır da “Vay be, ben ne kadar derin adammışım” diye içinizden geçirirsiniz. Bu, derinlik değil; kuyunun tesadüfen evinize denk gelmesidir.</w:t>
+        <w:t>Bu soruya hemen cevap veremedim. Yazarın en büyük kibri, yazdığı her şeyi bildiğini sanmasıydı belki. Oysa bazen bir cümle yazarsınız, yıllar sonra okur size ne demek istediğinizi anlatır da “Vay be, ben ne kadar derin adammışım,” diye içinizden geçirirsiniz. Bu, derinlik değil; kuyunun tesadüfen evinize denk gelmesidir.</w:t>
       </w:r>
     </w:p>
     <w:p>
@@ -8349,7 +8345,7 @@
         <w:t>B</w:t>
       </w:r>
       <w:r>
-        <w:t>ulunduğum yeri, günü bildim. Gün konusunda bir an duraksayınca Hakan Hoca kaşlarını kaldırdı, ben de “Takvimle aram hiçbir zaman iyi değildi” dedim. Kan aldılar. Nöroloji hekimi ayrıntılı muayene yaptı; gözlerime ışık tuttu, parmağını izlettirdi, kollarımı uzattı, yürüttü. Şu anda belirgin bir sorun görmediğini ama iki olayın da ciddiye alınması gerektiğini söyledi. EEG ve beyin görüntülemesi planlandı. Tekrar ederse acil çağrı yapmam, yalnız kalmamam, araba kullanmamam gerektiğini uzun uzun anlattı.</w:t>
+        <w:t>ulunduğum yeri, günü bildim. Gün konusunda bir an duraksayınca Hakan Hoca kaşlarını kaldırdı, ben de “Takvimle aram hiçbir zaman iyi değildi,” dedim. Kan aldılar. Nöroloji hekimi ayrıntılı muayene yaptı; gözlerime ışık tuttu, parmağını izlettirdi, kollarımı uzattı, yürüttü. Şu anda belirgin bir sorun görmediğini ama iki olayın da ciddiye alınması gerektiğini söyledi. EEG ve beyin görüntülemesi planlandı. Tekrar ederse acil çağrı yapmam, yalnız kalmamam, araba kullanmamam gerektiğini uzun uzun anlattı.</w:t>
       </w:r>
     </w:p>
     <w:p>
@@ -8403,16 +8399,14 @@
     </w:p>
     <w:p>
       <w:r>
-        <w:t>“Sizin gibi konuşan doktoru”</w:t>
-      </w:r>
-      <w:r>
-        <w:t xml:space="preserve"> </w:t>
-      </w:r>
+        <w:t>“Sizin gibi konuşan doktoru,” diye</w:t>
+      </w:r>
+      <w:r/>
       <w:r>
         <w:rPr>
           <w:color w:val="FF0000"/>
         </w:rPr>
-        <w:t>diye geçirdim içimden. Ne</w:t>
+        <w:t xml:space="preserve"> geçirdim içimden. Ne</w:t>
       </w:r>
       <w:r>
         <w:rPr>
@@ -9265,7 +9259,7 @@
         <w:rPr>
           <w:rFonts w:ascii="Courier New" w:hAnsi="Courier New" w:cs="Courier New"/>
         </w:rPr>
-        <w:t>“Anlat evladım kardeşlerine, anlat ki bilsinler hangi Âdemoğlunu çıkarttın da yoldan ve geldin kuruldun tahtıma. Hangi silahla vurdun iman dolu sinesine de onu kendine yakın ettin bilsinler.” Velhan mırıldandı;</w:t>
+        <w:t>“Anlat evladım kardeşlerine, anlat ki bilsinler hangi Âdemoğlunu çıkarttın da yoldan ve geldin kuruldun tahtıma. Hangi silahla vurdun iman dolu sinesine de onu kendine yakın ettin bilsinler.” Velhan mırıldandı:</w:t>
       </w:r>
     </w:p>
     <w:p>
@@ -9291,7 +9285,7 @@
         <w:rPr>
           <w:rFonts w:ascii="Courier New" w:hAnsi="Courier New" w:cs="Courier New"/>
         </w:rPr>
-        <w:t>Hanzeb hiddetlenerek;</w:t>
+        <w:t>Hanzeb hiddetlenerek:</w:t>
       </w:r>
     </w:p>
     <w:p>
@@ -9446,7 +9440,7 @@
         <w:rPr>
           <w:rFonts w:ascii="Courier New" w:hAnsi="Courier New" w:cs="Courier New"/>
         </w:rPr>
-        <w:t>korkudur âdemoğullarında, acelecilik de korkunun tohumudur, bunu asla unutmayın. Allah iman eden kullarına benden çok kimseden korkmayın, benimle aranıza korkularınızı sokmayın, benim her şeye Kadir olduğumu bilin ve teslim olun demiştir.</w:t>
+        <w:t>korkudur âdemoğullarında, acelecilik de korkunun tohumudur, bunu asla unutmayın. Allah iman eden kullarına ‘Benden çok kimseden korkmayın, benimle aranıza korkularınızı sokmayın, benim her şeye Kadir olduğumu bilin ve teslim olun’ demiştir.</w:t>
       </w:r>
     </w:p>
     <w:p>
@@ -9472,26 +9466,26 @@
         <w:rPr>
           <w:rFonts w:ascii="Courier New" w:hAnsi="Courier New" w:cs="Courier New"/>
         </w:rPr>
-        <w:t>“…Edeyim Babacığım. İnkârcı kral vezirlerini topladı, içlerinde en zeki, en sinsi olanını çoktan tespit edip, seçmiştim, onun adı Balakt’tı. Altınlara, kadınlara, zevk ü sefaya düşkün şeytanlaşmış bir âdemoğlu. ‘İşte benim kuklam bu olmalı’ dedim ve Fitne silahını onun eline verip, kulağına fısıldadım; ‘Söyle kralına, Belam’ı bulsun, o İsm-i Âzam denilen ret olunmayan duaların ilmini bilen bir âlimdir.’ Vezir bu fısıldamamı kıt zekâsından kralına haykırdı. Aklı hepten gölgede kalan kral hemen sordu; ‘Musa’nın dinine inanan Belam’ı nasıl ikna edeceksin buna?’</w:t>
-      </w:r>
-    </w:p>
-    <w:p>
-      <w:pPr>
-        <w:rPr>
-          <w:rFonts w:ascii="Courier New" w:hAnsi="Courier New" w:cs="Courier New"/>
-        </w:rPr>
-      </w:pPr>
-      <w:r>
-        <w:rPr>
-          <w:rFonts w:ascii="Courier New" w:hAnsi="Courier New" w:cs="Courier New"/>
-        </w:rPr>
-        <w:t xml:space="preserve">Ben fısıldamaya fırsat bulamadan, diğer aptal vezir; ‘Altınlar, kıymetli cevherler verelim, kadınla </w:t>
-      </w:r>
-      <w:r>
-        <w:rPr>
-          <w:rFonts w:ascii="Courier New" w:hAnsi="Courier New" w:cs="Courier New"/>
-        </w:rPr>
-        <w:t>kandıralım’ dedi. Kral da dahil herkes bilirdi ki Belam’ın karısı diyarın en güzel hatunuydu ve o âlim karısına çok âşıktı. Balakt’a tekrar fısıldadım; ‘Karısına gidin, onu mızrakla, yani fitnele yani fitle’</w:t>
+        <w:t>“…Edeyim Babacığım. İnkârcı kral vezirlerini topladı, içlerinde en zeki, en sinsi olanını çoktan tespit edip, seçmiştim, onun adı Balakt’tı. Altınlara, kadınlara, zevk ü sefaya düşkün şeytanlaşmış bir âdemoğlu. ‘İşte benim kuklam bu olmalı’ dedim ve Fitne silahını onun eline verip, kulağına fısıldadım: ‘Söyle kralına, Belam’ı bulsun, o İsm-i Âzam denilen reddolunmayan duaların ilmini bilen bir âlimdir.’ Vezir bu fısıldamamı kıt zekâsından kralına haykırdı. Aklı hepten gölgede kalan kral hemen sordu: ‘Musa’nın dinine inanan Belam’ı nasıl ikna edeceksin buna?’</w:t>
+      </w:r>
+    </w:p>
+    <w:p>
+      <w:pPr>
+        <w:rPr>
+          <w:rFonts w:ascii="Courier New" w:hAnsi="Courier New" w:cs="Courier New"/>
+        </w:rPr>
+      </w:pPr>
+      <w:r>
+        <w:rPr>
+          <w:rFonts w:ascii="Courier New" w:hAnsi="Courier New" w:cs="Courier New"/>
+        </w:rPr>
+        <w:t xml:space="preserve">Ben fısıldamaya fırsat bulamadan, diğer aptal vezir: ‘Altınlar, kıymetli cevherler verelim, kadınla </w:t>
+      </w:r>
+      <w:r>
+        <w:rPr>
+          <w:rFonts w:ascii="Courier New" w:hAnsi="Courier New" w:cs="Courier New"/>
+        </w:rPr>
+        <w:t>kandıralım’ dedi. Kral da dahil herkes bilirdi ki Belam’ın karısı diyarın en güzel hatunuydu ve o âlim karısına çok âşıktı. Balakt’a tekrar fısıldadım: ‘Karısına gidin, onu mızrakla, yani fitnele yani fitle’</w:t>
       </w:r>
     </w:p>
     <w:p>
@@ -9517,7 +9511,7 @@
         <w:rPr>
           <w:rFonts w:ascii="Courier New" w:hAnsi="Courier New" w:cs="Courier New"/>
         </w:rPr>
-        <w:t>Hiç vakit kaybetmeden ve şan, şöhret hasleti kadının düşüncelerinde kol gezerken, girdim Balakt’ın kalbine, başladım tüm sözleri seçerek fısıldamaya kuklam olmuş vezir Balakt’a;</w:t>
+        <w:t>Hiç vakit kaybetmeden ve şan, şöhret hasleti kadının düşüncelerinde kol gezerken, girdim Balakt’ın kalbine, başladım tüm sözleri seçerek fısıldamaya kuklam olmuş vezir Balakt’a:</w:t>
       </w:r>
     </w:p>
     <w:p>
@@ -9608,7 +9602,7 @@
         <w:rPr>
           <w:rFonts w:ascii="Courier New" w:hAnsi="Courier New" w:cs="Courier New"/>
         </w:rPr>
-        <w:t>Sonunda zebanilerden biri ağzından saçarak salyalarını haykırdı neredeyse boğazını yırtarak;</w:t>
+        <w:t>Sonunda zebanilerden biri ağzından saçarak salyalarını haykırdı neredeyse boğazını yırtarak:</w:t>
       </w:r>
     </w:p>
     <w:p>
@@ -9634,7 +9628,7 @@
         <w:rPr>
           <w:rFonts w:ascii="Courier New" w:hAnsi="Courier New" w:cs="Courier New"/>
         </w:rPr>
-        <w:t>“Sabırla dinleyin oğlumu” dedi şeytan.</w:t>
+        <w:t>“Sabırla dinleyin oğlumu,” dedi şeytan.</w:t>
       </w:r>
     </w:p>
     <w:p>
@@ -9712,20 +9706,20 @@
         <w:rPr>
           <w:rFonts w:ascii="Courier New" w:hAnsi="Courier New" w:cs="Courier New"/>
         </w:rPr>
-        <w:t>Kadın sözleri ölçüp tartmıştı babacığım, hemen şöyle dedi; ‘Tamam bu işi bitmiş bilin.’ Artık kesinlikle emindim ki mızrağın keskin bir ucu sağlam ellerdeydi ve Belam Bin Baura’yı diğer ucu bekliyordu.</w:t>
-      </w:r>
-    </w:p>
-    <w:p>
-      <w:pPr>
-        <w:rPr>
-          <w:rFonts w:ascii="Courier New" w:hAnsi="Courier New" w:cs="Courier New"/>
-        </w:rPr>
-      </w:pPr>
-      <w:r>
-        <w:rPr>
-          <w:rFonts w:ascii="Courier New" w:hAnsi="Courier New" w:cs="Courier New"/>
-        </w:rPr>
-        <w:t>Derken Belam Bin Baura ufukta göründü, kadın hemen hüzün kemerini bağlayıp boynuna, çıktı kocasının karşısına, cılız bir sesle ‘Hoş geldin efendim’ dedi. Hali hal değil ki âşık olduğu kadının, sordu hemen Belam;</w:t>
+        <w:t>Kadın sözleri ölçüp tartmıştı babacığım, hemen şöyle dedi: ‘Tamam bu işi bitmiş bilin.’ Artık kesinlikle emindim ki mızrağın keskin bir ucu sağlam ellerdeydi ve Belam Bin Baura’yı diğer ucu bekliyordu.</w:t>
+      </w:r>
+    </w:p>
+    <w:p>
+      <w:pPr>
+        <w:rPr>
+          <w:rFonts w:ascii="Courier New" w:hAnsi="Courier New" w:cs="Courier New"/>
+        </w:rPr>
+      </w:pPr>
+      <w:r>
+        <w:rPr>
+          <w:rFonts w:ascii="Courier New" w:hAnsi="Courier New" w:cs="Courier New"/>
+        </w:rPr>
+        <w:t>Derken Belam Bin Baura ufukta göründü, kadın hemen hüzün kemerini bağlayıp boynuna, çıktı kocasının karşısına, cılız bir sesle ‘Hoş geldin efendim’ dedi. Hali hal değil ki âşık olduğu kadının, sordu hemen Belam:</w:t>
       </w:r>
     </w:p>
     <w:p>
@@ -9764,7 +9758,7 @@
         <w:rPr>
           <w:rFonts w:ascii="Courier New" w:hAnsi="Courier New" w:cs="Courier New"/>
         </w:rPr>
-        <w:t>‘Beyim, bu belde küçük, milleti azizdir. Üç yüz beş yıldır, bizi sahiplenir, saygıda kusur etmezler, ikramlarından beri koymazlar. Buralara bir başkasının karıştırmasına gerek yok’ dedi kadın. Bu sefer Belam’ın kalbine öfkeyle harmanlanmış kibri verdim ve Belam karısına;</w:t>
+        <w:t>‘Beyim, bu belde küçük, milleti azizdir. Üç yüz beş yıldır, bizi sahiplenir, saygıda kusur etmezler, ikramlarından beri koymazlar. Buralara bir başkasının karıştırmasına gerek yok’ dedi kadın. Bu sefer Belam’ın kalbine öfkeyle harmanlanmış kibri verdim ve Belam karısına:</w:t>
       </w:r>
     </w:p>
     <w:p>
@@ -9790,7 +9784,7 @@
         <w:rPr>
           <w:rFonts w:ascii="Courier New" w:hAnsi="Courier New" w:cs="Courier New"/>
         </w:rPr>
-        <w:t>‘Aman Bey, sana da laf söylenmiyor ki’ dedi ve sustu. Kadın bu sefer ağlamaklı bir lisanla;</w:t>
+        <w:t>‘Aman Bey, sana da laf söylenmiyor ki’ dedi ve sustu. Kadın bu sefer ağlamaklı bir lisanla:</w:t>
       </w:r>
     </w:p>
     <w:p>
@@ -9842,7 +9836,7 @@
         <w:rPr>
           <w:rFonts w:ascii="Courier New" w:hAnsi="Courier New" w:cs="Courier New"/>
         </w:rPr>
-        <w:t>Sonra, Belam sakalını sıvazladı, kadın sözünü hiç kesmeden konuşuyor, bir yandan da vezirin getirdiği sandıkları birer ikişer açıyordu babacığım. Kadın fermanı çıkarttı ve sordu;</w:t>
+        <w:t>Sonra, Belam sakalını sıvazladı, kadın sözünü hiç kesmeden konuşuyor, bir yandan da vezirin getirdiği sandıkları birer ikişer açıyordu babacığım. Kadın fermanı çıkarttı ve sordu:</w:t>
       </w:r>
     </w:p>
     <w:p>
@@ -9946,7 +9940,7 @@
         <w:rPr>
           <w:rFonts w:ascii="Courier New" w:hAnsi="Courier New" w:cs="Courier New"/>
         </w:rPr>
-        <w:t>Ceylan’ın hissetmediği bir sarsıntı, bir uğultu kopmaya başladı, şeytan oğlunu tahttan indirip hemen kuruldu. Gökler çatırdamaya başladı, Ceylan iki adım geriye sendeleyip, başını kalabalıktan çoğu zebaninin yaptığı gibi göğe kaldırdı. Şeytan ve kalabalıktaki tüm zebanilerin bedenlerindeki kılları, köpekten ürkmüş bir kedi gibi ayağa kalkmış, hepsinin yüzleri gerilmişti. Göğün tam göğsünde ışıktan bir yarık oluştu. Sonunda aşağıya çehresi bir dağın karlı zirvesi kadar parlak biri gelmişti. Şeytan korktuğunu belli etmeden haykırdı;</w:t>
+        <w:t>Ceylan’ın hissetmediği bir sarsıntı, bir uğultu kopmaya başladı, şeytan oğlunu tahttan indirip hemen kuruldu. Gökler çatırdamaya başladı, Ceylan iki adım geriye sendeleyip, başını kalabalıktan çoğu zebaninin yaptığı gibi göğe kaldırdı. Şeytan ve kalabalıktaki tüm zebanilerin bedenlerindeki kılları, köpekten ürkmüş bir kedi gibi ayağa kalkmış, hepsinin yüzleri gerilmişti. Göğün tam göğsünde ışıktan bir yarık oluştu. Sonunda aşağıya çehresi bir dağın karlı zirvesi kadar parlak biri gelmişti. Şeytan korktuğunu belli etmeden haykırdı:</w:t>
       </w:r>
     </w:p>
     <w:p>
@@ -10017,7 +10011,7 @@
         <w:rPr>
           <w:rFonts w:ascii="Courier New" w:hAnsi="Courier New" w:cs="Courier New"/>
         </w:rPr>
-        <w:t>“Hakk’ın yolundan sapıtan Belam Bin Baura, İsm-i Âzam duası için aldı merkebini, dua edeceği yere doğru yola çıktı. Allah ona yine de adaletle hükmetti. Gözleri görüyordu ama Hakk’a kördü, kulakları duyuyordu ama işitmiyordu. Önce merkebi konuştu onunla, ‘Dur Belam nereye gidersin? Musa peygamberdir ve Allah’ın buyruğu ile yola revan olmuştur. Sen Musa’ya değil, Allah’a isyan edersin’ dediğinde, hemen Belam’ın kulağına eğilip şöyle fısıldadım;</w:t>
+        <w:t>“Hakk’ın yolundan sapıtan Belam Bin Baura, İsm-i Âzam duası için aldı merkebini, dua edeceği yere doğru yola çıktı. Allah ona yine de adaletle hükmetti. Gözleri görüyordu ama Hakk’a kördü, kulakları duyuyordu ama işitmiyordu. Önce merkebi konuştu onunla, ‘Dur Belam nereye gidersin? Musa peygamberdir ve Allah’ın buyruğu ile yola revan olmuştur. Sen Musa’ya değil, Allah’a isyan edersin’ dediğinde, hemen Belam’ın kulağına eğilip şöyle fısıldadım:</w:t>
       </w:r>
     </w:p>
     <w:p>
@@ -10043,7 +10037,7 @@
         <w:rPr>
           <w:rFonts w:ascii="Courier New" w:hAnsi="Courier New" w:cs="Courier New"/>
         </w:rPr>
-        <w:t>Mikail söze girdi;</w:t>
+        <w:t>Mikail söze girdi:</w:t>
       </w:r>
     </w:p>
     <w:p>
@@ -10095,20 +10089,20 @@
         <w:rPr>
           <w:rFonts w:ascii="Courier New" w:hAnsi="Courier New" w:cs="Courier New"/>
         </w:rPr>
-        <w:t>“Musa ve ordusu Konkoça Sahrası’na geldiklerinde, Belam Bin Baura duasını etmişti. Akşama kadar yol gidiyorlar, gece çökünce istirahate çekiliyorlar, sabah kalktıklarında kendilerini yola henüz çıktıkları aynı yerde buluyorlardı. Bu kırk gün böyle devam etti. Sonunda Musa, ellerini semaya kaldırdı ve dua etti.</w:t>
-      </w:r>
-    </w:p>
-    <w:p>
-      <w:pPr>
-        <w:rPr>
-          <w:rFonts w:ascii="Courier New" w:hAnsi="Courier New" w:cs="Courier New"/>
-        </w:rPr>
-      </w:pPr>
-      <w:r>
-        <w:rPr>
-          <w:rFonts w:ascii="Courier New" w:hAnsi="Courier New" w:cs="Courier New"/>
-        </w:rPr>
-        <w:t>‘Ey Rabbim; senin rızan için, emrini yerine getirmek için yola çıktım üç günlük yola. Bende bir eksiklik mi var, bir hata mı ettim? Bu işin hikmeti nedir? Emrini yerine getirmek, Kral Cebbarun ile savaşmak için yola çıktım’ diye dua edince, Allah Teala bizzat buyurdu;</w:t>
+        <w:t>“Musa ve ordusu Konkoça Sahrası’na geldiklerinde, Belam Bin Baura duasını etmişti. Akşama kadar yol gidiyorlar, gece çökünce istirahate çekiliyorlar, sabah kalktıklarında kendilerini yola henüz çıktıkları aynı yerde buluyorlardı. Bu kırk yıl böyle devam etti. Sonunda Musa, ellerini semaya kaldırdı ve dua etti.</w:t>
+      </w:r>
+    </w:p>
+    <w:p>
+      <w:pPr>
+        <w:rPr>
+          <w:rFonts w:ascii="Courier New" w:hAnsi="Courier New" w:cs="Courier New"/>
+        </w:rPr>
+      </w:pPr>
+      <w:r>
+        <w:rPr>
+          <w:rFonts w:ascii="Courier New" w:hAnsi="Courier New" w:cs="Courier New"/>
+        </w:rPr>
+        <w:t>‘Ey Rabbim; senin rızan için, emrini yerine getirmek için yola çıktım üç günlük yola. Bende bir eksiklik mi var, bir hata mı ettim? Bu işin hikmeti nedir? Emrini yerine getirmek, Cebbar kavimle savaşmak için yola çıktım’ diye dua edince, Allah Teala bizzat buyurdu:</w:t>
       </w:r>
     </w:p>
     <w:p>
@@ -10160,7 +10154,7 @@
         <w:rPr>
           <w:rFonts w:ascii="Courier New" w:hAnsi="Courier New" w:cs="Courier New"/>
         </w:rPr>
-        <w:t>Dedikten sonra tekrar kalabalığa dönerek;</w:t>
+        <w:t>Dedikten sonra tekrar kalabalığa dönerek:</w:t>
       </w:r>
     </w:p>
     <w:p>
@@ -10466,7 +10460,7 @@
         <w:rPr>
           <w:i/>
         </w:rPr>
-        <w:t>Bir şehirde kuyu kurumuş. Habeşli sucu, Mekkeli tüccar ve Farisî hekim, elde kalan son testinin kime verileceği konusunda şehrin kadısının huzuruna çıkmışlar. Sucu, “Suyu ben taşıdım, benimdir” demiş. Tüccar, “Kuyuyu açtıran akçeyi ben verdim, benimdir” demiş. Hekim, “Susuzun hangisi olduğunu ben bilirim, benimdir” demiş. Kadı testiyi önüne koyup üçünü de dinlemiş. Sonra dışarıda bekleyen, hiçbirinin adını bilmediği hasta çocuğa suyu vermiş.</w:t>
+        <w:t>Bir şehirde kuyu kurumuş. Habeşli sucu, Mekkeli tüccar ve Farisî hekim, elde kalan son testinin kime verileceği konusunda şehrin kadısının huzuruna çıkmışlar. Sucu, “Suyu ben taşıdım, benimdir,” demiş. Tüccar, “Kuyuyu açtıran akçeyi ben verdim, benimdir,” demiş. Hekim, “Susuzun hangisi olduğunu ben bilirim, benimdir,” demiş. Kadı testiyi önüne koyup üçünü de dinlemiş. Sonra dışarıda bekleyen, hiçbirinin adını bilmediği hasta çocuğa suyu vermiş.</w:t>
       </w:r>
     </w:p>
     <w:p>
@@ -10484,7 +10478,7 @@
     </w:p>
     <w:p>
       <w:r>
-        <w:t>Kıssanın yanına bugün yazdığımı not ettim. Eski bir kaynaktan almış gibi görünmesini istemedim. Medine'yi, medeniyeti düşünüyordum ama kendi uydurduğum bir kadının ağzından tarihe şahit tutanak düzenleyemezdim.</w:t>
+        <w:t>Kıssanın yanına bugün yazdığımı not ettim. Eski bir kaynaktan almış gibi görünmesini istemedim. Medine'yi, medeniyeti düşünüyordum ama uydurduğum bir kadıyı konuşturup tarihe şahitlik tutanağı düzenleyemezdim.</w:t>
       </w:r>
     </w:p>
     <w:p>
@@ -10642,20 +10636,20 @@
         <w:rPr>
           <w:rFonts w:ascii="Courier New" w:hAnsi="Courier New" w:cs="Courier New"/>
         </w:rPr>
-        <w:t>selamlarımı söyle, o senin aradığın kişidir” demiştir. Mabeh, piskoposu defnettikten sonra, Musul’da tarif edilen kişiyi bulur, durumunu anlatır ve buradaki manastıra yerleşir. İlginçtir ki buradaki kimse de bir süre sonra vefat eder. Vefatından az önce de arayışını bildiği Mabeh’e Nusaybin’de gerçek Hristiyanlığı yaşayan bir ismi işaret eder. Musul’daki şahıs öldükten sonra, oradaki kişilerin dinlerini nasıl yozlaştırdıklarına tanıklık eder ve tavsiye edilen yere gitmek üzere yola çıkar. Burada da aradığını kısmen bulur ancak artık ömrünün son günlerini yaşayan rahip, ona son nefesinde Rum diyarında bulunan Amuriye (bugünkü Emirdağ yakınları) taraflarında bir manastırı tavsiye eder. Bu onun son durağıdır ancak genç Mabeh’in içinde yanan ateş hâlâ serinlememiştir. Oysaki ona tavsiyede bulunacak bu kimse de hasta olmuş ve öleceği belli olunca;</w:t>
-      </w:r>
-    </w:p>
-    <w:p>
-      <w:pPr>
-        <w:rPr>
-          <w:rFonts w:ascii="Courier New" w:hAnsi="Courier New" w:cs="Courier New"/>
-        </w:rPr>
-      </w:pPr>
-      <w:r>
-        <w:rPr>
-          <w:rFonts w:ascii="Courier New" w:hAnsi="Courier New" w:cs="Courier New"/>
-        </w:rPr>
-        <w:t>“Evladım, ben gerçek Hristiyanlığın son temsilcisiyim, benim bildiğim kimse yoktur, ancak üstadımız bana bir İncil’den bahsetmişti, onu bizzat okumadım ama üstadım bizzat kendisi okumuş, bir ceylan derisine yazılmış Barnabas İncili’nde yazılanları ve onun bana söylediklerini sana aynen aktarıyorum;</w:t>
+        <w:t>selamlarımı söyle, o senin aradığın kişidir” demiştir. Mabeh, piskoposu defnettikten sonra, Musul’da tarif edilen kişiyi bulur, durumunu anlatır ve buradaki manastıra yerleşir. İlginçtir ki buradaki kimse de bir süre sonra vefat eder. Vefatından az önce de arayışını bildiği Mabeh’e Nusaybin’de gerçek Hristiyanlığı yaşayan bir ismi işaret eder. Musul’daki şahıs öldükten sonra, oradaki kişilerin dinlerini nasıl yozlaştırdıklarına tanıklık eder ve tavsiye edilen yere gitmek üzere yola çıkar. Burada da aradığını kısmen bulur ancak artık ömrünün son günlerini yaşayan rahip, ona son nefesinde Rum diyarında bulunan Amuriye (bugünkü Emirdağ yakınları) taraflarında bir manastırı tavsiye eder. Bu onun son durağıdır ancak genç Mabeh’in içinde yanan ateş hâlâ serinlememiştir. Oysaki ona tavsiyede bulunacak bu kimse de hasta olmuş ve öleceği belli olunca:</w:t>
+      </w:r>
+    </w:p>
+    <w:p>
+      <w:pPr>
+        <w:rPr>
+          <w:rFonts w:ascii="Courier New" w:hAnsi="Courier New" w:cs="Courier New"/>
+        </w:rPr>
+      </w:pPr>
+      <w:r>
+        <w:rPr>
+          <w:rFonts w:ascii="Courier New" w:hAnsi="Courier New" w:cs="Courier New"/>
+        </w:rPr>
+        <w:t>“Evladım, ben gerçek Hristiyanlığın son temsilcisiyim, benim bildiğim kimse yoktur, ancak üstadımız bana bir İncil’den bahsetmişti, onu bizzat okumadım ama üstadım bizzat kendisi okumuş, bir ceylan derisine yazılmış Barnabas İncili’nde yazılanları ve onun bana söylediklerini sana aynen aktarıyorum:</w:t>
       </w:r>
     </w:p>
     <w:p>
@@ -10687,7 +10681,7 @@
         <w:rPr>
           <w:rFonts w:ascii="Courier New" w:hAnsi="Courier New" w:cs="Courier New"/>
         </w:rPr>
-        <w:t>Günlerden bir gün, Hicaz bölgesine gidecek olan Kelb kabilesinden bir kervancı başı ile tanışır. Elinde bulunan davarların karşılığında, onlarla gidebileceğini, Arap haydutlarının saldırılarına karşı koruma karşılığında, güvenli bir şekilde Yesrib diyarına ulaşabileceğini söyler. Ancak Yesrib’e belli bir mesafe kala kervan baskın yemiş, bazı mallarına karşı, kervancı başı, sözünde durmayarak Mabeh’i Vâdi’l-Kurâ’da bir Yahudi’ye köle olarak satmıştır. Yesrib’e götürülen Mabeh, bir hurma bahçesinde çalıştırılmak üzere, o adamın amcasının oğluna satılmıştır. Köledir ama onun göğsündeki iman ateşini, Hakk’a susamışlığını giderecek olan Mabeh, Amuriye Rahibi’nin tasvir ettiği şehir ile Yesrib’in aynı yer olup olmadığından henüz emin olamamıştır. Sahibi olan Yahudi ile hurma bahçesinde çalışırken, komşu bahçenin sahibi olan bir başkası yanına koşarak gelmişti;</w:t>
+        <w:t>Günlerden bir gün, Hicaz bölgesine gidecek olan Kelb kabilesinden bir kervancı başı ile tanışır. Elinde bulunan davarların karşılığında, onlarla gidebileceğini, Arap haydutlarının saldırılarına karşı koruma karşılığında, güvenli bir şekilde Yesrib diyarına ulaşabileceğini söyler. Ancak Yesrib’e belli bir mesafe kala kervan baskın yemiş, bazı mallarına karşı, kervancı başı, sözünde durmayarak Mabeh’i Vâdi’l-Kurâ’da bir Yahudi’ye köle olarak satmıştır. Yesrib’e götürülen Mabeh, bir hurma bahçesinde çalıştırılmak üzere, o adamın amcasının oğluna satılmıştır. Köledir ama onun göğsündeki iman ateşini, Hakk’a susamışlığını giderecek olan Mabeh, Amuriye Rahibi’nin tasvir ettiği şehir ile Yesrib’in aynı yer olup olmadığından henüz emin olamamıştır. Sahibi olan Yahudi ile hurma bahçesinde çalışırken, komşu bahçenin sahibi olan bir başkası yanına koşarak gelmişti:</w:t>
       </w:r>
     </w:p>
     <w:p>
@@ -10804,7 +10798,7 @@
         <w:rPr>
           <w:rFonts w:ascii="Courier New" w:hAnsi="Courier New" w:cs="Courier New"/>
         </w:rPr>
-        <w:t>Kuba’da bulunan bir eve konuk edilen Allah resulünü daha gördüğü anda peşinden gitmesi gereken kişiye baktığını anlamıştı ama onda üç işaret ve alameti görmek istedi. Yanına aldığı hurmaları Allah resulüne (SAV) uzatan Mabeh;</w:t>
+        <w:t>Kuba’da bulunan bir eve konuk edilen Allah resulünü daha gördüğü anda peşinden gitmesi gereken kişiye baktığını anlamıştı ama onda üç işaret ve alameti görmek istedi. Yanına aldığı hurmaları Allah resulüne (SAV) uzatan Mabeh:</w:t>
       </w:r>
     </w:p>
     <w:p>
@@ -10830,7 +10824,7 @@
         <w:rPr>
           <w:rFonts w:ascii="Courier New" w:hAnsi="Courier New" w:cs="Courier New"/>
         </w:rPr>
-        <w:t>Sadaka olarak ikram edilen hurmaları kendisine değil, çevresindekilere verdiğini görünce;</w:t>
+        <w:t>Sadaka olarak ikram edilen hurmaları kendisine değil, çevresindekilere verdiğini görünce:</w:t>
       </w:r>
     </w:p>
     <w:p>
@@ -10856,7 +10850,7 @@
         <w:rPr>
           <w:rFonts w:ascii="Courier New" w:hAnsi="Courier New" w:cs="Courier New"/>
         </w:rPr>
-        <w:t>Bunu peygamberimiz (SAV) kabul edince;</w:t>
+        <w:t>Bunu peygamberimiz (SAV) kabul edince:</w:t>
       </w:r>
     </w:p>
     <w:p>
@@ -10895,7 +10889,7 @@
         <w:rPr>
           <w:rFonts w:ascii="Courier New" w:hAnsi="Courier New" w:cs="Courier New"/>
         </w:rPr>
-        <w:t>“Ey Allah’ın resulü olduğunu söyleyen kişi, gömleğini aç, sırtını görmek isterim” der.</w:t>
+        <w:t>“Ey Allah’ın resulü olduğunu söyleyen kişi, sırtını bir görebilsem,” diye içinden geçirir.</w:t>
       </w:r>
     </w:p>
     <w:p>
@@ -10940,7 +10934,7 @@
         <w:rPr>
           <w:rFonts w:ascii="Courier New" w:hAnsi="Courier New" w:cs="Courier New"/>
         </w:rPr>
-        <w:t>Kimisi Hindu kimisi Habeşli, Mekkeli, Hicazlı, başka ailelerden, soylardan gelen başka analardan doğmuş, başka babalardan olmuş düzinelerce kardeşi… Selman-ı Farisi susuzluğunu çölde bir vahada, ismi önceleri Yesrib sonradan Medine olarak (Medeniyetin Temeli olan) değişen bu diyarda gidermişti.</w:t>
+        <w:t>Kimisi Hintli kimisi Habeşli, Mekkeli, Hicazlı, başka ailelerden, soylardan gelen başka analardan doğmuş, başka babalardan olmuş düzinelerce kardeşi… Selman-ı Farisi susuzluğunu çölde bir vahada, ismi önceleri Yesrib sonradan Medine olarak (Medeniyetin Temeli olan) değişen bu diyarda gidermişti.</w:t>
       </w:r>
     </w:p>
     <w:p>
@@ -10992,7 +10986,7 @@
     </w:p>
     <w:p>
       <w:r>
-        <w:t>Tüm yaşananlardan, özellikle son mektuplardan sonra, bu yazacaklarım beni de bir yolcu yapıyordu, hâlâ şahidi bulamamıştım, benden istenen bir roman düzenlemesi değildi ki şahidi bulmam isteniyordu benden. Ancak gerek mektupları okurken gerekse de onları buraya aktarırken, kendimi ilk defa ceylanla kıyaslıyorum, sonra da hiç tanışmadığım deli ile… Demem o ki bunları aktarabilecek tek isim benim. Anlam veremediğim bu davranış benim açımdan bir nebze de olsa anlam kazanıyordu. Büfede kendime bir çay söyledim, sigaramı yaktım, çevremdeki insanları incelerken herkes için dua ettim. Derken o kadife sesi duydum;</w:t>
+        <w:t>Tüm yaşananlardan, özellikle son mektuplardan sonra, bu yazacaklarım beni de bir yolcu yapıyordu, hâlâ şahidi bulamamıştım, benden istenen bir roman düzenlemesi değildi ki şahidi bulmam isteniyordu benden. Ancak gerek mektupları okurken gerekse de onları buraya aktarırken, kendimi ilk defa ceylanla kıyaslıyorum, sonra da hiç tanışmadığım deli ile… Demem o ki bunları aktarabilecek tek isim benim. Anlam veremediğim bu davranış benim açımdan bir nebze de olsa anlam kazanıyordu. Büfede kendime bir çay söyledim, sigaramı yaktım, çevremdeki insanları incelerken herkes için dua ettim. Derken o kadife sesi duydum:</w:t>
       </w:r>
     </w:p>
     <w:p>
@@ -11007,7 +11001,7 @@
     </w:p>
     <w:p>
       <w:r>
-        <w:t>Dedikten hemen sonra ayağa fırladım ok gibi;</w:t>
+        <w:t>Dedikten hemen sonra ayağa fırladım ok gibi:</w:t>
       </w:r>
     </w:p>
     <w:p>
@@ -11025,7 +11019,7 @@
     </w:p>
     <w:p>
       <w:r>
-        <w:t>“Gamlı tavuk gibi düşünmeyi bırak evlat, ne demiş erenler; ‘Rava kalbi an Rabbi’ yani kalbime geldiği gibi, kalbinden geldiği gibi muhabbet.”</w:t>
+        <w:t>“Gamlı tavuk gibi düşünmeyi bırak evlat, ne demiş erenler: ‘Rava kalbi an Rabbi’ yani kalbime geldiği gibi, kalbinden geldiği gibi muhabbet.”</w:t>
       </w:r>
     </w:p>
     <w:p>
@@ -11045,7 +11039,7 @@
     </w:p>
     <w:p>
       <w:r>
-        <w:t>Biraz cehaletimi yüzüme vurur bir tonlamayla ipucu vermek ister gibi;</w:t>
+        <w:t>Biraz cehaletimi yüzüme vurur bir tonlamayla ipucu vermek ister gibi:</w:t>
       </w:r>
     </w:p>
     <w:p>
@@ -11168,7 +11162,7 @@
     </w:p>
     <w:p>
       <w:r>
-        <w:t>İlk sayfalardaki kalın kelimeleri yeniden alt alta yazdım. Sonra defterime geçirdiğim karşılıkla yan yana koydum. Arada küçük görünen, hiç de küçük olmayan bir fark vardı. Sayfa “âlemlere rahmet olan Allah'ın adıyla” diyordu. Ben alıştığım tamlamayı araya sokmuş, okuduğumu düzeltirken kendimi doğru sanmıştım. Oysa âlemlere rahmet olmak Peygamber’in sıfatıydı; mektubu yazan el, o sıfatı besmelenin içine taşımıştı.</w:t>
+        <w:t>İlk sayfalardaki kalın kelimeleri yeniden alt alta yazdım. Sonra defterime geçirdiğim karşılıkla yan yana koydum. Arada küçük görünen, hiç de küçük olmayan bir fark vardı. Sayfa “âlemlere rahmet olan Allah'ın adıyla,” diyordu. Ben alıştığım tamlamayı araya sokmuş, okuduğumu düzeltirken kendimi doğru sanmıştım. Oysa âlemlere rahmet olmak Peygamber’in sıfatıydı; mektubu yazan el, o sıfatı besmelenin içine taşımıştı.</w:t>
       </w:r>
     </w:p>
     <w:p>
@@ -11535,7 +11529,7 @@
     </w:p>
     <w:p>
       <w:r>
-        <w:t>Evde düştüğüm geceyi anlattım. Gül kokusunu, kilitlenen bedenimi, koridorda sürünürken kendisinden saklanmaya çalışmamı. Söylerken hâlâ neden sakladığımı savunacak cümle arıyordum.</w:t>
+        <w:t>Evde düştüğüm geceyi anlattım. Kilitlenen bedenimi, koridorda sürünürken kendisinden saklanmaya çalışmamı. Söylerken hâlâ neden sakladığımı savunacak cümle arıyordum.</w:t>
       </w:r>
     </w:p>
     <w:p>
@@ -12326,7 +12320,7 @@
     </w:p>
     <w:p>
       <w:r>
-        <w:t>“Şizofreni, çok kişilikli olmak demek değildir,” dedi Hakikat. “Bu tanıya, sizinle yaptığımız değerlendirmeler ve Vildan Hanım'ın zaman içindeki gözlemleriyle ulaştık. Hakan ile Sefa diye yaşadığınız ayrımı da tek kelimeyle açıklamış olmayız.”</w:t>
+        <w:t>“Şizofreni, çok kişilikli olmak demek değildir,” dedi Hakikat. “Bu ön tanıya, sizinle yaptığımız değerlendirmeler ve Vildan Hanım'ın zaman içindeki gözlemleriyle ulaştık. Beyindeki oluşum netleştikçe onu yeniden değerlendireceğiz. Hakan ile Sefa diye yaşadığınız ayrımı da tek kelimeyle açıklamış olmayız.”</w:t>
       </w:r>
     </w:p>
     <w:p>
@@ -13225,7 +13219,7 @@
         <w:pStyle w:val="Opening"/>
       </w:pPr>
       <w:r>
-        <w:t>Ertesi gün Prof. Dr. Hakikat Bey’e</w:t>
+        <w:t>Ertesi gün Prof. Dr. Hakikat Medeni’ye</w:t>
       </w:r>
       <w:r>
         <w:rPr>
@@ -13658,7 +13652,7 @@
     </w:p>
     <w:p>
       <w:r>
-        <w:t>Güldüm. Annem insanı bir cümlede metafiziğin dibinden mutfağa çıkartıyordu. Bunun adına yetenek denirdi. Kendisine söylesem “Yetenek değil, soğutma çorbanı” derdi.</w:t>
+        <w:t>Güldüm. Annem insanı bir cümlede metafiziğin dibinden mutfağa çıkartıyordu. Bunun adına yetenek denirdi. Kendisine söylesem “Yetenek değil, soğutma çorbanı,” derdi.</w:t>
       </w:r>
     </w:p>
     <w:p>

</xml_diff>